<commit_message>
Notes tables: text vertically centered, left-justified
Co-Authored-By: Claude Sonnet 5.5 <noreply@anthropic.com>
Claude-Session: https://claude.ai/code/session_01LaT1EarAMnh5opQoFahNzN
</commit_message>
<xml_diff>
--- a/output/chem-u02/SHULL_CHEM_Guided_Notes_U02_S02.1-S02.5.docx
+++ b/output/chem-u02/SHULL_CHEM_Guided_Notes_U02_S02.1-S02.5.docx
@@ -1498,10 +1498,12 @@
                     <w:bottom w:w="40" w:type="dxa"/>
                     <w:right w:w="70" w:type="dxa"/>
                   </w:tcMar>
+                  <w:vAlign w:val="center"/>
                 </w:tcPr>
                 <w:p>
                   <w:pPr>
                     <w:spacing w:after="0"/>
+                    <w:jc w:val="left"/>
                   </w:pPr>
                   <w:r>
                     <w:rPr>
@@ -1527,10 +1529,12 @@
                     <w:bottom w:w="40" w:type="dxa"/>
                     <w:right w:w="70" w:type="dxa"/>
                   </w:tcMar>
+                  <w:vAlign w:val="center"/>
                 </w:tcPr>
                 <w:p>
                   <w:pPr>
                     <w:spacing w:after="0"/>
+                    <w:jc w:val="left"/>
                   </w:pPr>
                   <w:r>
                     <w:rPr>
@@ -1565,10 +1569,12 @@
                     <w:bottom w:w="30" w:type="dxa"/>
                     <w:right w:w="70" w:type="dxa"/>
                   </w:tcMar>
+                  <w:vAlign w:val="center"/>
                 </w:tcPr>
                 <w:p>
                   <w:pPr>
                     <w:spacing w:after="0"/>
+                    <w:jc w:val="left"/>
                   </w:pPr>
                   <w:r>
                     <w:rPr>
@@ -1597,10 +1603,12 @@
                     <w:bottom w:w="30" w:type="dxa"/>
                     <w:right w:w="70" w:type="dxa"/>
                   </w:tcMar>
+                  <w:vAlign w:val="center"/>
                 </w:tcPr>
                 <w:p>
                   <w:pPr>
                     <w:spacing w:after="0"/>
+                    <w:jc w:val="left"/>
                   </w:pPr>
                 </w:p>
               </w:tc>
@@ -1625,10 +1633,12 @@
                     <w:bottom w:w="30" w:type="dxa"/>
                     <w:right w:w="70" w:type="dxa"/>
                   </w:tcMar>
+                  <w:vAlign w:val="center"/>
                 </w:tcPr>
                 <w:p>
                   <w:pPr>
                     <w:spacing w:after="0"/>
+                    <w:jc w:val="left"/>
                   </w:pPr>
                   <w:r>
                     <w:rPr>
@@ -1657,10 +1667,12 @@
                     <w:bottom w:w="30" w:type="dxa"/>
                     <w:right w:w="70" w:type="dxa"/>
                   </w:tcMar>
+                  <w:vAlign w:val="center"/>
                 </w:tcPr>
                 <w:p>
                   <w:pPr>
                     <w:spacing w:after="0"/>
+                    <w:jc w:val="left"/>
                   </w:pPr>
                 </w:p>
               </w:tc>
@@ -1685,10 +1697,12 @@
                     <w:bottom w:w="30" w:type="dxa"/>
                     <w:right w:w="70" w:type="dxa"/>
                   </w:tcMar>
+                  <w:vAlign w:val="center"/>
                 </w:tcPr>
                 <w:p>
                   <w:pPr>
                     <w:spacing w:after="0"/>
+                    <w:jc w:val="left"/>
                   </w:pPr>
                   <w:r>
                     <w:rPr>
@@ -1717,10 +1731,12 @@
                     <w:bottom w:w="30" w:type="dxa"/>
                     <w:right w:w="70" w:type="dxa"/>
                   </w:tcMar>
+                  <w:vAlign w:val="center"/>
                 </w:tcPr>
                 <w:p>
                   <w:pPr>
                     <w:spacing w:after="0"/>
+                    <w:jc w:val="left"/>
                   </w:pPr>
                 </w:p>
               </w:tc>
@@ -2219,10 +2235,12 @@
                     <w:bottom w:w="40" w:type="dxa"/>
                     <w:right w:w="70" w:type="dxa"/>
                   </w:tcMar>
+                  <w:vAlign w:val="center"/>
                 </w:tcPr>
                 <w:p>
                   <w:pPr>
                     <w:spacing w:after="0"/>
+                    <w:jc w:val="left"/>
                   </w:pPr>
                   <w:r>
                     <w:rPr>
@@ -2248,10 +2266,12 @@
                     <w:bottom w:w="40" w:type="dxa"/>
                     <w:right w:w="70" w:type="dxa"/>
                   </w:tcMar>
+                  <w:vAlign w:val="center"/>
                 </w:tcPr>
                 <w:p>
                   <w:pPr>
                     <w:spacing w:after="0"/>
+                    <w:jc w:val="left"/>
                   </w:pPr>
                   <w:r>
                     <w:rPr>
@@ -2277,10 +2297,12 @@
                     <w:bottom w:w="40" w:type="dxa"/>
                     <w:right w:w="70" w:type="dxa"/>
                   </w:tcMar>
+                  <w:vAlign w:val="center"/>
                 </w:tcPr>
                 <w:p>
                   <w:pPr>
                     <w:spacing w:after="0"/>
+                    <w:jc w:val="left"/>
                   </w:pPr>
                   <w:r>
                     <w:rPr>
@@ -2315,10 +2337,12 @@
                     <w:bottom w:w="30" w:type="dxa"/>
                     <w:right w:w="70" w:type="dxa"/>
                   </w:tcMar>
+                  <w:vAlign w:val="center"/>
                 </w:tcPr>
                 <w:p>
                   <w:pPr>
                     <w:spacing w:after="0"/>
+                    <w:jc w:val="left"/>
                   </w:pPr>
                   <w:r>
                     <w:rPr>
@@ -2347,10 +2371,12 @@
                     <w:bottom w:w="30" w:type="dxa"/>
                     <w:right w:w="70" w:type="dxa"/>
                   </w:tcMar>
+                  <w:vAlign w:val="center"/>
                 </w:tcPr>
                 <w:p>
                   <w:pPr>
                     <w:spacing w:after="0"/>
+                    <w:jc w:val="left"/>
                   </w:pPr>
                 </w:p>
               </w:tc>
@@ -2369,10 +2395,12 @@
                     <w:bottom w:w="30" w:type="dxa"/>
                     <w:right w:w="70" w:type="dxa"/>
                   </w:tcMar>
+                  <w:vAlign w:val="center"/>
                 </w:tcPr>
                 <w:p>
                   <w:pPr>
                     <w:spacing w:after="0"/>
+                    <w:jc w:val="left"/>
                   </w:pPr>
                 </w:p>
               </w:tc>
@@ -2397,10 +2425,12 @@
                     <w:bottom w:w="30" w:type="dxa"/>
                     <w:right w:w="70" w:type="dxa"/>
                   </w:tcMar>
+                  <w:vAlign w:val="center"/>
                 </w:tcPr>
                 <w:p>
                   <w:pPr>
                     <w:spacing w:after="0"/>
+                    <w:jc w:val="left"/>
                   </w:pPr>
                   <w:r>
                     <w:rPr>
@@ -2429,10 +2459,12 @@
                     <w:bottom w:w="30" w:type="dxa"/>
                     <w:right w:w="70" w:type="dxa"/>
                   </w:tcMar>
+                  <w:vAlign w:val="center"/>
                 </w:tcPr>
                 <w:p>
                   <w:pPr>
                     <w:spacing w:after="0"/>
+                    <w:jc w:val="left"/>
                   </w:pPr>
                 </w:p>
               </w:tc>
@@ -2451,10 +2483,12 @@
                     <w:bottom w:w="30" w:type="dxa"/>
                     <w:right w:w="70" w:type="dxa"/>
                   </w:tcMar>
+                  <w:vAlign w:val="center"/>
                 </w:tcPr>
                 <w:p>
                   <w:pPr>
                     <w:spacing w:after="0"/>
+                    <w:jc w:val="left"/>
                   </w:pPr>
                 </w:p>
               </w:tc>
@@ -2479,10 +2513,12 @@
                     <w:bottom w:w="30" w:type="dxa"/>
                     <w:right w:w="70" w:type="dxa"/>
                   </w:tcMar>
+                  <w:vAlign w:val="center"/>
                 </w:tcPr>
                 <w:p>
                   <w:pPr>
                     <w:spacing w:after="0"/>
+                    <w:jc w:val="left"/>
                   </w:pPr>
                   <w:r>
                     <w:rPr>
@@ -2511,10 +2547,12 @@
                     <w:bottom w:w="30" w:type="dxa"/>
                     <w:right w:w="70" w:type="dxa"/>
                   </w:tcMar>
+                  <w:vAlign w:val="center"/>
                 </w:tcPr>
                 <w:p>
                   <w:pPr>
                     <w:spacing w:after="0"/>
+                    <w:jc w:val="left"/>
                   </w:pPr>
                 </w:p>
               </w:tc>
@@ -2533,10 +2571,12 @@
                     <w:bottom w:w="30" w:type="dxa"/>
                     <w:right w:w="70" w:type="dxa"/>
                   </w:tcMar>
+                  <w:vAlign w:val="center"/>
                 </w:tcPr>
                 <w:p>
                   <w:pPr>
                     <w:spacing w:after="0"/>
+                    <w:jc w:val="left"/>
                   </w:pPr>
                 </w:p>
               </w:tc>
@@ -2561,10 +2601,12 @@
                     <w:bottom w:w="30" w:type="dxa"/>
                     <w:right w:w="70" w:type="dxa"/>
                   </w:tcMar>
+                  <w:vAlign w:val="center"/>
                 </w:tcPr>
                 <w:p>
                   <w:pPr>
                     <w:spacing w:after="0"/>
+                    <w:jc w:val="left"/>
                   </w:pPr>
                   <w:r>
                     <w:rPr>
@@ -2593,10 +2635,12 @@
                     <w:bottom w:w="30" w:type="dxa"/>
                     <w:right w:w="70" w:type="dxa"/>
                   </w:tcMar>
+                  <w:vAlign w:val="center"/>
                 </w:tcPr>
                 <w:p>
                   <w:pPr>
                     <w:spacing w:after="0"/>
+                    <w:jc w:val="left"/>
                   </w:pPr>
                 </w:p>
               </w:tc>
@@ -2615,10 +2659,12 @@
                     <w:bottom w:w="30" w:type="dxa"/>
                     <w:right w:w="70" w:type="dxa"/>
                   </w:tcMar>
+                  <w:vAlign w:val="center"/>
                 </w:tcPr>
                 <w:p>
                   <w:pPr>
                     <w:spacing w:after="0"/>
+                    <w:jc w:val="left"/>
                   </w:pPr>
                 </w:p>
               </w:tc>
@@ -2742,10 +2788,12 @@
                     <w:bottom w:w="40" w:type="dxa"/>
                     <w:right w:w="70" w:type="dxa"/>
                   </w:tcMar>
+                  <w:vAlign w:val="center"/>
                 </w:tcPr>
                 <w:p>
                   <w:pPr>
                     <w:spacing w:after="0"/>
+                    <w:jc w:val="left"/>
                   </w:pPr>
                   <w:r>
                     <w:rPr>
@@ -2771,10 +2819,12 @@
                     <w:bottom w:w="40" w:type="dxa"/>
                     <w:right w:w="70" w:type="dxa"/>
                   </w:tcMar>
+                  <w:vAlign w:val="center"/>
                 </w:tcPr>
                 <w:p>
                   <w:pPr>
                     <w:spacing w:after="0"/>
+                    <w:jc w:val="left"/>
                   </w:pPr>
                   <w:r>
                     <w:rPr>
@@ -2800,10 +2850,12 @@
                     <w:bottom w:w="40" w:type="dxa"/>
                     <w:right w:w="70" w:type="dxa"/>
                   </w:tcMar>
+                  <w:vAlign w:val="center"/>
                 </w:tcPr>
                 <w:p>
                   <w:pPr>
                     <w:spacing w:after="0"/>
+                    <w:jc w:val="left"/>
                   </w:pPr>
                   <w:r>
                     <w:rPr>
@@ -2838,10 +2890,12 @@
                     <w:bottom w:w="30" w:type="dxa"/>
                     <w:right w:w="70" w:type="dxa"/>
                   </w:tcMar>
+                  <w:vAlign w:val="center"/>
                 </w:tcPr>
                 <w:p>
                   <w:pPr>
                     <w:spacing w:after="0"/>
+                    <w:jc w:val="left"/>
                   </w:pPr>
                   <w:r>
                     <w:rPr>
@@ -2870,10 +2924,12 @@
                     <w:bottom w:w="30" w:type="dxa"/>
                     <w:right w:w="70" w:type="dxa"/>
                   </w:tcMar>
+                  <w:vAlign w:val="center"/>
                 </w:tcPr>
                 <w:p>
                   <w:pPr>
                     <w:spacing w:after="0"/>
+                    <w:jc w:val="left"/>
                   </w:pPr>
                 </w:p>
               </w:tc>
@@ -2892,10 +2948,12 @@
                     <w:bottom w:w="30" w:type="dxa"/>
                     <w:right w:w="70" w:type="dxa"/>
                   </w:tcMar>
+                  <w:vAlign w:val="center"/>
                 </w:tcPr>
                 <w:p>
                   <w:pPr>
                     <w:spacing w:after="0"/>
+                    <w:jc w:val="left"/>
                   </w:pPr>
                 </w:p>
               </w:tc>
@@ -2920,10 +2978,12 @@
                     <w:bottom w:w="30" w:type="dxa"/>
                     <w:right w:w="70" w:type="dxa"/>
                   </w:tcMar>
+                  <w:vAlign w:val="center"/>
                 </w:tcPr>
                 <w:p>
                   <w:pPr>
                     <w:spacing w:after="0"/>
+                    <w:jc w:val="left"/>
                   </w:pPr>
                   <w:r>
                     <w:rPr>
@@ -2952,10 +3012,12 @@
                     <w:bottom w:w="30" w:type="dxa"/>
                     <w:right w:w="70" w:type="dxa"/>
                   </w:tcMar>
+                  <w:vAlign w:val="center"/>
                 </w:tcPr>
                 <w:p>
                   <w:pPr>
                     <w:spacing w:after="0"/>
+                    <w:jc w:val="left"/>
                   </w:pPr>
                 </w:p>
               </w:tc>
@@ -2974,10 +3036,12 @@
                     <w:bottom w:w="30" w:type="dxa"/>
                     <w:right w:w="70" w:type="dxa"/>
                   </w:tcMar>
+                  <w:vAlign w:val="center"/>
                 </w:tcPr>
                 <w:p>
                   <w:pPr>
                     <w:spacing w:after="0"/>
+                    <w:jc w:val="left"/>
                   </w:pPr>
                 </w:p>
               </w:tc>
@@ -3002,10 +3066,12 @@
                     <w:bottom w:w="30" w:type="dxa"/>
                     <w:right w:w="70" w:type="dxa"/>
                   </w:tcMar>
+                  <w:vAlign w:val="center"/>
                 </w:tcPr>
                 <w:p>
                   <w:pPr>
                     <w:spacing w:after="0"/>
+                    <w:jc w:val="left"/>
                   </w:pPr>
                   <w:r>
                     <w:rPr>
@@ -3034,10 +3100,12 @@
                     <w:bottom w:w="30" w:type="dxa"/>
                     <w:right w:w="70" w:type="dxa"/>
                   </w:tcMar>
+                  <w:vAlign w:val="center"/>
                 </w:tcPr>
                 <w:p>
                   <w:pPr>
                     <w:spacing w:after="0"/>
+                    <w:jc w:val="left"/>
                   </w:pPr>
                 </w:p>
               </w:tc>
@@ -3056,10 +3124,12 @@
                     <w:bottom w:w="30" w:type="dxa"/>
                     <w:right w:w="70" w:type="dxa"/>
                   </w:tcMar>
+                  <w:vAlign w:val="center"/>
                 </w:tcPr>
                 <w:p>
                   <w:pPr>
                     <w:spacing w:after="0"/>
+                    <w:jc w:val="left"/>
                   </w:pPr>
                 </w:p>
               </w:tc>
@@ -3084,10 +3154,12 @@
                     <w:bottom w:w="30" w:type="dxa"/>
                     <w:right w:w="70" w:type="dxa"/>
                   </w:tcMar>
+                  <w:vAlign w:val="center"/>
                 </w:tcPr>
                 <w:p>
                   <w:pPr>
                     <w:spacing w:after="0"/>
+                    <w:jc w:val="left"/>
                   </w:pPr>
                   <w:r>
                     <w:rPr>
@@ -3116,10 +3188,12 @@
                     <w:bottom w:w="30" w:type="dxa"/>
                     <w:right w:w="70" w:type="dxa"/>
                   </w:tcMar>
+                  <w:vAlign w:val="center"/>
                 </w:tcPr>
                 <w:p>
                   <w:pPr>
                     <w:spacing w:after="0"/>
+                    <w:jc w:val="left"/>
                   </w:pPr>
                 </w:p>
               </w:tc>
@@ -3138,10 +3212,12 @@
                     <w:bottom w:w="30" w:type="dxa"/>
                     <w:right w:w="70" w:type="dxa"/>
                   </w:tcMar>
+                  <w:vAlign w:val="center"/>
                 </w:tcPr>
                 <w:p>
                   <w:pPr>
                     <w:spacing w:after="0"/>
+                    <w:jc w:val="left"/>
                   </w:pPr>
                 </w:p>
               </w:tc>
@@ -3272,10 +3348,12 @@
                     <w:bottom w:w="40" w:type="dxa"/>
                     <w:right w:w="70" w:type="dxa"/>
                   </w:tcMar>
+                  <w:vAlign w:val="center"/>
                 </w:tcPr>
                 <w:p>
                   <w:pPr>
                     <w:spacing w:after="0"/>
+                    <w:jc w:val="left"/>
                   </w:pPr>
                   <w:r>
                     <w:rPr>
@@ -3301,10 +3379,12 @@
                     <w:bottom w:w="40" w:type="dxa"/>
                     <w:right w:w="70" w:type="dxa"/>
                   </w:tcMar>
+                  <w:vAlign w:val="center"/>
                 </w:tcPr>
                 <w:p>
                   <w:pPr>
                     <w:spacing w:after="0"/>
+                    <w:jc w:val="left"/>
                   </w:pPr>
                   <w:r>
                     <w:rPr>
@@ -3339,10 +3419,12 @@
                     <w:bottom w:w="30" w:type="dxa"/>
                     <w:right w:w="70" w:type="dxa"/>
                   </w:tcMar>
+                  <w:vAlign w:val="center"/>
                 </w:tcPr>
                 <w:p>
                   <w:pPr>
                     <w:spacing w:after="0"/>
+                    <w:jc w:val="left"/>
                   </w:pPr>
                   <w:r>
                     <w:rPr>
@@ -3371,10 +3453,12 @@
                     <w:bottom w:w="30" w:type="dxa"/>
                     <w:right w:w="70" w:type="dxa"/>
                   </w:tcMar>
+                  <w:vAlign w:val="center"/>
                 </w:tcPr>
                 <w:p>
                   <w:pPr>
                     <w:spacing w:after="0"/>
+                    <w:jc w:val="left"/>
                   </w:pPr>
                 </w:p>
               </w:tc>
@@ -3399,10 +3483,12 @@
                     <w:bottom w:w="30" w:type="dxa"/>
                     <w:right w:w="70" w:type="dxa"/>
                   </w:tcMar>
+                  <w:vAlign w:val="center"/>
                 </w:tcPr>
                 <w:p>
                   <w:pPr>
                     <w:spacing w:after="0"/>
+                    <w:jc w:val="left"/>
                   </w:pPr>
                   <w:r>
                     <w:rPr>
@@ -3431,10 +3517,12 @@
                     <w:bottom w:w="30" w:type="dxa"/>
                     <w:right w:w="70" w:type="dxa"/>
                   </w:tcMar>
+                  <w:vAlign w:val="center"/>
                 </w:tcPr>
                 <w:p>
                   <w:pPr>
                     <w:spacing w:after="0"/>
+                    <w:jc w:val="left"/>
                   </w:pPr>
                 </w:p>
               </w:tc>
@@ -3459,10 +3547,12 @@
                     <w:bottom w:w="30" w:type="dxa"/>
                     <w:right w:w="70" w:type="dxa"/>
                   </w:tcMar>
+                  <w:vAlign w:val="center"/>
                 </w:tcPr>
                 <w:p>
                   <w:pPr>
                     <w:spacing w:after="0"/>
+                    <w:jc w:val="left"/>
                   </w:pPr>
                   <w:r>
                     <w:rPr>
@@ -3491,10 +3581,12 @@
                     <w:bottom w:w="30" w:type="dxa"/>
                     <w:right w:w="70" w:type="dxa"/>
                   </w:tcMar>
+                  <w:vAlign w:val="center"/>
                 </w:tcPr>
                 <w:p>
                   <w:pPr>
                     <w:spacing w:after="0"/>
+                    <w:jc w:val="left"/>
                   </w:pPr>
                 </w:p>
               </w:tc>
@@ -3519,10 +3611,12 @@
                     <w:bottom w:w="30" w:type="dxa"/>
                     <w:right w:w="70" w:type="dxa"/>
                   </w:tcMar>
+                  <w:vAlign w:val="center"/>
                 </w:tcPr>
                 <w:p>
                   <w:pPr>
                     <w:spacing w:after="0"/>
+                    <w:jc w:val="left"/>
                   </w:pPr>
                   <w:r>
                     <w:rPr>
@@ -3551,10 +3645,12 @@
                     <w:bottom w:w="30" w:type="dxa"/>
                     <w:right w:w="70" w:type="dxa"/>
                   </w:tcMar>
+                  <w:vAlign w:val="center"/>
                 </w:tcPr>
                 <w:p>
                   <w:pPr>
                     <w:spacing w:after="0"/>
+                    <w:jc w:val="left"/>
                   </w:pPr>
                 </w:p>
               </w:tc>
@@ -4099,10 +4195,12 @@
                     <w:bottom w:w="40" w:type="dxa"/>
                     <w:right w:w="70" w:type="dxa"/>
                   </w:tcMar>
+                  <w:vAlign w:val="center"/>
                 </w:tcPr>
                 <w:p>
                   <w:pPr>
                     <w:spacing w:after="0"/>
+                    <w:jc w:val="left"/>
                   </w:pPr>
                   <w:r>
                     <w:rPr>
@@ -4128,10 +4226,12 @@
                     <w:bottom w:w="40" w:type="dxa"/>
                     <w:right w:w="70" w:type="dxa"/>
                   </w:tcMar>
+                  <w:vAlign w:val="center"/>
                 </w:tcPr>
                 <w:p>
                   <w:pPr>
                     <w:spacing w:after="0"/>
+                    <w:jc w:val="left"/>
                   </w:pPr>
                   <w:r>
                     <w:rPr>
@@ -4166,10 +4266,12 @@
                     <w:bottom w:w="30" w:type="dxa"/>
                     <w:right w:w="70" w:type="dxa"/>
                   </w:tcMar>
+                  <w:vAlign w:val="center"/>
                 </w:tcPr>
                 <w:p>
                   <w:pPr>
                     <w:spacing w:after="0"/>
+                    <w:jc w:val="left"/>
                   </w:pPr>
                   <w:r>
                     <w:rPr>
@@ -4198,10 +4300,12 @@
                     <w:bottom w:w="30" w:type="dxa"/>
                     <w:right w:w="70" w:type="dxa"/>
                   </w:tcMar>
+                  <w:vAlign w:val="center"/>
                 </w:tcPr>
                 <w:p>
                   <w:pPr>
                     <w:spacing w:after="0"/>
+                    <w:jc w:val="left"/>
                   </w:pPr>
                 </w:p>
               </w:tc>
@@ -4226,10 +4330,12 @@
                     <w:bottom w:w="30" w:type="dxa"/>
                     <w:right w:w="70" w:type="dxa"/>
                   </w:tcMar>
+                  <w:vAlign w:val="center"/>
                 </w:tcPr>
                 <w:p>
                   <w:pPr>
                     <w:spacing w:after="0"/>
+                    <w:jc w:val="left"/>
                   </w:pPr>
                   <w:r>
                     <w:rPr>
@@ -4258,10 +4364,12 @@
                     <w:bottom w:w="30" w:type="dxa"/>
                     <w:right w:w="70" w:type="dxa"/>
                   </w:tcMar>
+                  <w:vAlign w:val="center"/>
                 </w:tcPr>
                 <w:p>
                   <w:pPr>
                     <w:spacing w:after="0"/>
+                    <w:jc w:val="left"/>
                   </w:pPr>
                 </w:p>
               </w:tc>
@@ -4286,10 +4394,12 @@
                     <w:bottom w:w="30" w:type="dxa"/>
                     <w:right w:w="70" w:type="dxa"/>
                   </w:tcMar>
+                  <w:vAlign w:val="center"/>
                 </w:tcPr>
                 <w:p>
                   <w:pPr>
                     <w:spacing w:after="0"/>
+                    <w:jc w:val="left"/>
                   </w:pPr>
                   <w:r>
                     <w:rPr>
@@ -4318,10 +4428,12 @@
                     <w:bottom w:w="30" w:type="dxa"/>
                     <w:right w:w="70" w:type="dxa"/>
                   </w:tcMar>
+                  <w:vAlign w:val="center"/>
                 </w:tcPr>
                 <w:p>
                   <w:pPr>
                     <w:spacing w:after="0"/>
+                    <w:jc w:val="left"/>
                   </w:pPr>
                 </w:p>
               </w:tc>
@@ -5917,10 +6029,12 @@
                     <w:bottom w:w="40" w:type="dxa"/>
                     <w:right w:w="70" w:type="dxa"/>
                   </w:tcMar>
+                  <w:vAlign w:val="center"/>
                 </w:tcPr>
                 <w:p>
                   <w:pPr>
                     <w:spacing w:after="0"/>
+                    <w:jc w:val="left"/>
                   </w:pPr>
                   <w:r>
                     <w:rPr>
@@ -5946,10 +6060,12 @@
                     <w:bottom w:w="40" w:type="dxa"/>
                     <w:right w:w="70" w:type="dxa"/>
                   </w:tcMar>
+                  <w:vAlign w:val="center"/>
                 </w:tcPr>
                 <w:p>
                   <w:pPr>
                     <w:spacing w:after="0"/>
+                    <w:jc w:val="left"/>
                   </w:pPr>
                   <w:r>
                     <w:rPr>
@@ -5975,10 +6091,12 @@
                     <w:bottom w:w="40" w:type="dxa"/>
                     <w:right w:w="70" w:type="dxa"/>
                   </w:tcMar>
+                  <w:vAlign w:val="center"/>
                 </w:tcPr>
                 <w:p>
                   <w:pPr>
                     <w:spacing w:after="0"/>
+                    <w:jc w:val="left"/>
                   </w:pPr>
                   <w:r>
                     <w:rPr>
@@ -6013,10 +6131,12 @@
                     <w:bottom w:w="30" w:type="dxa"/>
                     <w:right w:w="70" w:type="dxa"/>
                   </w:tcMar>
+                  <w:vAlign w:val="center"/>
                 </w:tcPr>
                 <w:p>
                   <w:pPr>
                     <w:spacing w:after="0"/>
+                    <w:jc w:val="left"/>
                   </w:pPr>
                   <w:r>
                     <w:rPr>
@@ -6045,10 +6165,12 @@
                     <w:bottom w:w="30" w:type="dxa"/>
                     <w:right w:w="70" w:type="dxa"/>
                   </w:tcMar>
+                  <w:vAlign w:val="center"/>
                 </w:tcPr>
                 <w:p>
                   <w:pPr>
                     <w:spacing w:after="0"/>
+                    <w:jc w:val="left"/>
                   </w:pPr>
                   <w:r>
                     <w:rPr>
@@ -6077,10 +6199,12 @@
                     <w:bottom w:w="30" w:type="dxa"/>
                     <w:right w:w="70" w:type="dxa"/>
                   </w:tcMar>
+                  <w:vAlign w:val="center"/>
                 </w:tcPr>
                 <w:p>
                   <w:pPr>
                     <w:spacing w:after="0"/>
+                    <w:jc w:val="left"/>
                   </w:pPr>
                 </w:p>
               </w:tc>
@@ -6105,10 +6229,12 @@
                     <w:bottom w:w="30" w:type="dxa"/>
                     <w:right w:w="70" w:type="dxa"/>
                   </w:tcMar>
+                  <w:vAlign w:val="center"/>
                 </w:tcPr>
                 <w:p>
                   <w:pPr>
                     <w:spacing w:after="0"/>
+                    <w:jc w:val="left"/>
                   </w:pPr>
                   <w:r>
                     <w:rPr>
@@ -6137,10 +6263,12 @@
                     <w:bottom w:w="30" w:type="dxa"/>
                     <w:right w:w="70" w:type="dxa"/>
                   </w:tcMar>
+                  <w:vAlign w:val="center"/>
                 </w:tcPr>
                 <w:p>
                   <w:pPr>
                     <w:spacing w:after="0"/>
+                    <w:jc w:val="left"/>
                   </w:pPr>
                   <w:r>
                     <w:rPr>
@@ -6169,10 +6297,12 @@
                     <w:bottom w:w="30" w:type="dxa"/>
                     <w:right w:w="70" w:type="dxa"/>
                   </w:tcMar>
+                  <w:vAlign w:val="center"/>
                 </w:tcPr>
                 <w:p>
                   <w:pPr>
                     <w:spacing w:after="0"/>
+                    <w:jc w:val="left"/>
                   </w:pPr>
                 </w:p>
               </w:tc>
@@ -6296,10 +6426,12 @@
                     <w:bottom w:w="40" w:type="dxa"/>
                     <w:right w:w="70" w:type="dxa"/>
                   </w:tcMar>
+                  <w:vAlign w:val="center"/>
                 </w:tcPr>
                 <w:p>
                   <w:pPr>
                     <w:spacing w:after="0"/>
+                    <w:jc w:val="left"/>
                   </w:pPr>
                   <w:r>
                     <w:rPr>
@@ -6325,10 +6457,12 @@
                     <w:bottom w:w="40" w:type="dxa"/>
                     <w:right w:w="70" w:type="dxa"/>
                   </w:tcMar>
+                  <w:vAlign w:val="center"/>
                 </w:tcPr>
                 <w:p>
                   <w:pPr>
                     <w:spacing w:after="0"/>
+                    <w:jc w:val="left"/>
                   </w:pPr>
                   <w:r>
                     <w:rPr>
@@ -6354,10 +6488,12 @@
                     <w:bottom w:w="40" w:type="dxa"/>
                     <w:right w:w="70" w:type="dxa"/>
                   </w:tcMar>
+                  <w:vAlign w:val="center"/>
                 </w:tcPr>
                 <w:p>
                   <w:pPr>
                     <w:spacing w:after="0"/>
+                    <w:jc w:val="left"/>
                   </w:pPr>
                   <w:r>
                     <w:rPr>
@@ -6392,10 +6528,12 @@
                     <w:bottom w:w="30" w:type="dxa"/>
                     <w:right w:w="70" w:type="dxa"/>
                   </w:tcMar>
+                  <w:vAlign w:val="center"/>
                 </w:tcPr>
                 <w:p>
                   <w:pPr>
                     <w:spacing w:after="0"/>
+                    <w:jc w:val="left"/>
                   </w:pPr>
                   <w:r>
                     <w:rPr>
@@ -6424,10 +6562,12 @@
                     <w:bottom w:w="30" w:type="dxa"/>
                     <w:right w:w="70" w:type="dxa"/>
                   </w:tcMar>
+                  <w:vAlign w:val="center"/>
                 </w:tcPr>
                 <w:p>
                   <w:pPr>
                     <w:spacing w:after="0"/>
+                    <w:jc w:val="left"/>
                   </w:pPr>
                   <w:r>
                     <w:rPr>
@@ -6456,10 +6596,12 @@
                     <w:bottom w:w="30" w:type="dxa"/>
                     <w:right w:w="70" w:type="dxa"/>
                   </w:tcMar>
+                  <w:vAlign w:val="center"/>
                 </w:tcPr>
                 <w:p>
                   <w:pPr>
                     <w:spacing w:after="0"/>
+                    <w:jc w:val="left"/>
                   </w:pPr>
                 </w:p>
               </w:tc>
@@ -6484,10 +6626,12 @@
                     <w:bottom w:w="30" w:type="dxa"/>
                     <w:right w:w="70" w:type="dxa"/>
                   </w:tcMar>
+                  <w:vAlign w:val="center"/>
                 </w:tcPr>
                 <w:p>
                   <w:pPr>
                     <w:spacing w:after="0"/>
+                    <w:jc w:val="left"/>
                   </w:pPr>
                   <w:r>
                     <w:rPr>
@@ -6516,10 +6660,12 @@
                     <w:bottom w:w="30" w:type="dxa"/>
                     <w:right w:w="70" w:type="dxa"/>
                   </w:tcMar>
+                  <w:vAlign w:val="center"/>
                 </w:tcPr>
                 <w:p>
                   <w:pPr>
                     <w:spacing w:after="0"/>
+                    <w:jc w:val="left"/>
                   </w:pPr>
                   <w:r>
                     <w:rPr>
@@ -6548,10 +6694,12 @@
                     <w:bottom w:w="30" w:type="dxa"/>
                     <w:right w:w="70" w:type="dxa"/>
                   </w:tcMar>
+                  <w:vAlign w:val="center"/>
                 </w:tcPr>
                 <w:p>
                   <w:pPr>
                     <w:spacing w:after="0"/>
+                    <w:jc w:val="left"/>
                   </w:pPr>
                 </w:p>
               </w:tc>
@@ -6667,10 +6815,12 @@
                     <w:bottom w:w="40" w:type="dxa"/>
                     <w:right w:w="70" w:type="dxa"/>
                   </w:tcMar>
+                  <w:vAlign w:val="center"/>
                 </w:tcPr>
                 <w:p>
                   <w:pPr>
                     <w:spacing w:after="0"/>
+                    <w:jc w:val="left"/>
                   </w:pPr>
                   <w:r>
                     <w:rPr>
@@ -6696,10 +6846,12 @@
                     <w:bottom w:w="40" w:type="dxa"/>
                     <w:right w:w="70" w:type="dxa"/>
                   </w:tcMar>
+                  <w:vAlign w:val="center"/>
                 </w:tcPr>
                 <w:p>
                   <w:pPr>
                     <w:spacing w:after="0"/>
+                    <w:jc w:val="left"/>
                   </w:pPr>
                   <w:r>
                     <w:rPr>
@@ -6725,10 +6877,12 @@
                     <w:bottom w:w="40" w:type="dxa"/>
                     <w:right w:w="70" w:type="dxa"/>
                   </w:tcMar>
+                  <w:vAlign w:val="center"/>
                 </w:tcPr>
                 <w:p>
                   <w:pPr>
                     <w:spacing w:after="0"/>
+                    <w:jc w:val="left"/>
                   </w:pPr>
                   <w:r>
                     <w:rPr>
@@ -6763,10 +6917,12 @@
                     <w:bottom w:w="30" w:type="dxa"/>
                     <w:right w:w="70" w:type="dxa"/>
                   </w:tcMar>
+                  <w:vAlign w:val="center"/>
                 </w:tcPr>
                 <w:p>
                   <w:pPr>
                     <w:spacing w:after="0"/>
+                    <w:jc w:val="left"/>
                   </w:pPr>
                   <w:r>
                     <w:rPr>
@@ -6795,10 +6951,12 @@
                     <w:bottom w:w="30" w:type="dxa"/>
                     <w:right w:w="70" w:type="dxa"/>
                   </w:tcMar>
+                  <w:vAlign w:val="center"/>
                 </w:tcPr>
                 <w:p>
                   <w:pPr>
                     <w:spacing w:after="0"/>
+                    <w:jc w:val="left"/>
                   </w:pPr>
                   <w:r>
                     <w:rPr>
@@ -6827,10 +6985,12 @@
                     <w:bottom w:w="30" w:type="dxa"/>
                     <w:right w:w="70" w:type="dxa"/>
                   </w:tcMar>
+                  <w:vAlign w:val="center"/>
                 </w:tcPr>
                 <w:p>
                   <w:pPr>
                     <w:spacing w:after="0"/>
+                    <w:jc w:val="left"/>
                   </w:pPr>
                 </w:p>
               </w:tc>
@@ -6855,10 +7015,12 @@
                     <w:bottom w:w="30" w:type="dxa"/>
                     <w:right w:w="70" w:type="dxa"/>
                   </w:tcMar>
+                  <w:vAlign w:val="center"/>
                 </w:tcPr>
                 <w:p>
                   <w:pPr>
                     <w:spacing w:after="0"/>
+                    <w:jc w:val="left"/>
                   </w:pPr>
                   <w:r>
                     <w:rPr>
@@ -6887,10 +7049,12 @@
                     <w:bottom w:w="30" w:type="dxa"/>
                     <w:right w:w="70" w:type="dxa"/>
                   </w:tcMar>
+                  <w:vAlign w:val="center"/>
                 </w:tcPr>
                 <w:p>
                   <w:pPr>
                     <w:spacing w:after="0"/>
+                    <w:jc w:val="left"/>
                   </w:pPr>
                   <w:r>
                     <w:rPr>
@@ -6919,10 +7083,12 @@
                     <w:bottom w:w="30" w:type="dxa"/>
                     <w:right w:w="70" w:type="dxa"/>
                   </w:tcMar>
+                  <w:vAlign w:val="center"/>
                 </w:tcPr>
                 <w:p>
                   <w:pPr>
                     <w:spacing w:after="0"/>
+                    <w:jc w:val="left"/>
                   </w:pPr>
                 </w:p>
               </w:tc>
@@ -6947,10 +7113,12 @@
                     <w:bottom w:w="30" w:type="dxa"/>
                     <w:right w:w="70" w:type="dxa"/>
                   </w:tcMar>
+                  <w:vAlign w:val="center"/>
                 </w:tcPr>
                 <w:p>
                   <w:pPr>
                     <w:spacing w:after="0"/>
+                    <w:jc w:val="left"/>
                   </w:pPr>
                   <w:r>
                     <w:rPr>
@@ -6979,10 +7147,12 @@
                     <w:bottom w:w="30" w:type="dxa"/>
                     <w:right w:w="70" w:type="dxa"/>
                   </w:tcMar>
+                  <w:vAlign w:val="center"/>
                 </w:tcPr>
                 <w:p>
                   <w:pPr>
                     <w:spacing w:after="0"/>
+                    <w:jc w:val="left"/>
                   </w:pPr>
                   <w:r>
                     <w:rPr>
@@ -7011,10 +7181,12 @@
                     <w:bottom w:w="30" w:type="dxa"/>
                     <w:right w:w="70" w:type="dxa"/>
                   </w:tcMar>
+                  <w:vAlign w:val="center"/>
                 </w:tcPr>
                 <w:p>
                   <w:pPr>
                     <w:spacing w:after="0"/>
+                    <w:jc w:val="left"/>
                   </w:pPr>
                 </w:p>
               </w:tc>
@@ -7130,10 +7302,12 @@
                     <w:bottom w:w="40" w:type="dxa"/>
                     <w:right w:w="70" w:type="dxa"/>
                   </w:tcMar>
+                  <w:vAlign w:val="center"/>
                 </w:tcPr>
                 <w:p>
                   <w:pPr>
                     <w:spacing w:after="0"/>
+                    <w:jc w:val="left"/>
                   </w:pPr>
                   <w:r>
                     <w:rPr>
@@ -7159,10 +7333,12 @@
                     <w:bottom w:w="40" w:type="dxa"/>
                     <w:right w:w="70" w:type="dxa"/>
                   </w:tcMar>
+                  <w:vAlign w:val="center"/>
                 </w:tcPr>
                 <w:p>
                   <w:pPr>
                     <w:spacing w:after="0"/>
+                    <w:jc w:val="left"/>
                   </w:pPr>
                   <w:r>
                     <w:rPr>
@@ -7188,10 +7364,12 @@
                     <w:bottom w:w="40" w:type="dxa"/>
                     <w:right w:w="70" w:type="dxa"/>
                   </w:tcMar>
+                  <w:vAlign w:val="center"/>
                 </w:tcPr>
                 <w:p>
                   <w:pPr>
                     <w:spacing w:after="0"/>
+                    <w:jc w:val="left"/>
                   </w:pPr>
                   <w:r>
                     <w:rPr>
@@ -7226,10 +7404,12 @@
                     <w:bottom w:w="30" w:type="dxa"/>
                     <w:right w:w="70" w:type="dxa"/>
                   </w:tcMar>
+                  <w:vAlign w:val="center"/>
                 </w:tcPr>
                 <w:p>
                   <w:pPr>
                     <w:spacing w:after="0"/>
+                    <w:jc w:val="left"/>
                   </w:pPr>
                   <w:r>
                     <w:rPr>
@@ -7258,10 +7438,12 @@
                     <w:bottom w:w="30" w:type="dxa"/>
                     <w:right w:w="70" w:type="dxa"/>
                   </w:tcMar>
+                  <w:vAlign w:val="center"/>
                 </w:tcPr>
                 <w:p>
                   <w:pPr>
                     <w:spacing w:after="0"/>
+                    <w:jc w:val="left"/>
                   </w:pPr>
                 </w:p>
               </w:tc>
@@ -7280,10 +7462,12 @@
                     <w:bottom w:w="30" w:type="dxa"/>
                     <w:right w:w="70" w:type="dxa"/>
                   </w:tcMar>
+                  <w:vAlign w:val="center"/>
                 </w:tcPr>
                 <w:p>
                   <w:pPr>
                     <w:spacing w:after="0"/>
+                    <w:jc w:val="left"/>
                   </w:pPr>
                 </w:p>
               </w:tc>
@@ -7308,10 +7492,12 @@
                     <w:bottom w:w="30" w:type="dxa"/>
                     <w:right w:w="70" w:type="dxa"/>
                   </w:tcMar>
+                  <w:vAlign w:val="center"/>
                 </w:tcPr>
                 <w:p>
                   <w:pPr>
                     <w:spacing w:after="0"/>
+                    <w:jc w:val="left"/>
                   </w:pPr>
                   <w:r>
                     <w:rPr>
@@ -7340,10 +7526,12 @@
                     <w:bottom w:w="30" w:type="dxa"/>
                     <w:right w:w="70" w:type="dxa"/>
                   </w:tcMar>
+                  <w:vAlign w:val="center"/>
                 </w:tcPr>
                 <w:p>
                   <w:pPr>
                     <w:spacing w:after="0"/>
+                    <w:jc w:val="left"/>
                   </w:pPr>
                 </w:p>
               </w:tc>
@@ -7362,10 +7550,12 @@
                     <w:bottom w:w="30" w:type="dxa"/>
                     <w:right w:w="70" w:type="dxa"/>
                   </w:tcMar>
+                  <w:vAlign w:val="center"/>
                 </w:tcPr>
                 <w:p>
                   <w:pPr>
                     <w:spacing w:after="0"/>
+                    <w:jc w:val="left"/>
                   </w:pPr>
                 </w:p>
               </w:tc>
@@ -7807,10 +7997,12 @@
                     <w:bottom w:w="40" w:type="dxa"/>
                     <w:right w:w="70" w:type="dxa"/>
                   </w:tcMar>
+                  <w:vAlign w:val="center"/>
                 </w:tcPr>
                 <w:p>
                   <w:pPr>
                     <w:spacing w:after="0"/>
+                    <w:jc w:val="left"/>
                   </w:pPr>
                   <w:r>
                     <w:rPr>
@@ -7836,10 +8028,12 @@
                     <w:bottom w:w="40" w:type="dxa"/>
                     <w:right w:w="70" w:type="dxa"/>
                   </w:tcMar>
+                  <w:vAlign w:val="center"/>
                 </w:tcPr>
                 <w:p>
                   <w:pPr>
                     <w:spacing w:after="0"/>
+                    <w:jc w:val="left"/>
                   </w:pPr>
                   <w:r>
                     <w:rPr>
@@ -7865,10 +8059,12 @@
                     <w:bottom w:w="40" w:type="dxa"/>
                     <w:right w:w="70" w:type="dxa"/>
                   </w:tcMar>
+                  <w:vAlign w:val="center"/>
                 </w:tcPr>
                 <w:p>
                   <w:pPr>
                     <w:spacing w:after="0"/>
+                    <w:jc w:val="left"/>
                   </w:pPr>
                   <w:r>
                     <w:rPr>
@@ -7894,10 +8090,12 @@
                     <w:bottom w:w="40" w:type="dxa"/>
                     <w:right w:w="70" w:type="dxa"/>
                   </w:tcMar>
+                  <w:vAlign w:val="center"/>
                 </w:tcPr>
                 <w:p>
                   <w:pPr>
                     <w:spacing w:after="0"/>
+                    <w:jc w:val="left"/>
                   </w:pPr>
                   <w:r>
                     <w:rPr>
@@ -7923,10 +8121,12 @@
                     <w:bottom w:w="40" w:type="dxa"/>
                     <w:right w:w="70" w:type="dxa"/>
                   </w:tcMar>
+                  <w:vAlign w:val="center"/>
                 </w:tcPr>
                 <w:p>
                   <w:pPr>
                     <w:spacing w:after="0"/>
+                    <w:jc w:val="left"/>
                   </w:pPr>
                   <w:r>
                     <w:rPr>
@@ -7952,10 +8152,12 @@
                     <w:bottom w:w="40" w:type="dxa"/>
                     <w:right w:w="70" w:type="dxa"/>
                   </w:tcMar>
+                  <w:vAlign w:val="center"/>
                 </w:tcPr>
                 <w:p>
                   <w:pPr>
                     <w:spacing w:after="0"/>
+                    <w:jc w:val="left"/>
                   </w:pPr>
                   <w:r>
                     <w:rPr>
@@ -7981,10 +8183,12 @@
                     <w:bottom w:w="40" w:type="dxa"/>
                     <w:right w:w="70" w:type="dxa"/>
                   </w:tcMar>
+                  <w:vAlign w:val="center"/>
                 </w:tcPr>
                 <w:p>
                   <w:pPr>
                     <w:spacing w:after="0"/>
+                    <w:jc w:val="left"/>
                   </w:pPr>
                   <w:r>
                     <w:rPr>
@@ -8010,10 +8214,12 @@
                     <w:bottom w:w="40" w:type="dxa"/>
                     <w:right w:w="70" w:type="dxa"/>
                   </w:tcMar>
+                  <w:vAlign w:val="center"/>
                 </w:tcPr>
                 <w:p>
                   <w:pPr>
                     <w:spacing w:after="0"/>
+                    <w:jc w:val="left"/>
                   </w:pPr>
                   <w:r>
                     <w:rPr>
@@ -8039,10 +8245,12 @@
                     <w:bottom w:w="40" w:type="dxa"/>
                     <w:right w:w="70" w:type="dxa"/>
                   </w:tcMar>
+                  <w:vAlign w:val="center"/>
                 </w:tcPr>
                 <w:p>
                   <w:pPr>
                     <w:spacing w:after="0"/>
+                    <w:jc w:val="left"/>
                   </w:pPr>
                   <w:r>
                     <w:rPr>
@@ -8077,10 +8285,12 @@
                     <w:bottom w:w="30" w:type="dxa"/>
                     <w:right w:w="70" w:type="dxa"/>
                   </w:tcMar>
+                  <w:vAlign w:val="center"/>
                 </w:tcPr>
                 <w:p>
                   <w:pPr>
                     <w:spacing w:after="0"/>
+                    <w:jc w:val="left"/>
                   </w:pPr>
                   <w:r>
                     <w:rPr>
@@ -8120,10 +8330,12 @@
                     <w:bottom w:w="30" w:type="dxa"/>
                     <w:right w:w="70" w:type="dxa"/>
                   </w:tcMar>
+                  <w:vAlign w:val="center"/>
                 </w:tcPr>
                 <w:p>
                   <w:pPr>
                     <w:spacing w:after="0"/>
+                    <w:jc w:val="left"/>
                   </w:pPr>
                 </w:p>
               </w:tc>
@@ -8142,10 +8354,12 @@
                     <w:bottom w:w="30" w:type="dxa"/>
                     <w:right w:w="70" w:type="dxa"/>
                   </w:tcMar>
+                  <w:vAlign w:val="center"/>
                 </w:tcPr>
                 <w:p>
                   <w:pPr>
                     <w:spacing w:after="0"/>
+                    <w:jc w:val="left"/>
                   </w:pPr>
                 </w:p>
               </w:tc>
@@ -8164,10 +8378,12 @@
                     <w:bottom w:w="30" w:type="dxa"/>
                     <w:right w:w="70" w:type="dxa"/>
                   </w:tcMar>
+                  <w:vAlign w:val="center"/>
                 </w:tcPr>
                 <w:p>
                   <w:pPr>
                     <w:spacing w:after="0"/>
+                    <w:jc w:val="left"/>
                   </w:pPr>
                 </w:p>
               </w:tc>
@@ -8186,10 +8402,12 @@
                     <w:bottom w:w="30" w:type="dxa"/>
                     <w:right w:w="70" w:type="dxa"/>
                   </w:tcMar>
+                  <w:vAlign w:val="center"/>
                 </w:tcPr>
                 <w:p>
                   <w:pPr>
                     <w:spacing w:after="0"/>
+                    <w:jc w:val="left"/>
                   </w:pPr>
                 </w:p>
               </w:tc>
@@ -8208,10 +8426,12 @@
                     <w:bottom w:w="30" w:type="dxa"/>
                     <w:right w:w="70" w:type="dxa"/>
                   </w:tcMar>
+                  <w:vAlign w:val="center"/>
                 </w:tcPr>
                 <w:p>
                   <w:pPr>
                     <w:spacing w:after="0"/>
+                    <w:jc w:val="left"/>
                   </w:pPr>
                 </w:p>
               </w:tc>
@@ -8230,10 +8450,12 @@
                     <w:bottom w:w="30" w:type="dxa"/>
                     <w:right w:w="70" w:type="dxa"/>
                   </w:tcMar>
+                  <w:vAlign w:val="center"/>
                 </w:tcPr>
                 <w:p>
                   <w:pPr>
                     <w:spacing w:after="0"/>
+                    <w:jc w:val="left"/>
                   </w:pPr>
                 </w:p>
               </w:tc>
@@ -8252,10 +8474,12 @@
                     <w:bottom w:w="30" w:type="dxa"/>
                     <w:right w:w="70" w:type="dxa"/>
                   </w:tcMar>
+                  <w:vAlign w:val="center"/>
                 </w:tcPr>
                 <w:p>
                   <w:pPr>
                     <w:spacing w:after="0"/>
+                    <w:jc w:val="left"/>
                   </w:pPr>
                 </w:p>
               </w:tc>
@@ -8274,10 +8498,12 @@
                     <w:bottom w:w="30" w:type="dxa"/>
                     <w:right w:w="70" w:type="dxa"/>
                   </w:tcMar>
+                  <w:vAlign w:val="center"/>
                 </w:tcPr>
                 <w:p>
                   <w:pPr>
                     <w:spacing w:after="0"/>
+                    <w:jc w:val="left"/>
                   </w:pPr>
                 </w:p>
               </w:tc>
@@ -8491,10 +8717,12 @@
                     <w:bottom w:w="40" w:type="dxa"/>
                     <w:right w:w="70" w:type="dxa"/>
                   </w:tcMar>
+                  <w:vAlign w:val="center"/>
                 </w:tcPr>
                 <w:p>
                   <w:pPr>
                     <w:spacing w:after="0"/>
+                    <w:jc w:val="left"/>
                   </w:pPr>
                   <w:r>
                     <w:rPr>
@@ -8520,10 +8748,12 @@
                     <w:bottom w:w="40" w:type="dxa"/>
                     <w:right w:w="70" w:type="dxa"/>
                   </w:tcMar>
+                  <w:vAlign w:val="center"/>
                 </w:tcPr>
                 <w:p>
                   <w:pPr>
                     <w:spacing w:after="0"/>
+                    <w:jc w:val="left"/>
                   </w:pPr>
                   <w:r>
                     <w:rPr>
@@ -8549,10 +8779,12 @@
                     <w:bottom w:w="40" w:type="dxa"/>
                     <w:right w:w="70" w:type="dxa"/>
                   </w:tcMar>
+                  <w:vAlign w:val="center"/>
                 </w:tcPr>
                 <w:p>
                   <w:pPr>
                     <w:spacing w:after="0"/>
+                    <w:jc w:val="left"/>
                   </w:pPr>
                   <w:r>
                     <w:rPr>
@@ -8578,10 +8810,12 @@
                     <w:bottom w:w="40" w:type="dxa"/>
                     <w:right w:w="70" w:type="dxa"/>
                   </w:tcMar>
+                  <w:vAlign w:val="center"/>
                 </w:tcPr>
                 <w:p>
                   <w:pPr>
                     <w:spacing w:after="0"/>
+                    <w:jc w:val="left"/>
                   </w:pPr>
                   <w:r>
                     <w:rPr>
@@ -8607,10 +8841,12 @@
                     <w:bottom w:w="40" w:type="dxa"/>
                     <w:right w:w="70" w:type="dxa"/>
                   </w:tcMar>
+                  <w:vAlign w:val="center"/>
                 </w:tcPr>
                 <w:p>
                   <w:pPr>
                     <w:spacing w:after="0"/>
+                    <w:jc w:val="left"/>
                   </w:pPr>
                   <w:r>
                     <w:rPr>
@@ -8636,10 +8872,12 @@
                     <w:bottom w:w="40" w:type="dxa"/>
                     <w:right w:w="70" w:type="dxa"/>
                   </w:tcMar>
+                  <w:vAlign w:val="center"/>
                 </w:tcPr>
                 <w:p>
                   <w:pPr>
                     <w:spacing w:after="0"/>
+                    <w:jc w:val="left"/>
                   </w:pPr>
                   <w:r>
                     <w:rPr>
@@ -8665,10 +8903,12 @@
                     <w:bottom w:w="40" w:type="dxa"/>
                     <w:right w:w="70" w:type="dxa"/>
                   </w:tcMar>
+                  <w:vAlign w:val="center"/>
                 </w:tcPr>
                 <w:p>
                   <w:pPr>
                     <w:spacing w:after="0"/>
+                    <w:jc w:val="left"/>
                   </w:pPr>
                   <w:r>
                     <w:rPr>
@@ -8703,10 +8943,12 @@
                     <w:bottom w:w="30" w:type="dxa"/>
                     <w:right w:w="70" w:type="dxa"/>
                   </w:tcMar>
+                  <w:vAlign w:val="center"/>
                 </w:tcPr>
                 <w:p>
                   <w:pPr>
                     <w:spacing w:after="0"/>
+                    <w:jc w:val="left"/>
                   </w:pPr>
                   <w:r>
                     <w:rPr>
@@ -8735,10 +8977,12 @@
                     <w:bottom w:w="30" w:type="dxa"/>
                     <w:right w:w="70" w:type="dxa"/>
                   </w:tcMar>
+                  <w:vAlign w:val="center"/>
                 </w:tcPr>
                 <w:p>
                   <w:pPr>
                     <w:spacing w:after="0"/>
+                    <w:jc w:val="left"/>
                   </w:pPr>
                 </w:p>
               </w:tc>
@@ -8757,10 +9001,12 @@
                     <w:bottom w:w="30" w:type="dxa"/>
                     <w:right w:w="70" w:type="dxa"/>
                   </w:tcMar>
+                  <w:vAlign w:val="center"/>
                 </w:tcPr>
                 <w:p>
                   <w:pPr>
                     <w:spacing w:after="0"/>
+                    <w:jc w:val="left"/>
                   </w:pPr>
                 </w:p>
               </w:tc>
@@ -8779,10 +9025,12 @@
                     <w:bottom w:w="30" w:type="dxa"/>
                     <w:right w:w="70" w:type="dxa"/>
                   </w:tcMar>
+                  <w:vAlign w:val="center"/>
                 </w:tcPr>
                 <w:p>
                   <w:pPr>
                     <w:spacing w:after="0"/>
+                    <w:jc w:val="left"/>
                   </w:pPr>
                 </w:p>
               </w:tc>
@@ -8801,10 +9049,12 @@
                     <w:bottom w:w="30" w:type="dxa"/>
                     <w:right w:w="70" w:type="dxa"/>
                   </w:tcMar>
+                  <w:vAlign w:val="center"/>
                 </w:tcPr>
                 <w:p>
                   <w:pPr>
                     <w:spacing w:after="0"/>
+                    <w:jc w:val="left"/>
                   </w:pPr>
                 </w:p>
               </w:tc>
@@ -8823,10 +9073,12 @@
                     <w:bottom w:w="30" w:type="dxa"/>
                     <w:right w:w="70" w:type="dxa"/>
                   </w:tcMar>
+                  <w:vAlign w:val="center"/>
                 </w:tcPr>
                 <w:p>
                   <w:pPr>
                     <w:spacing w:after="0"/>
+                    <w:jc w:val="left"/>
                   </w:pPr>
                 </w:p>
               </w:tc>
@@ -8845,10 +9097,12 @@
                     <w:bottom w:w="30" w:type="dxa"/>
                     <w:right w:w="70" w:type="dxa"/>
                   </w:tcMar>
+                  <w:vAlign w:val="center"/>
                 </w:tcPr>
                 <w:p>
                   <w:pPr>
                     <w:spacing w:after="0"/>
+                    <w:jc w:val="left"/>
                   </w:pPr>
                 </w:p>
               </w:tc>
@@ -8967,10 +9221,12 @@
                     <w:bottom w:w="40" w:type="dxa"/>
                     <w:right w:w="70" w:type="dxa"/>
                   </w:tcMar>
+                  <w:vAlign w:val="center"/>
                 </w:tcPr>
                 <w:p>
                   <w:pPr>
                     <w:spacing w:after="0"/>
+                    <w:jc w:val="left"/>
                   </w:pPr>
                   <w:r>
                     <w:rPr>
@@ -8996,10 +9252,12 @@
                     <w:bottom w:w="40" w:type="dxa"/>
                     <w:right w:w="70" w:type="dxa"/>
                   </w:tcMar>
+                  <w:vAlign w:val="center"/>
                 </w:tcPr>
                 <w:p>
                   <w:pPr>
                     <w:spacing w:after="0"/>
+                    <w:jc w:val="left"/>
                   </w:pPr>
                   <w:r>
                     <w:rPr>
@@ -9025,10 +9283,12 @@
                     <w:bottom w:w="40" w:type="dxa"/>
                     <w:right w:w="70" w:type="dxa"/>
                   </w:tcMar>
+                  <w:vAlign w:val="center"/>
                 </w:tcPr>
                 <w:p>
                   <w:pPr>
                     <w:spacing w:after="0"/>
+                    <w:jc w:val="left"/>
                   </w:pPr>
                   <w:r>
                     <w:rPr>
@@ -9065,10 +9325,12 @@
                     <w:bottom w:w="40" w:type="dxa"/>
                     <w:right w:w="70" w:type="dxa"/>
                   </w:tcMar>
+                  <w:vAlign w:val="center"/>
                 </w:tcPr>
                 <w:p>
                   <w:pPr>
                     <w:spacing w:after="0"/>
+                    <w:jc w:val="left"/>
                   </w:pPr>
                   <w:r>
                     <w:rPr>
@@ -9094,10 +9356,12 @@
                     <w:bottom w:w="40" w:type="dxa"/>
                     <w:right w:w="70" w:type="dxa"/>
                   </w:tcMar>
+                  <w:vAlign w:val="center"/>
                 </w:tcPr>
                 <w:p>
                   <w:pPr>
                     <w:spacing w:after="0"/>
+                    <w:jc w:val="left"/>
                   </w:pPr>
                   <w:r>
                     <w:rPr>
@@ -9123,10 +9387,12 @@
                     <w:bottom w:w="40" w:type="dxa"/>
                     <w:right w:w="70" w:type="dxa"/>
                   </w:tcMar>
+                  <w:vAlign w:val="center"/>
                 </w:tcPr>
                 <w:p>
                   <w:pPr>
                     <w:spacing w:after="0"/>
+                    <w:jc w:val="left"/>
                   </w:pPr>
                   <w:r>
                     <w:rPr>
@@ -9161,10 +9427,12 @@
                     <w:bottom w:w="30" w:type="dxa"/>
                     <w:right w:w="70" w:type="dxa"/>
                   </w:tcMar>
+                  <w:vAlign w:val="center"/>
                 </w:tcPr>
                 <w:p>
                   <w:pPr>
                     <w:spacing w:after="0"/>
+                    <w:jc w:val="left"/>
                   </w:pPr>
                   <w:r>
                     <w:rPr>
@@ -9193,10 +9461,12 @@
                     <w:bottom w:w="30" w:type="dxa"/>
                     <w:right w:w="70" w:type="dxa"/>
                   </w:tcMar>
+                  <w:vAlign w:val="center"/>
                 </w:tcPr>
                 <w:p>
                   <w:pPr>
                     <w:spacing w:after="0"/>
+                    <w:jc w:val="left"/>
                   </w:pPr>
                   <w:r>
                     <w:rPr>
@@ -9225,10 +9495,12 @@
                     <w:bottom w:w="30" w:type="dxa"/>
                     <w:right w:w="70" w:type="dxa"/>
                   </w:tcMar>
+                  <w:vAlign w:val="center"/>
                 </w:tcPr>
                 <w:p>
                   <w:pPr>
                     <w:spacing w:after="0"/>
+                    <w:jc w:val="left"/>
                   </w:pPr>
                 </w:p>
               </w:tc>
@@ -9247,10 +9519,12 @@
                     <w:bottom w:w="30" w:type="dxa"/>
                     <w:right w:w="70" w:type="dxa"/>
                   </w:tcMar>
+                  <w:vAlign w:val="center"/>
                 </w:tcPr>
                 <w:p>
                   <w:pPr>
                     <w:spacing w:after="0"/>
+                    <w:jc w:val="left"/>
                   </w:pPr>
                 </w:p>
               </w:tc>
@@ -9269,10 +9543,12 @@
                     <w:bottom w:w="30" w:type="dxa"/>
                     <w:right w:w="70" w:type="dxa"/>
                   </w:tcMar>
+                  <w:vAlign w:val="center"/>
                 </w:tcPr>
                 <w:p>
                   <w:pPr>
                     <w:spacing w:after="0"/>
+                    <w:jc w:val="left"/>
                   </w:pPr>
                 </w:p>
               </w:tc>
@@ -9291,10 +9567,12 @@
                     <w:bottom w:w="30" w:type="dxa"/>
                     <w:right w:w="70" w:type="dxa"/>
                   </w:tcMar>
+                  <w:vAlign w:val="center"/>
                 </w:tcPr>
                 <w:p>
                   <w:pPr>
                     <w:spacing w:after="0"/>
+                    <w:jc w:val="left"/>
                   </w:pPr>
                 </w:p>
               </w:tc>
@@ -9319,10 +9597,12 @@
                     <w:bottom w:w="30" w:type="dxa"/>
                     <w:right w:w="70" w:type="dxa"/>
                   </w:tcMar>
+                  <w:vAlign w:val="center"/>
                 </w:tcPr>
                 <w:p>
                   <w:pPr>
                     <w:spacing w:after="0"/>
+                    <w:jc w:val="left"/>
                   </w:pPr>
                   <w:r>
                     <w:rPr>
@@ -9351,10 +9631,12 @@
                     <w:bottom w:w="30" w:type="dxa"/>
                     <w:right w:w="70" w:type="dxa"/>
                   </w:tcMar>
+                  <w:vAlign w:val="center"/>
                 </w:tcPr>
                 <w:p>
                   <w:pPr>
                     <w:spacing w:after="0"/>
+                    <w:jc w:val="left"/>
                   </w:pPr>
                   <w:r>
                     <w:rPr>
@@ -9383,10 +9665,12 @@
                     <w:bottom w:w="30" w:type="dxa"/>
                     <w:right w:w="70" w:type="dxa"/>
                   </w:tcMar>
+                  <w:vAlign w:val="center"/>
                 </w:tcPr>
                 <w:p>
                   <w:pPr>
                     <w:spacing w:after="0"/>
+                    <w:jc w:val="left"/>
                   </w:pPr>
                 </w:p>
               </w:tc>
@@ -9405,10 +9689,12 @@
                     <w:bottom w:w="30" w:type="dxa"/>
                     <w:right w:w="70" w:type="dxa"/>
                   </w:tcMar>
+                  <w:vAlign w:val="center"/>
                 </w:tcPr>
                 <w:p>
                   <w:pPr>
                     <w:spacing w:after="0"/>
+                    <w:jc w:val="left"/>
                   </w:pPr>
                 </w:p>
               </w:tc>
@@ -9427,10 +9713,12 @@
                     <w:bottom w:w="30" w:type="dxa"/>
                     <w:right w:w="70" w:type="dxa"/>
                   </w:tcMar>
+                  <w:vAlign w:val="center"/>
                 </w:tcPr>
                 <w:p>
                   <w:pPr>
                     <w:spacing w:after="0"/>
+                    <w:jc w:val="left"/>
                   </w:pPr>
                 </w:p>
               </w:tc>
@@ -9449,10 +9737,12 @@
                     <w:bottom w:w="30" w:type="dxa"/>
                     <w:right w:w="70" w:type="dxa"/>
                   </w:tcMar>
+                  <w:vAlign w:val="center"/>
                 </w:tcPr>
                 <w:p>
                   <w:pPr>
                     <w:spacing w:after="0"/>
+                    <w:jc w:val="left"/>
                   </w:pPr>
                 </w:p>
               </w:tc>
@@ -9477,10 +9767,12 @@
                     <w:bottom w:w="30" w:type="dxa"/>
                     <w:right w:w="70" w:type="dxa"/>
                   </w:tcMar>
+                  <w:vAlign w:val="center"/>
                 </w:tcPr>
                 <w:p>
                   <w:pPr>
                     <w:spacing w:after="0"/>
+                    <w:jc w:val="left"/>
                   </w:pPr>
                   <w:r>
                     <w:rPr>
@@ -9509,10 +9801,12 @@
                     <w:bottom w:w="30" w:type="dxa"/>
                     <w:right w:w="70" w:type="dxa"/>
                   </w:tcMar>
+                  <w:vAlign w:val="center"/>
                 </w:tcPr>
                 <w:p>
                   <w:pPr>
                     <w:spacing w:after="0"/>
+                    <w:jc w:val="left"/>
                   </w:pPr>
                   <w:r>
                     <w:rPr>
@@ -9541,10 +9835,12 @@
                     <w:bottom w:w="30" w:type="dxa"/>
                     <w:right w:w="70" w:type="dxa"/>
                   </w:tcMar>
+                  <w:vAlign w:val="center"/>
                 </w:tcPr>
                 <w:p>
                   <w:pPr>
                     <w:spacing w:after="0"/>
+                    <w:jc w:val="left"/>
                   </w:pPr>
                 </w:p>
               </w:tc>
@@ -9563,10 +9859,12 @@
                     <w:bottom w:w="30" w:type="dxa"/>
                     <w:right w:w="70" w:type="dxa"/>
                   </w:tcMar>
+                  <w:vAlign w:val="center"/>
                 </w:tcPr>
                 <w:p>
                   <w:pPr>
                     <w:spacing w:after="0"/>
+                    <w:jc w:val="left"/>
                   </w:pPr>
                 </w:p>
               </w:tc>
@@ -9585,10 +9883,12 @@
                     <w:bottom w:w="30" w:type="dxa"/>
                     <w:right w:w="70" w:type="dxa"/>
                   </w:tcMar>
+                  <w:vAlign w:val="center"/>
                 </w:tcPr>
                 <w:p>
                   <w:pPr>
                     <w:spacing w:after="0"/>
+                    <w:jc w:val="left"/>
                   </w:pPr>
                 </w:p>
               </w:tc>
@@ -9607,10 +9907,12 @@
                     <w:bottom w:w="30" w:type="dxa"/>
                     <w:right w:w="70" w:type="dxa"/>
                   </w:tcMar>
+                  <w:vAlign w:val="center"/>
                 </w:tcPr>
                 <w:p>
                   <w:pPr>
                     <w:spacing w:after="0"/>
+                    <w:jc w:val="left"/>
                   </w:pPr>
                 </w:p>
               </w:tc>
@@ -9635,10 +9937,12 @@
                     <w:bottom w:w="30" w:type="dxa"/>
                     <w:right w:w="70" w:type="dxa"/>
                   </w:tcMar>
+                  <w:vAlign w:val="center"/>
                 </w:tcPr>
                 <w:p>
                   <w:pPr>
                     <w:spacing w:after="0"/>
+                    <w:jc w:val="left"/>
                   </w:pPr>
                   <w:r>
                     <w:rPr>
@@ -9667,10 +9971,12 @@
                     <w:bottom w:w="30" w:type="dxa"/>
                     <w:right w:w="70" w:type="dxa"/>
                   </w:tcMar>
+                  <w:vAlign w:val="center"/>
                 </w:tcPr>
                 <w:p>
                   <w:pPr>
                     <w:spacing w:after="0"/>
+                    <w:jc w:val="left"/>
                   </w:pPr>
                   <w:r>
                     <w:rPr>
@@ -9699,10 +10005,12 @@
                     <w:bottom w:w="30" w:type="dxa"/>
                     <w:right w:w="70" w:type="dxa"/>
                   </w:tcMar>
+                  <w:vAlign w:val="center"/>
                 </w:tcPr>
                 <w:p>
                   <w:pPr>
                     <w:spacing w:after="0"/>
+                    <w:jc w:val="left"/>
                   </w:pPr>
                 </w:p>
               </w:tc>
@@ -9721,10 +10029,12 @@
                     <w:bottom w:w="30" w:type="dxa"/>
                     <w:right w:w="70" w:type="dxa"/>
                   </w:tcMar>
+                  <w:vAlign w:val="center"/>
                 </w:tcPr>
                 <w:p>
                   <w:pPr>
                     <w:spacing w:after="0"/>
+                    <w:jc w:val="left"/>
                   </w:pPr>
                 </w:p>
               </w:tc>
@@ -9743,10 +10053,12 @@
                     <w:bottom w:w="30" w:type="dxa"/>
                     <w:right w:w="70" w:type="dxa"/>
                   </w:tcMar>
+                  <w:vAlign w:val="center"/>
                 </w:tcPr>
                 <w:p>
                   <w:pPr>
                     <w:spacing w:after="0"/>
+                    <w:jc w:val="left"/>
                   </w:pPr>
                 </w:p>
               </w:tc>
@@ -9765,10 +10077,12 @@
                     <w:bottom w:w="30" w:type="dxa"/>
                     <w:right w:w="70" w:type="dxa"/>
                   </w:tcMar>
+                  <w:vAlign w:val="center"/>
                 </w:tcPr>
                 <w:p>
                   <w:pPr>
                     <w:spacing w:after="0"/>
+                    <w:jc w:val="left"/>
                   </w:pPr>
                 </w:p>
               </w:tc>
@@ -9892,10 +10206,12 @@
                     <w:bottom w:w="40" w:type="dxa"/>
                     <w:right w:w="70" w:type="dxa"/>
                   </w:tcMar>
+                  <w:vAlign w:val="center"/>
                 </w:tcPr>
                 <w:p>
                   <w:pPr>
                     <w:spacing w:after="0"/>
+                    <w:jc w:val="left"/>
                   </w:pPr>
                   <w:r>
                     <w:rPr>
@@ -9921,10 +10237,12 @@
                     <w:bottom w:w="40" w:type="dxa"/>
                     <w:right w:w="70" w:type="dxa"/>
                   </w:tcMar>
+                  <w:vAlign w:val="center"/>
                 </w:tcPr>
                 <w:p>
                   <w:pPr>
                     <w:spacing w:after="0"/>
+                    <w:jc w:val="left"/>
                   </w:pPr>
                   <w:r>
                     <w:rPr>
@@ -9950,10 +10268,12 @@
                     <w:bottom w:w="40" w:type="dxa"/>
                     <w:right w:w="70" w:type="dxa"/>
                   </w:tcMar>
+                  <w:vAlign w:val="center"/>
                 </w:tcPr>
                 <w:p>
                   <w:pPr>
                     <w:spacing w:after="0"/>
+                    <w:jc w:val="left"/>
                   </w:pPr>
                   <w:r>
                     <w:rPr>
@@ -9988,10 +10308,12 @@
                     <w:bottom w:w="30" w:type="dxa"/>
                     <w:right w:w="70" w:type="dxa"/>
                   </w:tcMar>
+                  <w:vAlign w:val="center"/>
                 </w:tcPr>
                 <w:p>
                   <w:pPr>
                     <w:spacing w:after="0"/>
+                    <w:jc w:val="left"/>
                   </w:pPr>
                   <w:r>
                     <w:rPr>
@@ -10020,10 +10342,12 @@
                     <w:bottom w:w="30" w:type="dxa"/>
                     <w:right w:w="70" w:type="dxa"/>
                   </w:tcMar>
+                  <w:vAlign w:val="center"/>
                 </w:tcPr>
                 <w:p>
                   <w:pPr>
                     <w:spacing w:after="0"/>
+                    <w:jc w:val="left"/>
                   </w:pPr>
                   <w:r>
                     <w:rPr>
@@ -10084,10 +10408,12 @@
                     <w:bottom w:w="30" w:type="dxa"/>
                     <w:right w:w="70" w:type="dxa"/>
                   </w:tcMar>
+                  <w:vAlign w:val="center"/>
                 </w:tcPr>
                 <w:p>
                   <w:pPr>
                     <w:spacing w:after="0"/>
+                    <w:jc w:val="left"/>
                   </w:pPr>
                   <w:r>
                     <w:rPr>
@@ -10122,10 +10448,12 @@
                     <w:bottom w:w="30" w:type="dxa"/>
                     <w:right w:w="70" w:type="dxa"/>
                   </w:tcMar>
+                  <w:vAlign w:val="center"/>
                 </w:tcPr>
                 <w:p>
                   <w:pPr>
                     <w:spacing w:after="0"/>
+                    <w:jc w:val="left"/>
                   </w:pPr>
                   <w:r>
                     <w:rPr>
@@ -10154,10 +10482,12 @@
                     <w:bottom w:w="30" w:type="dxa"/>
                     <w:right w:w="70" w:type="dxa"/>
                   </w:tcMar>
+                  <w:vAlign w:val="center"/>
                 </w:tcPr>
                 <w:p>
                   <w:pPr>
                     <w:spacing w:after="0"/>
+                    <w:jc w:val="left"/>
                   </w:pPr>
                   <w:r>
                     <w:rPr>
@@ -10218,10 +10548,12 @@
                     <w:bottom w:w="30" w:type="dxa"/>
                     <w:right w:w="70" w:type="dxa"/>
                   </w:tcMar>
+                  <w:vAlign w:val="center"/>
                 </w:tcPr>
                 <w:p>
                   <w:pPr>
                     <w:spacing w:after="0"/>
+                    <w:jc w:val="left"/>
                   </w:pPr>
                   <w:r>
                     <w:rPr>
@@ -10256,10 +10588,12 @@
                     <w:bottom w:w="30" w:type="dxa"/>
                     <w:right w:w="70" w:type="dxa"/>
                   </w:tcMar>
+                  <w:vAlign w:val="center"/>
                 </w:tcPr>
                 <w:p>
                   <w:pPr>
                     <w:spacing w:after="0"/>
+                    <w:jc w:val="left"/>
                   </w:pPr>
                   <w:r>
                     <w:rPr>
@@ -10288,10 +10622,12 @@
                     <w:bottom w:w="30" w:type="dxa"/>
                     <w:right w:w="70" w:type="dxa"/>
                   </w:tcMar>
+                  <w:vAlign w:val="center"/>
                 </w:tcPr>
                 <w:p>
                   <w:pPr>
                     <w:spacing w:after="0"/>
+                    <w:jc w:val="left"/>
                   </w:pPr>
                   <w:r>
                     <w:rPr>
@@ -10331,10 +10667,12 @@
                     <w:bottom w:w="30" w:type="dxa"/>
                     <w:right w:w="70" w:type="dxa"/>
                   </w:tcMar>
+                  <w:vAlign w:val="center"/>
                 </w:tcPr>
                 <w:p>
                   <w:pPr>
                     <w:spacing w:after="0"/>
+                    <w:jc w:val="left"/>
                   </w:pPr>
                 </w:p>
               </w:tc>
@@ -10785,10 +11123,12 @@
                     <w:bottom w:w="40" w:type="dxa"/>
                     <w:right w:w="70" w:type="dxa"/>
                   </w:tcMar>
+                  <w:vAlign w:val="center"/>
                 </w:tcPr>
                 <w:p>
                   <w:pPr>
                     <w:spacing w:after="0"/>
+                    <w:jc w:val="left"/>
                   </w:pPr>
                   <w:r>
                     <w:rPr>
@@ -10814,10 +11154,12 @@
                     <w:bottom w:w="40" w:type="dxa"/>
                     <w:right w:w="70" w:type="dxa"/>
                   </w:tcMar>
+                  <w:vAlign w:val="center"/>
                 </w:tcPr>
                 <w:p>
                   <w:pPr>
                     <w:spacing w:after="0"/>
+                    <w:jc w:val="left"/>
                   </w:pPr>
                   <w:r>
                     <w:rPr>
@@ -10852,10 +11194,12 @@
                     <w:bottom w:w="30" w:type="dxa"/>
                     <w:right w:w="70" w:type="dxa"/>
                   </w:tcMar>
+                  <w:vAlign w:val="center"/>
                 </w:tcPr>
                 <w:p>
                   <w:pPr>
                     <w:spacing w:after="0"/>
+                    <w:jc w:val="left"/>
                   </w:pPr>
                   <w:r>
                     <w:rPr>
@@ -10884,10 +11228,12 @@
                     <w:bottom w:w="30" w:type="dxa"/>
                     <w:right w:w="70" w:type="dxa"/>
                   </w:tcMar>
+                  <w:vAlign w:val="center"/>
                 </w:tcPr>
                 <w:p>
                   <w:pPr>
                     <w:spacing w:after="0"/>
+                    <w:jc w:val="left"/>
                   </w:pPr>
                 </w:p>
               </w:tc>
@@ -10912,10 +11258,12 @@
                     <w:bottom w:w="30" w:type="dxa"/>
                     <w:right w:w="70" w:type="dxa"/>
                   </w:tcMar>
+                  <w:vAlign w:val="center"/>
                 </w:tcPr>
                 <w:p>
                   <w:pPr>
                     <w:spacing w:after="0"/>
+                    <w:jc w:val="left"/>
                   </w:pPr>
                   <w:r>
                     <w:rPr>
@@ -10944,10 +11292,12 @@
                     <w:bottom w:w="30" w:type="dxa"/>
                     <w:right w:w="70" w:type="dxa"/>
                   </w:tcMar>
+                  <w:vAlign w:val="center"/>
                 </w:tcPr>
                 <w:p>
                   <w:pPr>
                     <w:spacing w:after="0"/>
+                    <w:jc w:val="left"/>
                   </w:pPr>
                 </w:p>
               </w:tc>
@@ -11157,10 +11507,12 @@
                     <w:bottom w:w="40" w:type="dxa"/>
                     <w:right w:w="70" w:type="dxa"/>
                   </w:tcMar>
+                  <w:vAlign w:val="center"/>
                 </w:tcPr>
                 <w:p>
                   <w:pPr>
                     <w:spacing w:after="0"/>
+                    <w:jc w:val="left"/>
                   </w:pPr>
                   <w:r>
                     <w:rPr>
@@ -11186,10 +11538,12 @@
                     <w:bottom w:w="40" w:type="dxa"/>
                     <w:right w:w="70" w:type="dxa"/>
                   </w:tcMar>
+                  <w:vAlign w:val="center"/>
                 </w:tcPr>
                 <w:p>
                   <w:pPr>
                     <w:spacing w:after="0"/>
+                    <w:jc w:val="left"/>
                   </w:pPr>
                   <w:r>
                     <w:rPr>
@@ -11215,10 +11569,12 @@
                     <w:bottom w:w="40" w:type="dxa"/>
                     <w:right w:w="70" w:type="dxa"/>
                   </w:tcMar>
+                  <w:vAlign w:val="center"/>
                 </w:tcPr>
                 <w:p>
                   <w:pPr>
                     <w:spacing w:after="0"/>
+                    <w:jc w:val="left"/>
                   </w:pPr>
                   <w:r>
                     <w:rPr>
@@ -11253,10 +11609,12 @@
                     <w:bottom w:w="30" w:type="dxa"/>
                     <w:right w:w="70" w:type="dxa"/>
                   </w:tcMar>
+                  <w:vAlign w:val="center"/>
                 </w:tcPr>
                 <w:p>
                   <w:pPr>
                     <w:spacing w:after="0"/>
+                    <w:jc w:val="left"/>
                   </w:pPr>
                   <w:r>
                     <w:rPr>
@@ -11285,10 +11643,12 @@
                     <w:bottom w:w="30" w:type="dxa"/>
                     <w:right w:w="70" w:type="dxa"/>
                   </w:tcMar>
+                  <w:vAlign w:val="center"/>
                 </w:tcPr>
                 <w:p>
                   <w:pPr>
                     <w:spacing w:after="0"/>
+                    <w:jc w:val="left"/>
                   </w:pPr>
                 </w:p>
               </w:tc>
@@ -11307,10 +11667,12 @@
                     <w:bottom w:w="30" w:type="dxa"/>
                     <w:right w:w="70" w:type="dxa"/>
                   </w:tcMar>
+                  <w:vAlign w:val="center"/>
                 </w:tcPr>
                 <w:p>
                   <w:pPr>
                     <w:spacing w:after="0"/>
+                    <w:jc w:val="left"/>
                   </w:pPr>
                 </w:p>
               </w:tc>
@@ -11335,10 +11697,12 @@
                     <w:bottom w:w="30" w:type="dxa"/>
                     <w:right w:w="70" w:type="dxa"/>
                   </w:tcMar>
+                  <w:vAlign w:val="center"/>
                 </w:tcPr>
                 <w:p>
                   <w:pPr>
                     <w:spacing w:after="0"/>
+                    <w:jc w:val="left"/>
                   </w:pPr>
                   <w:r>
                     <w:rPr>
@@ -11367,10 +11731,12 @@
                     <w:bottom w:w="30" w:type="dxa"/>
                     <w:right w:w="70" w:type="dxa"/>
                   </w:tcMar>
+                  <w:vAlign w:val="center"/>
                 </w:tcPr>
                 <w:p>
                   <w:pPr>
                     <w:spacing w:after="0"/>
+                    <w:jc w:val="left"/>
                   </w:pPr>
                 </w:p>
               </w:tc>
@@ -11389,10 +11755,12 @@
                     <w:bottom w:w="30" w:type="dxa"/>
                     <w:right w:w="70" w:type="dxa"/>
                   </w:tcMar>
+                  <w:vAlign w:val="center"/>
                 </w:tcPr>
                 <w:p>
                   <w:pPr>
                     <w:spacing w:after="0"/>
+                    <w:jc w:val="left"/>
                   </w:pPr>
                 </w:p>
               </w:tc>
@@ -11507,10 +11875,12 @@
                     <w:bottom w:w="40" w:type="dxa"/>
                     <w:right w:w="70" w:type="dxa"/>
                   </w:tcMar>
+                  <w:vAlign w:val="center"/>
                 </w:tcPr>
                 <w:p>
                   <w:pPr>
                     <w:spacing w:after="0"/>
+                    <w:jc w:val="left"/>
                   </w:pPr>
                   <w:r>
                     <w:rPr>
@@ -11536,10 +11906,12 @@
                     <w:bottom w:w="40" w:type="dxa"/>
                     <w:right w:w="70" w:type="dxa"/>
                   </w:tcMar>
+                  <w:vAlign w:val="center"/>
                 </w:tcPr>
                 <w:p>
                   <w:pPr>
                     <w:spacing w:after="0"/>
+                    <w:jc w:val="left"/>
                   </w:pPr>
                   <w:r>
                     <w:rPr>
@@ -11574,10 +11946,12 @@
                     <w:bottom w:w="30" w:type="dxa"/>
                     <w:right w:w="70" w:type="dxa"/>
                   </w:tcMar>
+                  <w:vAlign w:val="center"/>
                 </w:tcPr>
                 <w:p>
                   <w:pPr>
                     <w:spacing w:after="0"/>
+                    <w:jc w:val="left"/>
                   </w:pPr>
                   <w:r>
                     <w:rPr>
@@ -11606,10 +11980,12 @@
                     <w:bottom w:w="30" w:type="dxa"/>
                     <w:right w:w="70" w:type="dxa"/>
                   </w:tcMar>
+                  <w:vAlign w:val="center"/>
                 </w:tcPr>
                 <w:p>
                   <w:pPr>
                     <w:spacing w:after="0"/>
+                    <w:jc w:val="left"/>
                   </w:pPr>
                 </w:p>
               </w:tc>
@@ -11634,10 +12010,12 @@
                     <w:bottom w:w="30" w:type="dxa"/>
                     <w:right w:w="70" w:type="dxa"/>
                   </w:tcMar>
+                  <w:vAlign w:val="center"/>
                 </w:tcPr>
                 <w:p>
                   <w:pPr>
                     <w:spacing w:after="0"/>
+                    <w:jc w:val="left"/>
                   </w:pPr>
                   <w:r>
                     <w:rPr>
@@ -11666,10 +12044,12 @@
                     <w:bottom w:w="30" w:type="dxa"/>
                     <w:right w:w="70" w:type="dxa"/>
                   </w:tcMar>
+                  <w:vAlign w:val="center"/>
                 </w:tcPr>
                 <w:p>
                   <w:pPr>
                     <w:spacing w:after="0"/>
+                    <w:jc w:val="left"/>
                   </w:pPr>
                 </w:p>
               </w:tc>
@@ -11694,10 +12074,12 @@
                     <w:bottom w:w="30" w:type="dxa"/>
                     <w:right w:w="70" w:type="dxa"/>
                   </w:tcMar>
+                  <w:vAlign w:val="center"/>
                 </w:tcPr>
                 <w:p>
                   <w:pPr>
                     <w:spacing w:after="0"/>
+                    <w:jc w:val="left"/>
                   </w:pPr>
                   <w:r>
                     <w:rPr>
@@ -11726,10 +12108,12 @@
                     <w:bottom w:w="30" w:type="dxa"/>
                     <w:right w:w="70" w:type="dxa"/>
                   </w:tcMar>
+                  <w:vAlign w:val="center"/>
                 </w:tcPr>
                 <w:p>
                   <w:pPr>
                     <w:spacing w:after="0"/>
+                    <w:jc w:val="left"/>
                   </w:pPr>
                 </w:p>
               </w:tc>
@@ -11947,10 +12331,12 @@
                     <w:bottom w:w="40" w:type="dxa"/>
                     <w:right w:w="70" w:type="dxa"/>
                   </w:tcMar>
+                  <w:vAlign w:val="center"/>
                 </w:tcPr>
                 <w:p>
                   <w:pPr>
                     <w:spacing w:after="0"/>
+                    <w:jc w:val="left"/>
                   </w:pPr>
                   <w:r>
                     <w:rPr>
@@ -11976,10 +12362,12 @@
                     <w:bottom w:w="40" w:type="dxa"/>
                     <w:right w:w="70" w:type="dxa"/>
                   </w:tcMar>
+                  <w:vAlign w:val="center"/>
                 </w:tcPr>
                 <w:p>
                   <w:pPr>
                     <w:spacing w:after="0"/>
+                    <w:jc w:val="left"/>
                   </w:pPr>
                   <w:r>
                     <w:rPr>
@@ -12005,10 +12393,12 @@
                     <w:bottom w:w="40" w:type="dxa"/>
                     <w:right w:w="70" w:type="dxa"/>
                   </w:tcMar>
+                  <w:vAlign w:val="center"/>
                 </w:tcPr>
                 <w:p>
                   <w:pPr>
                     <w:spacing w:after="0"/>
+                    <w:jc w:val="left"/>
                   </w:pPr>
                   <w:r>
                     <w:rPr>
@@ -12043,10 +12433,12 @@
                     <w:bottom w:w="30" w:type="dxa"/>
                     <w:right w:w="70" w:type="dxa"/>
                   </w:tcMar>
+                  <w:vAlign w:val="center"/>
                 </w:tcPr>
                 <w:p>
                   <w:pPr>
                     <w:spacing w:after="0"/>
+                    <w:jc w:val="left"/>
                   </w:pPr>
                   <w:r>
                     <w:rPr>
@@ -12075,10 +12467,12 @@
                     <w:bottom w:w="30" w:type="dxa"/>
                     <w:right w:w="70" w:type="dxa"/>
                   </w:tcMar>
+                  <w:vAlign w:val="center"/>
                 </w:tcPr>
                 <w:p>
                   <w:pPr>
                     <w:spacing w:after="0"/>
+                    <w:jc w:val="left"/>
                   </w:pPr>
                 </w:p>
               </w:tc>
@@ -12097,10 +12491,12 @@
                     <w:bottom w:w="30" w:type="dxa"/>
                     <w:right w:w="70" w:type="dxa"/>
                   </w:tcMar>
+                  <w:vAlign w:val="center"/>
                 </w:tcPr>
                 <w:p>
                   <w:pPr>
                     <w:spacing w:after="0"/>
+                    <w:jc w:val="left"/>
                   </w:pPr>
                 </w:p>
               </w:tc>
@@ -12125,10 +12521,12 @@
                     <w:bottom w:w="30" w:type="dxa"/>
                     <w:right w:w="70" w:type="dxa"/>
                   </w:tcMar>
+                  <w:vAlign w:val="center"/>
                 </w:tcPr>
                 <w:p>
                   <w:pPr>
                     <w:spacing w:after="0"/>
+                    <w:jc w:val="left"/>
                   </w:pPr>
                   <w:r>
                     <w:rPr>
@@ -12157,10 +12555,12 @@
                     <w:bottom w:w="30" w:type="dxa"/>
                     <w:right w:w="70" w:type="dxa"/>
                   </w:tcMar>
+                  <w:vAlign w:val="center"/>
                 </w:tcPr>
                 <w:p>
                   <w:pPr>
                     <w:spacing w:after="0"/>
+                    <w:jc w:val="left"/>
                   </w:pPr>
                 </w:p>
               </w:tc>
@@ -12179,10 +12579,12 @@
                     <w:bottom w:w="30" w:type="dxa"/>
                     <w:right w:w="70" w:type="dxa"/>
                   </w:tcMar>
+                  <w:vAlign w:val="center"/>
                 </w:tcPr>
                 <w:p>
                   <w:pPr>
                     <w:spacing w:after="0"/>
+                    <w:jc w:val="left"/>
                   </w:pPr>
                 </w:p>
               </w:tc>
@@ -12207,10 +12609,12 @@
                     <w:bottom w:w="30" w:type="dxa"/>
                     <w:right w:w="70" w:type="dxa"/>
                   </w:tcMar>
+                  <w:vAlign w:val="center"/>
                 </w:tcPr>
                 <w:p>
                   <w:pPr>
                     <w:spacing w:after="0"/>
+                    <w:jc w:val="left"/>
                   </w:pPr>
                   <w:r>
                     <w:rPr>
@@ -12239,10 +12643,12 @@
                     <w:bottom w:w="30" w:type="dxa"/>
                     <w:right w:w="70" w:type="dxa"/>
                   </w:tcMar>
+                  <w:vAlign w:val="center"/>
                 </w:tcPr>
                 <w:p>
                   <w:pPr>
                     <w:spacing w:after="0"/>
+                    <w:jc w:val="left"/>
                   </w:pPr>
                 </w:p>
               </w:tc>
@@ -12261,10 +12667,12 @@
                     <w:bottom w:w="30" w:type="dxa"/>
                     <w:right w:w="70" w:type="dxa"/>
                   </w:tcMar>
+                  <w:vAlign w:val="center"/>
                 </w:tcPr>
                 <w:p>
                   <w:pPr>
                     <w:spacing w:after="0"/>
+                    <w:jc w:val="left"/>
                   </w:pPr>
                 </w:p>
               </w:tc>
@@ -12289,10 +12697,12 @@
                     <w:bottom w:w="30" w:type="dxa"/>
                     <w:right w:w="70" w:type="dxa"/>
                   </w:tcMar>
+                  <w:vAlign w:val="center"/>
                 </w:tcPr>
                 <w:p>
                   <w:pPr>
                     <w:spacing w:after="0"/>
+                    <w:jc w:val="left"/>
                   </w:pPr>
                   <w:r>
                     <w:rPr>
@@ -12321,10 +12731,12 @@
                     <w:bottom w:w="30" w:type="dxa"/>
                     <w:right w:w="70" w:type="dxa"/>
                   </w:tcMar>
+                  <w:vAlign w:val="center"/>
                 </w:tcPr>
                 <w:p>
                   <w:pPr>
                     <w:spacing w:after="0"/>
+                    <w:jc w:val="left"/>
                   </w:pPr>
                 </w:p>
               </w:tc>
@@ -12343,10 +12755,12 @@
                     <w:bottom w:w="30" w:type="dxa"/>
                     <w:right w:w="70" w:type="dxa"/>
                   </w:tcMar>
+                  <w:vAlign w:val="center"/>
                 </w:tcPr>
                 <w:p>
                   <w:pPr>
                     <w:spacing w:after="0"/>
+                    <w:jc w:val="left"/>
                   </w:pPr>
                 </w:p>
               </w:tc>
@@ -12469,10 +12883,12 @@
                     <w:bottom w:w="40" w:type="dxa"/>
                     <w:right w:w="70" w:type="dxa"/>
                   </w:tcMar>
+                  <w:vAlign w:val="center"/>
                 </w:tcPr>
                 <w:p>
                   <w:pPr>
                     <w:spacing w:after="0"/>
+                    <w:jc w:val="left"/>
                   </w:pPr>
                   <w:r>
                     <w:rPr>
@@ -12498,10 +12914,12 @@
                     <w:bottom w:w="40" w:type="dxa"/>
                     <w:right w:w="70" w:type="dxa"/>
                   </w:tcMar>
+                  <w:vAlign w:val="center"/>
                 </w:tcPr>
                 <w:p>
                   <w:pPr>
                     <w:spacing w:after="0"/>
+                    <w:jc w:val="left"/>
                   </w:pPr>
                   <w:r>
                     <w:rPr>
@@ -12536,10 +12954,12 @@
                     <w:bottom w:w="30" w:type="dxa"/>
                     <w:right w:w="70" w:type="dxa"/>
                   </w:tcMar>
+                  <w:vAlign w:val="center"/>
                 </w:tcPr>
                 <w:p>
                   <w:pPr>
                     <w:spacing w:after="0"/>
+                    <w:jc w:val="left"/>
                   </w:pPr>
                   <w:r>
                     <w:rPr>
@@ -12579,10 +12999,12 @@
                     <w:bottom w:w="30" w:type="dxa"/>
                     <w:right w:w="70" w:type="dxa"/>
                   </w:tcMar>
+                  <w:vAlign w:val="center"/>
                 </w:tcPr>
                 <w:p>
                   <w:pPr>
                     <w:spacing w:after="0"/>
+                    <w:jc w:val="left"/>
                   </w:pPr>
                 </w:p>
               </w:tc>
@@ -12607,10 +13029,12 @@
                     <w:bottom w:w="30" w:type="dxa"/>
                     <w:right w:w="70" w:type="dxa"/>
                   </w:tcMar>
+                  <w:vAlign w:val="center"/>
                 </w:tcPr>
                 <w:p>
                   <w:pPr>
                     <w:spacing w:after="0"/>
+                    <w:jc w:val="left"/>
                   </w:pPr>
                   <w:r>
                     <w:rPr>
@@ -12650,10 +13074,12 @@
                     <w:bottom w:w="30" w:type="dxa"/>
                     <w:right w:w="70" w:type="dxa"/>
                   </w:tcMar>
+                  <w:vAlign w:val="center"/>
                 </w:tcPr>
                 <w:p>
                   <w:pPr>
                     <w:spacing w:after="0"/>
+                    <w:jc w:val="left"/>
                   </w:pPr>
                 </w:p>
               </w:tc>
@@ -12678,10 +13104,12 @@
                     <w:bottom w:w="30" w:type="dxa"/>
                     <w:right w:w="70" w:type="dxa"/>
                   </w:tcMar>
+                  <w:vAlign w:val="center"/>
                 </w:tcPr>
                 <w:p>
                   <w:pPr>
                     <w:spacing w:after="0"/>
+                    <w:jc w:val="left"/>
                   </w:pPr>
                   <w:r>
                     <w:rPr>
@@ -12721,10 +13149,12 @@
                     <w:bottom w:w="30" w:type="dxa"/>
                     <w:right w:w="70" w:type="dxa"/>
                   </w:tcMar>
+                  <w:vAlign w:val="center"/>
                 </w:tcPr>
                 <w:p>
                   <w:pPr>
                     <w:spacing w:after="0"/>
+                    <w:jc w:val="left"/>
                   </w:pPr>
                 </w:p>
               </w:tc>
@@ -12749,10 +13179,12 @@
                     <w:bottom w:w="30" w:type="dxa"/>
                     <w:right w:w="70" w:type="dxa"/>
                   </w:tcMar>
+                  <w:vAlign w:val="center"/>
                 </w:tcPr>
                 <w:p>
                   <w:pPr>
                     <w:spacing w:after="0"/>
+                    <w:jc w:val="left"/>
                   </w:pPr>
                   <w:r>
                     <w:rPr>
@@ -12792,10 +13224,12 @@
                     <w:bottom w:w="30" w:type="dxa"/>
                     <w:right w:w="70" w:type="dxa"/>
                   </w:tcMar>
+                  <w:vAlign w:val="center"/>
                 </w:tcPr>
                 <w:p>
                   <w:pPr>
                     <w:spacing w:after="0"/>
+                    <w:jc w:val="left"/>
                   </w:pPr>
                 </w:p>
               </w:tc>
@@ -12820,10 +13254,12 @@
                     <w:bottom w:w="30" w:type="dxa"/>
                     <w:right w:w="70" w:type="dxa"/>
                   </w:tcMar>
+                  <w:vAlign w:val="center"/>
                 </w:tcPr>
                 <w:p>
                   <w:pPr>
                     <w:spacing w:after="0"/>
+                    <w:jc w:val="left"/>
                   </w:pPr>
                   <w:r>
                     <w:rPr>
@@ -12863,10 +13299,12 @@
                     <w:bottom w:w="30" w:type="dxa"/>
                     <w:right w:w="70" w:type="dxa"/>
                   </w:tcMar>
+                  <w:vAlign w:val="center"/>
                 </w:tcPr>
                 <w:p>
                   <w:pPr>
                     <w:spacing w:after="0"/>
+                    <w:jc w:val="left"/>
                   </w:pPr>
                 </w:p>
               </w:tc>
@@ -12891,10 +13329,12 @@
                     <w:bottom w:w="30" w:type="dxa"/>
                     <w:right w:w="70" w:type="dxa"/>
                   </w:tcMar>
+                  <w:vAlign w:val="center"/>
                 </w:tcPr>
                 <w:p>
                   <w:pPr>
                     <w:spacing w:after="0"/>
+                    <w:jc w:val="left"/>
                   </w:pPr>
                   <w:r>
                     <w:rPr>
@@ -12934,10 +13374,12 @@
                     <w:bottom w:w="30" w:type="dxa"/>
                     <w:right w:w="70" w:type="dxa"/>
                   </w:tcMar>
+                  <w:vAlign w:val="center"/>
                 </w:tcPr>
                 <w:p>
                   <w:pPr>
                     <w:spacing w:after="0"/>
+                    <w:jc w:val="left"/>
                   </w:pPr>
                 </w:p>
               </w:tc>
@@ -12962,10 +13404,12 @@
                     <w:bottom w:w="30" w:type="dxa"/>
                     <w:right w:w="70" w:type="dxa"/>
                   </w:tcMar>
+                  <w:vAlign w:val="center"/>
                 </w:tcPr>
                 <w:p>
                   <w:pPr>
                     <w:spacing w:after="0"/>
+                    <w:jc w:val="left"/>
                   </w:pPr>
                   <w:r>
                     <w:rPr>
@@ -13005,10 +13449,12 @@
                     <w:bottom w:w="30" w:type="dxa"/>
                     <w:right w:w="70" w:type="dxa"/>
                   </w:tcMar>
+                  <w:vAlign w:val="center"/>
                 </w:tcPr>
                 <w:p>
                   <w:pPr>
                     <w:spacing w:after="0"/>
+                    <w:jc w:val="left"/>
                   </w:pPr>
                 </w:p>
               </w:tc>

</xml_diff>

<commit_message>
Unit 2 notes: middle ground, short prompts where worth it plus open space and tables
Co-Authored-By: Claude Sonnet 5.5 <noreply@anthropic.com>
Claude-Session: https://claude.ai/code/session_01LaT1EarAMnh5opQoFahNzN
</commit_message>
<xml_diff>
--- a/output/chem-u02/SHULL_CHEM_Guided_Notes_U02_S02.1-S02.5.docx
+++ b/output/chem-u02/SHULL_CHEM_Guided_Notes_U02_S02.1-S02.5.docx
@@ -1343,6 +1343,21 @@
               <w:t>BOHR MODEL</w:t>
             </w:r>
           </w:p>
+          <w:p>
+            <w:pPr>
+              <w:spacing w:after="40" w:before="0"/>
+            </w:pPr>
+            <w:r>
+              <w:rPr>
+                <w:rFonts w:ascii="Trade Gothic Next" w:hAnsi="Trade Gothic Next"/>
+                <w:b w:val="0"/>
+                <w:color w:val="14161B"/>
+                <w:sz w:val="17"/>
+                <w:u w:val="none"/>
+              </w:rPr>
+              <w:t>Definition — quantized</w:t>
+            </w:r>
+          </w:p>
         </w:tc>
         <w:tc>
           <w:tcPr>
@@ -1371,19 +1386,79 @@
           </w:p>
           <w:p>
             <w:pPr>
-              <w:spacing w:after="120"/>
               <w:pBdr>
-                <w:bottom w:val="single" w:sz="4" w:color="C8CDC2"/>
+                <w:left w:val="single" w:sz="18" w:space="6" w:color="A3E635"/>
               </w:pBdr>
+              <w:spacing w:after="40" w:before="0"/>
             </w:pPr>
+            <w:r>
+              <w:rPr>
+                <w:rFonts w:ascii="Trade Gothic Next" w:hAnsi="Trade Gothic Next"/>
+                <w:b/>
+                <w:color w:val="14161B"/>
+                <w:sz w:val="19"/>
+                <w:u w:val="none"/>
+              </w:rPr>
+              <w:t xml:space="preserve">Electrons stay in set energy levels, labeled </w:t>
+            </w:r>
+            <w:r>
+              <w:rPr>
+                <w:rFonts w:ascii="Trade Gothic Next" w:hAnsi="Trade Gothic Next"/>
+                <w:b w:val="0"/>
+                <w:color w:val="14161B"/>
+                <w:sz w:val="19"/>
+                <w:u w:val="none"/>
+              </w:rPr>
+              <w:t xml:space="preserve"> ______</w:t>
+            </w:r>
+            <w:r>
+              <w:rPr>
+                <w:rFonts w:ascii="Trade Gothic Next" w:hAnsi="Trade Gothic Next"/>
+                <w:b/>
+                <w:color w:val="14161B"/>
+                <w:sz w:val="19"/>
+                <w:u w:val="none"/>
+              </w:rPr>
+              <w:t>.</w:t>
+            </w:r>
           </w:p>
           <w:p>
             <w:pPr>
-              <w:spacing w:after="120"/>
               <w:pBdr>
-                <w:bottom w:val="single" w:sz="4" w:color="C8CDC2"/>
+                <w:left w:val="single" w:sz="18" w:space="6" w:color="A3E635"/>
               </w:pBdr>
+              <w:spacing w:after="40" w:before="0"/>
             </w:pPr>
+            <w:r>
+              <w:rPr>
+                <w:rFonts w:ascii="Trade Gothic Next" w:hAnsi="Trade Gothic Next"/>
+                <w:b/>
+                <w:color w:val="14161B"/>
+                <w:sz w:val="19"/>
+                <w:u w:val="none"/>
+              </w:rPr>
+              <w:t xml:space="preserve">Quantized means </w:t>
+            </w:r>
+            <w:r>
+              <w:rPr>
+                <w:rFonts w:ascii="Trade Gothic Next" w:hAnsi="Trade Gothic Next"/>
+                <w:b w:val="0"/>
+                <w:color w:val="14161B"/>
+                <w:sz w:val="19"/>
+                <w:u w:val="none"/>
+              </w:rPr>
+              <w:t xml:space="preserve"> _____________</w:t>
+            </w:r>
+            <w:r>
+              <w:rPr>
+                <w:rFonts w:ascii="Trade Gothic Next" w:hAnsi="Trade Gothic Next"/>
+                <w:b/>
+                <w:color w:val="14161B"/>
+                <w:sz w:val="19"/>
+                <w:u w:val="none"/>
+              </w:rPr>
+              <w:t>.</w:t>
+            </w:r>
           </w:p>
           <w:p>
             <w:pPr>
@@ -1552,7 +1627,7 @@
             <w:tr>
               <w:trPr>
                 <w:cantSplit/>
-                <w:trHeight w:val="360" w:hRule="atLeast"/>
+                <w:trHeight w:val="316" w:hRule="atLeast"/>
               </w:trPr>
               <w:tc>
                 <w:tcPr>
@@ -1564,9 +1639,9 @@
                     <w:right w:val="single" w:sz="4" w:color="C8CDC2"/>
                   </w:tcBorders>
                   <w:tcMar>
-                    <w:top w:w="30" w:type="dxa"/>
+                    <w:top w:w="20" w:type="dxa"/>
                     <w:left w:w="70" w:type="dxa"/>
-                    <w:bottom w:w="30" w:type="dxa"/>
+                    <w:bottom w:w="20" w:type="dxa"/>
                     <w:right w:w="70" w:type="dxa"/>
                   </w:tcMar>
                   <w:vAlign w:val="center"/>
@@ -1598,9 +1673,9 @@
                     <w:right w:val="single" w:sz="4" w:color="C8CDC2"/>
                   </w:tcBorders>
                   <w:tcMar>
-                    <w:top w:w="30" w:type="dxa"/>
+                    <w:top w:w="20" w:type="dxa"/>
                     <w:left w:w="70" w:type="dxa"/>
-                    <w:bottom w:w="30" w:type="dxa"/>
+                    <w:bottom w:w="20" w:type="dxa"/>
                     <w:right w:w="70" w:type="dxa"/>
                   </w:tcMar>
                   <w:vAlign w:val="center"/>
@@ -1616,7 +1691,7 @@
             <w:tr>
               <w:trPr>
                 <w:cantSplit/>
-                <w:trHeight w:val="360" w:hRule="atLeast"/>
+                <w:trHeight w:val="316" w:hRule="atLeast"/>
               </w:trPr>
               <w:tc>
                 <w:tcPr>
@@ -1628,9 +1703,9 @@
                     <w:right w:val="single" w:sz="4" w:color="C8CDC2"/>
                   </w:tcBorders>
                   <w:tcMar>
-                    <w:top w:w="30" w:type="dxa"/>
+                    <w:top w:w="20" w:type="dxa"/>
                     <w:left w:w="70" w:type="dxa"/>
-                    <w:bottom w:w="30" w:type="dxa"/>
+                    <w:bottom w:w="20" w:type="dxa"/>
                     <w:right w:w="70" w:type="dxa"/>
                   </w:tcMar>
                   <w:vAlign w:val="center"/>
@@ -1662,9 +1737,9 @@
                     <w:right w:val="single" w:sz="4" w:color="C8CDC2"/>
                   </w:tcBorders>
                   <w:tcMar>
-                    <w:top w:w="30" w:type="dxa"/>
+                    <w:top w:w="20" w:type="dxa"/>
                     <w:left w:w="70" w:type="dxa"/>
-                    <w:bottom w:w="30" w:type="dxa"/>
+                    <w:bottom w:w="20" w:type="dxa"/>
                     <w:right w:w="70" w:type="dxa"/>
                   </w:tcMar>
                   <w:vAlign w:val="center"/>
@@ -1680,7 +1755,7 @@
             <w:tr>
               <w:trPr>
                 <w:cantSplit/>
-                <w:trHeight w:val="360" w:hRule="atLeast"/>
+                <w:trHeight w:val="316" w:hRule="atLeast"/>
               </w:trPr>
               <w:tc>
                 <w:tcPr>
@@ -1692,9 +1767,9 @@
                     <w:right w:val="single" w:sz="4" w:color="C8CDC2"/>
                   </w:tcBorders>
                   <w:tcMar>
-                    <w:top w:w="30" w:type="dxa"/>
+                    <w:top w:w="20" w:type="dxa"/>
                     <w:left w:w="70" w:type="dxa"/>
-                    <w:bottom w:w="30" w:type="dxa"/>
+                    <w:bottom w:w="20" w:type="dxa"/>
                     <w:right w:w="70" w:type="dxa"/>
                   </w:tcMar>
                   <w:vAlign w:val="center"/>
@@ -1726,9 +1801,9 @@
                     <w:right w:val="single" w:sz="4" w:color="C8CDC2"/>
                   </w:tcBorders>
                   <w:tcMar>
-                    <w:top w:w="30" w:type="dxa"/>
+                    <w:top w:w="20" w:type="dxa"/>
                     <w:left w:w="70" w:type="dxa"/>
-                    <w:bottom w:w="30" w:type="dxa"/>
+                    <w:bottom w:w="20" w:type="dxa"/>
                     <w:right w:w="70" w:type="dxa"/>
                   </w:tcMar>
                   <w:vAlign w:val="center"/>
@@ -2009,6 +2084,21 @@
               <w:t>ORGANIZATION</w:t>
             </w:r>
           </w:p>
+          <w:p>
+            <w:pPr>
+              <w:spacing w:after="40" w:before="0"/>
+            </w:pPr>
+            <w:r>
+              <w:rPr>
+                <w:rFonts w:ascii="Trade Gothic Next" w:hAnsi="Trade Gothic Next"/>
+                <w:b w:val="0"/>
+                <w:color w:val="14161B"/>
+                <w:sz w:val="17"/>
+                <w:u w:val="none"/>
+              </w:rPr>
+              <w:t>Chain, level to electron</w:t>
+            </w:r>
+          </w:p>
         </w:tc>
         <w:tc>
           <w:tcPr>
@@ -2037,19 +2127,71 @@
           </w:p>
           <w:p>
             <w:pPr>
-              <w:spacing w:after="120"/>
               <w:pBdr>
-                <w:bottom w:val="single" w:sz="4" w:color="C8CDC2"/>
+                <w:left w:val="single" w:sz="18" w:space="6" w:color="A3E635"/>
               </w:pBdr>
+              <w:spacing w:after="40" w:before="0"/>
             </w:pPr>
-          </w:p>
-          <w:p>
-            <w:pPr>
-              <w:spacing w:after="120"/>
-              <w:pBdr>
-                <w:bottom w:val="single" w:sz="4" w:color="C8CDC2"/>
-              </w:pBdr>
-            </w:pPr>
+            <w:r>
+              <w:rPr>
+                <w:rFonts w:ascii="Trade Gothic Next" w:hAnsi="Trade Gothic Next"/>
+                <w:b/>
+                <w:color w:val="14161B"/>
+                <w:sz w:val="19"/>
+                <w:u w:val="none"/>
+              </w:rPr>
+              <w:t xml:space="preserve">Level → </w:t>
+            </w:r>
+            <w:r>
+              <w:rPr>
+                <w:rFonts w:ascii="Trade Gothic Next" w:hAnsi="Trade Gothic Next"/>
+                <w:b w:val="0"/>
+                <w:color w:val="14161B"/>
+                <w:sz w:val="19"/>
+                <w:u w:val="none"/>
+              </w:rPr>
+              <w:t xml:space="preserve"> __________ </w:t>
+            </w:r>
+            <w:r>
+              <w:rPr>
+                <w:rFonts w:ascii="Trade Gothic Next" w:hAnsi="Trade Gothic Next"/>
+                <w:b/>
+                <w:color w:val="14161B"/>
+                <w:sz w:val="19"/>
+                <w:u w:val="none"/>
+              </w:rPr>
+              <w:t xml:space="preserve"> → </w:t>
+            </w:r>
+            <w:r>
+              <w:rPr>
+                <w:rFonts w:ascii="Trade Gothic Next" w:hAnsi="Trade Gothic Next"/>
+                <w:b w:val="0"/>
+                <w:color w:val="14161B"/>
+                <w:sz w:val="19"/>
+                <w:u w:val="none"/>
+              </w:rPr>
+              <w:t xml:space="preserve"> _________ </w:t>
+            </w:r>
+            <w:r>
+              <w:rPr>
+                <w:rFonts w:ascii="Trade Gothic Next" w:hAnsi="Trade Gothic Next"/>
+                <w:b/>
+                <w:color w:val="14161B"/>
+                <w:sz w:val="19"/>
+                <w:u w:val="none"/>
+              </w:rPr>
+              <w:t xml:space="preserve"> → </w:t>
+            </w:r>
+            <w:r>
+              <w:rPr>
+                <w:rFonts w:ascii="Trade Gothic Next" w:hAnsi="Trade Gothic Next"/>
+                <w:b w:val="0"/>
+                <w:color w:val="14161B"/>
+                <w:sz w:val="19"/>
+                <w:u w:val="none"/>
+              </w:rPr>
+              <w:t xml:space="preserve"> ___________</w:t>
+            </w:r>
           </w:p>
         </w:tc>
       </w:tr>
@@ -2095,6 +2237,21 @@
               <w:t>ORBITAL</w:t>
             </w:r>
           </w:p>
+          <w:p>
+            <w:pPr>
+              <w:spacing w:after="40" w:before="0"/>
+            </w:pPr>
+            <w:r>
+              <w:rPr>
+                <w:rFonts w:ascii="Trade Gothic Next" w:hAnsi="Trade Gothic Next"/>
+                <w:b w:val="0"/>
+                <w:color w:val="14161B"/>
+                <w:sz w:val="17"/>
+                <w:u w:val="none"/>
+              </w:rPr>
+              <w:t>Definition — orbital</w:t>
+            </w:r>
+          </w:p>
         </w:tc>
         <w:tc>
           <w:tcPr>
@@ -2123,19 +2280,76 @@
           </w:p>
           <w:p>
             <w:pPr>
-              <w:spacing w:after="120"/>
               <w:pBdr>
-                <w:bottom w:val="single" w:sz="4" w:color="C8CDC2"/>
+                <w:left w:val="single" w:sz="18" w:space="6" w:color="A3E635"/>
               </w:pBdr>
+              <w:spacing w:after="40" w:before="0"/>
             </w:pPr>
+            <w:r>
+              <w:rPr>
+                <w:rFonts w:ascii="Trade Gothic Next" w:hAnsi="Trade Gothic Next"/>
+                <w:b/>
+                <w:color w:val="14161B"/>
+                <w:sz w:val="19"/>
+                <w:u w:val="none"/>
+              </w:rPr>
+              <w:t xml:space="preserve">An orbital is a region where an electron is </w:t>
+            </w:r>
+            <w:r>
+              <w:rPr>
+                <w:rFonts w:ascii="Trade Gothic Next" w:hAnsi="Trade Gothic Next"/>
+                <w:b w:val="0"/>
+                <w:color w:val="14161B"/>
+                <w:sz w:val="19"/>
+                <w:u w:val="none"/>
+              </w:rPr>
+              <w:t xml:space="preserve"> ________ </w:t>
+            </w:r>
+            <w:r>
+              <w:rPr>
+                <w:rFonts w:ascii="Trade Gothic Next" w:hAnsi="Trade Gothic Next"/>
+                <w:b/>
+                <w:color w:val="14161B"/>
+                <w:sz w:val="19"/>
+                <w:u w:val="none"/>
+              </w:rPr>
+              <w:t xml:space="preserve"> to be.</w:t>
+            </w:r>
           </w:p>
           <w:p>
             <w:pPr>
-              <w:spacing w:after="120"/>
-              <w:pBdr>
-                <w:bottom w:val="single" w:sz="4" w:color="C8CDC2"/>
-              </w:pBdr>
+              <w:spacing w:after="40" w:before="0"/>
             </w:pPr>
+            <w:r>
+              <w:rPr>
+                <w:rFonts w:ascii="Trade Gothic Next" w:hAnsi="Trade Gothic Next"/>
+                <w:b w:val="0"/>
+                <w:color w:val="14161B"/>
+                <w:sz w:val="19"/>
+                <w:u w:val="none"/>
+              </w:rPr>
+              <w:t xml:space="preserve">Each orbital holds up to </w:t>
+            </w:r>
+            <w:r>
+              <w:rPr>
+                <w:rFonts w:ascii="Trade Gothic Next" w:hAnsi="Trade Gothic Next"/>
+                <w:b w:val="0"/>
+                <w:color w:val="14161B"/>
+                <w:sz w:val="19"/>
+                <w:u w:val="none"/>
+              </w:rPr>
+              <w:t xml:space="preserve"> ______ </w:t>
+            </w:r>
+            <w:r>
+              <w:rPr>
+                <w:rFonts w:ascii="Trade Gothic Next" w:hAnsi="Trade Gothic Next"/>
+                <w:b w:val="0"/>
+                <w:color w:val="14161B"/>
+                <w:sz w:val="19"/>
+                <w:u w:val="none"/>
+              </w:rPr>
+              <w:t xml:space="preserve"> electrons.</w:t>
+            </w:r>
           </w:p>
         </w:tc>
       </w:tr>
@@ -2320,7 +2534,7 @@
             <w:tr>
               <w:trPr>
                 <w:cantSplit/>
-                <w:trHeight w:val="360" w:hRule="atLeast"/>
+                <w:trHeight w:val="316" w:hRule="atLeast"/>
               </w:trPr>
               <w:tc>
                 <w:tcPr>
@@ -2332,9 +2546,9 @@
                     <w:right w:val="single" w:sz="4" w:color="C8CDC2"/>
                   </w:tcBorders>
                   <w:tcMar>
-                    <w:top w:w="30" w:type="dxa"/>
+                    <w:top w:w="20" w:type="dxa"/>
                     <w:left w:w="70" w:type="dxa"/>
-                    <w:bottom w:w="30" w:type="dxa"/>
+                    <w:bottom w:w="20" w:type="dxa"/>
                     <w:right w:w="70" w:type="dxa"/>
                   </w:tcMar>
                   <w:vAlign w:val="center"/>
@@ -2366,9 +2580,9 @@
                     <w:right w:val="single" w:sz="4" w:color="C8CDC2"/>
                   </w:tcBorders>
                   <w:tcMar>
-                    <w:top w:w="30" w:type="dxa"/>
+                    <w:top w:w="20" w:type="dxa"/>
                     <w:left w:w="70" w:type="dxa"/>
-                    <w:bottom w:w="30" w:type="dxa"/>
+                    <w:bottom w:w="20" w:type="dxa"/>
                     <w:right w:w="70" w:type="dxa"/>
                   </w:tcMar>
                   <w:vAlign w:val="center"/>
@@ -2390,9 +2604,9 @@
                     <w:right w:val="single" w:sz="4" w:color="C8CDC2"/>
                   </w:tcBorders>
                   <w:tcMar>
-                    <w:top w:w="30" w:type="dxa"/>
+                    <w:top w:w="20" w:type="dxa"/>
                     <w:left w:w="70" w:type="dxa"/>
-                    <w:bottom w:w="30" w:type="dxa"/>
+                    <w:bottom w:w="20" w:type="dxa"/>
                     <w:right w:w="70" w:type="dxa"/>
                   </w:tcMar>
                   <w:vAlign w:val="center"/>
@@ -2408,7 +2622,7 @@
             <w:tr>
               <w:trPr>
                 <w:cantSplit/>
-                <w:trHeight w:val="360" w:hRule="atLeast"/>
+                <w:trHeight w:val="316" w:hRule="atLeast"/>
               </w:trPr>
               <w:tc>
                 <w:tcPr>
@@ -2420,9 +2634,9 @@
                     <w:right w:val="single" w:sz="4" w:color="C8CDC2"/>
                   </w:tcBorders>
                   <w:tcMar>
-                    <w:top w:w="30" w:type="dxa"/>
+                    <w:top w:w="20" w:type="dxa"/>
                     <w:left w:w="70" w:type="dxa"/>
-                    <w:bottom w:w="30" w:type="dxa"/>
+                    <w:bottom w:w="20" w:type="dxa"/>
                     <w:right w:w="70" w:type="dxa"/>
                   </w:tcMar>
                   <w:vAlign w:val="center"/>
@@ -2454,9 +2668,9 @@
                     <w:right w:val="single" w:sz="4" w:color="C8CDC2"/>
                   </w:tcBorders>
                   <w:tcMar>
-                    <w:top w:w="30" w:type="dxa"/>
+                    <w:top w:w="20" w:type="dxa"/>
                     <w:left w:w="70" w:type="dxa"/>
-                    <w:bottom w:w="30" w:type="dxa"/>
+                    <w:bottom w:w="20" w:type="dxa"/>
                     <w:right w:w="70" w:type="dxa"/>
                   </w:tcMar>
                   <w:vAlign w:val="center"/>
@@ -2478,9 +2692,9 @@
                     <w:right w:val="single" w:sz="4" w:color="C8CDC2"/>
                   </w:tcBorders>
                   <w:tcMar>
-                    <w:top w:w="30" w:type="dxa"/>
+                    <w:top w:w="20" w:type="dxa"/>
                     <w:left w:w="70" w:type="dxa"/>
-                    <w:bottom w:w="30" w:type="dxa"/>
+                    <w:bottom w:w="20" w:type="dxa"/>
                     <w:right w:w="70" w:type="dxa"/>
                   </w:tcMar>
                   <w:vAlign w:val="center"/>
@@ -2496,7 +2710,7 @@
             <w:tr>
               <w:trPr>
                 <w:cantSplit/>
-                <w:trHeight w:val="360" w:hRule="atLeast"/>
+                <w:trHeight w:val="316" w:hRule="atLeast"/>
               </w:trPr>
               <w:tc>
                 <w:tcPr>
@@ -2508,9 +2722,9 @@
                     <w:right w:val="single" w:sz="4" w:color="C8CDC2"/>
                   </w:tcBorders>
                   <w:tcMar>
-                    <w:top w:w="30" w:type="dxa"/>
+                    <w:top w:w="20" w:type="dxa"/>
                     <w:left w:w="70" w:type="dxa"/>
-                    <w:bottom w:w="30" w:type="dxa"/>
+                    <w:bottom w:w="20" w:type="dxa"/>
                     <w:right w:w="70" w:type="dxa"/>
                   </w:tcMar>
                   <w:vAlign w:val="center"/>
@@ -2542,9 +2756,9 @@
                     <w:right w:val="single" w:sz="4" w:color="C8CDC2"/>
                   </w:tcBorders>
                   <w:tcMar>
-                    <w:top w:w="30" w:type="dxa"/>
+                    <w:top w:w="20" w:type="dxa"/>
                     <w:left w:w="70" w:type="dxa"/>
-                    <w:bottom w:w="30" w:type="dxa"/>
+                    <w:bottom w:w="20" w:type="dxa"/>
                     <w:right w:w="70" w:type="dxa"/>
                   </w:tcMar>
                   <w:vAlign w:val="center"/>
@@ -2566,9 +2780,9 @@
                     <w:right w:val="single" w:sz="4" w:color="C8CDC2"/>
                   </w:tcBorders>
                   <w:tcMar>
-                    <w:top w:w="30" w:type="dxa"/>
+                    <w:top w:w="20" w:type="dxa"/>
                     <w:left w:w="70" w:type="dxa"/>
-                    <w:bottom w:w="30" w:type="dxa"/>
+                    <w:bottom w:w="20" w:type="dxa"/>
                     <w:right w:w="70" w:type="dxa"/>
                   </w:tcMar>
                   <w:vAlign w:val="center"/>
@@ -2584,7 +2798,7 @@
             <w:tr>
               <w:trPr>
                 <w:cantSplit/>
-                <w:trHeight w:val="360" w:hRule="atLeast"/>
+                <w:trHeight w:val="316" w:hRule="atLeast"/>
               </w:trPr>
               <w:tc>
                 <w:tcPr>
@@ -2596,9 +2810,9 @@
                     <w:right w:val="single" w:sz="4" w:color="C8CDC2"/>
                   </w:tcBorders>
                   <w:tcMar>
-                    <w:top w:w="30" w:type="dxa"/>
+                    <w:top w:w="20" w:type="dxa"/>
                     <w:left w:w="70" w:type="dxa"/>
-                    <w:bottom w:w="30" w:type="dxa"/>
+                    <w:bottom w:w="20" w:type="dxa"/>
                     <w:right w:w="70" w:type="dxa"/>
                   </w:tcMar>
                   <w:vAlign w:val="center"/>
@@ -2630,9 +2844,9 @@
                     <w:right w:val="single" w:sz="4" w:color="C8CDC2"/>
                   </w:tcBorders>
                   <w:tcMar>
-                    <w:top w:w="30" w:type="dxa"/>
+                    <w:top w:w="20" w:type="dxa"/>
                     <w:left w:w="70" w:type="dxa"/>
-                    <w:bottom w:w="30" w:type="dxa"/>
+                    <w:bottom w:w="20" w:type="dxa"/>
                     <w:right w:w="70" w:type="dxa"/>
                   </w:tcMar>
                   <w:vAlign w:val="center"/>
@@ -2654,9 +2868,9 @@
                     <w:right w:val="single" w:sz="4" w:color="C8CDC2"/>
                   </w:tcBorders>
                   <w:tcMar>
-                    <w:top w:w="30" w:type="dxa"/>
+                    <w:top w:w="20" w:type="dxa"/>
                     <w:left w:w="70" w:type="dxa"/>
-                    <w:bottom w:w="30" w:type="dxa"/>
+                    <w:bottom w:w="20" w:type="dxa"/>
                     <w:right w:w="70" w:type="dxa"/>
                   </w:tcMar>
                   <w:vAlign w:val="center"/>
@@ -2726,6 +2940,21 @@
               <w:t>ELECTRON CAPACITY</w:t>
             </w:r>
           </w:p>
+          <w:p>
+            <w:pPr>
+              <w:spacing w:after="40" w:before="0"/>
+            </w:pPr>
+            <w:r>
+              <w:rPr>
+                <w:rFonts w:ascii="Trade Gothic Next" w:hAnsi="Trade Gothic Next"/>
+                <w:b w:val="0"/>
+                <w:color w:val="14161B"/>
+                <w:sz w:val="17"/>
+                <w:u w:val="none"/>
+              </w:rPr>
+              <w:t>Whole-level formulas</w:t>
+            </w:r>
+          </w:p>
         </w:tc>
         <w:tc>
           <w:tcPr>
@@ -2754,11 +2983,58 @@
           </w:p>
           <w:p>
             <w:pPr>
-              <w:spacing w:after="120"/>
-              <w:pBdr>
-                <w:bottom w:val="single" w:sz="4" w:color="C8CDC2"/>
-              </w:pBdr>
+              <w:spacing w:after="40" w:before="0"/>
             </w:pPr>
+            <w:r>
+              <w:rPr>
+                <w:rFonts w:ascii="Trade Gothic Next" w:hAnsi="Trade Gothic Next"/>
+                <w:b w:val="0"/>
+                <w:color w:val="14161B"/>
+                <w:sz w:val="19"/>
+                <w:u w:val="none"/>
+              </w:rPr>
+              <w:t xml:space="preserve">A whole level has </w:t>
+            </w:r>
+            <w:r>
+              <w:rPr>
+                <w:rFonts w:ascii="Trade Gothic Next" w:hAnsi="Trade Gothic Next"/>
+                <w:b w:val="0"/>
+                <w:color w:val="14161B"/>
+                <w:sz w:val="19"/>
+                <w:u w:val="none"/>
+              </w:rPr>
+              <w:t xml:space="preserve"> ______ </w:t>
+            </w:r>
+            <w:r>
+              <w:rPr>
+                <w:rFonts w:ascii="Trade Gothic Next" w:hAnsi="Trade Gothic Next"/>
+                <w:b w:val="0"/>
+                <w:color w:val="14161B"/>
+                <w:sz w:val="19"/>
+                <w:u w:val="none"/>
+              </w:rPr>
+              <w:t xml:space="preserve"> orbitals and holds up to </w:t>
+            </w:r>
+            <w:r>
+              <w:rPr>
+                <w:rFonts w:ascii="Trade Gothic Next" w:hAnsi="Trade Gothic Next"/>
+                <w:b w:val="0"/>
+                <w:color w:val="14161B"/>
+                <w:sz w:val="19"/>
+                <w:u w:val="none"/>
+              </w:rPr>
+              <w:t xml:space="preserve"> ______ </w:t>
+            </w:r>
+            <w:r>
+              <w:rPr>
+                <w:rFonts w:ascii="Trade Gothic Next" w:hAnsi="Trade Gothic Next"/>
+                <w:b w:val="0"/>
+                <w:color w:val="14161B"/>
+                <w:sz w:val="19"/>
+                <w:u w:val="none"/>
+              </w:rPr>
+              <w:t xml:space="preserve"> electrons.</w:t>
+            </w:r>
           </w:p>
           <w:tbl>
             <w:tblPr>
@@ -2873,7 +3149,7 @@
             <w:tr>
               <w:trPr>
                 <w:cantSplit/>
-                <w:trHeight w:val="360" w:hRule="atLeast"/>
+                <w:trHeight w:val="316" w:hRule="atLeast"/>
               </w:trPr>
               <w:tc>
                 <w:tcPr>
@@ -2885,9 +3161,9 @@
                     <w:right w:val="single" w:sz="4" w:color="C8CDC2"/>
                   </w:tcBorders>
                   <w:tcMar>
-                    <w:top w:w="30" w:type="dxa"/>
+                    <w:top w:w="20" w:type="dxa"/>
                     <w:left w:w="70" w:type="dxa"/>
-                    <w:bottom w:w="30" w:type="dxa"/>
+                    <w:bottom w:w="20" w:type="dxa"/>
                     <w:right w:w="70" w:type="dxa"/>
                   </w:tcMar>
                   <w:vAlign w:val="center"/>
@@ -2919,9 +3195,9 @@
                     <w:right w:val="single" w:sz="4" w:color="C8CDC2"/>
                   </w:tcBorders>
                   <w:tcMar>
-                    <w:top w:w="30" w:type="dxa"/>
+                    <w:top w:w="20" w:type="dxa"/>
                     <w:left w:w="70" w:type="dxa"/>
-                    <w:bottom w:w="30" w:type="dxa"/>
+                    <w:bottom w:w="20" w:type="dxa"/>
                     <w:right w:w="70" w:type="dxa"/>
                   </w:tcMar>
                   <w:vAlign w:val="center"/>
@@ -2943,9 +3219,9 @@
                     <w:right w:val="single" w:sz="4" w:color="C8CDC2"/>
                   </w:tcBorders>
                   <w:tcMar>
-                    <w:top w:w="30" w:type="dxa"/>
+                    <w:top w:w="20" w:type="dxa"/>
                     <w:left w:w="70" w:type="dxa"/>
-                    <w:bottom w:w="30" w:type="dxa"/>
+                    <w:bottom w:w="20" w:type="dxa"/>
                     <w:right w:w="70" w:type="dxa"/>
                   </w:tcMar>
                   <w:vAlign w:val="center"/>
@@ -2961,7 +3237,7 @@
             <w:tr>
               <w:trPr>
                 <w:cantSplit/>
-                <w:trHeight w:val="360" w:hRule="atLeast"/>
+                <w:trHeight w:val="316" w:hRule="atLeast"/>
               </w:trPr>
               <w:tc>
                 <w:tcPr>
@@ -2973,9 +3249,9 @@
                     <w:right w:val="single" w:sz="4" w:color="C8CDC2"/>
                   </w:tcBorders>
                   <w:tcMar>
-                    <w:top w:w="30" w:type="dxa"/>
+                    <w:top w:w="20" w:type="dxa"/>
                     <w:left w:w="70" w:type="dxa"/>
-                    <w:bottom w:w="30" w:type="dxa"/>
+                    <w:bottom w:w="20" w:type="dxa"/>
                     <w:right w:w="70" w:type="dxa"/>
                   </w:tcMar>
                   <w:vAlign w:val="center"/>
@@ -3007,9 +3283,9 @@
                     <w:right w:val="single" w:sz="4" w:color="C8CDC2"/>
                   </w:tcBorders>
                   <w:tcMar>
-                    <w:top w:w="30" w:type="dxa"/>
+                    <w:top w:w="20" w:type="dxa"/>
                     <w:left w:w="70" w:type="dxa"/>
-                    <w:bottom w:w="30" w:type="dxa"/>
+                    <w:bottom w:w="20" w:type="dxa"/>
                     <w:right w:w="70" w:type="dxa"/>
                   </w:tcMar>
                   <w:vAlign w:val="center"/>
@@ -3031,9 +3307,9 @@
                     <w:right w:val="single" w:sz="4" w:color="C8CDC2"/>
                   </w:tcBorders>
                   <w:tcMar>
-                    <w:top w:w="30" w:type="dxa"/>
+                    <w:top w:w="20" w:type="dxa"/>
                     <w:left w:w="70" w:type="dxa"/>
-                    <w:bottom w:w="30" w:type="dxa"/>
+                    <w:bottom w:w="20" w:type="dxa"/>
                     <w:right w:w="70" w:type="dxa"/>
                   </w:tcMar>
                   <w:vAlign w:val="center"/>
@@ -3049,7 +3325,7 @@
             <w:tr>
               <w:trPr>
                 <w:cantSplit/>
-                <w:trHeight w:val="360" w:hRule="atLeast"/>
+                <w:trHeight w:val="316" w:hRule="atLeast"/>
               </w:trPr>
               <w:tc>
                 <w:tcPr>
@@ -3061,9 +3337,9 @@
                     <w:right w:val="single" w:sz="4" w:color="C8CDC2"/>
                   </w:tcBorders>
                   <w:tcMar>
-                    <w:top w:w="30" w:type="dxa"/>
+                    <w:top w:w="20" w:type="dxa"/>
                     <w:left w:w="70" w:type="dxa"/>
-                    <w:bottom w:w="30" w:type="dxa"/>
+                    <w:bottom w:w="20" w:type="dxa"/>
                     <w:right w:w="70" w:type="dxa"/>
                   </w:tcMar>
                   <w:vAlign w:val="center"/>
@@ -3095,9 +3371,9 @@
                     <w:right w:val="single" w:sz="4" w:color="C8CDC2"/>
                   </w:tcBorders>
                   <w:tcMar>
-                    <w:top w:w="30" w:type="dxa"/>
+                    <w:top w:w="20" w:type="dxa"/>
                     <w:left w:w="70" w:type="dxa"/>
-                    <w:bottom w:w="30" w:type="dxa"/>
+                    <w:bottom w:w="20" w:type="dxa"/>
                     <w:right w:w="70" w:type="dxa"/>
                   </w:tcMar>
                   <w:vAlign w:val="center"/>
@@ -3119,9 +3395,9 @@
                     <w:right w:val="single" w:sz="4" w:color="C8CDC2"/>
                   </w:tcBorders>
                   <w:tcMar>
-                    <w:top w:w="30" w:type="dxa"/>
+                    <w:top w:w="20" w:type="dxa"/>
                     <w:left w:w="70" w:type="dxa"/>
-                    <w:bottom w:w="30" w:type="dxa"/>
+                    <w:bottom w:w="20" w:type="dxa"/>
                     <w:right w:w="70" w:type="dxa"/>
                   </w:tcMar>
                   <w:vAlign w:val="center"/>
@@ -3137,7 +3413,7 @@
             <w:tr>
               <w:trPr>
                 <w:cantSplit/>
-                <w:trHeight w:val="360" w:hRule="atLeast"/>
+                <w:trHeight w:val="316" w:hRule="atLeast"/>
               </w:trPr>
               <w:tc>
                 <w:tcPr>
@@ -3149,9 +3425,9 @@
                     <w:right w:val="single" w:sz="4" w:color="C8CDC2"/>
                   </w:tcBorders>
                   <w:tcMar>
-                    <w:top w:w="30" w:type="dxa"/>
+                    <w:top w:w="20" w:type="dxa"/>
                     <w:left w:w="70" w:type="dxa"/>
-                    <w:bottom w:w="30" w:type="dxa"/>
+                    <w:bottom w:w="20" w:type="dxa"/>
                     <w:right w:w="70" w:type="dxa"/>
                   </w:tcMar>
                   <w:vAlign w:val="center"/>
@@ -3183,9 +3459,9 @@
                     <w:right w:val="single" w:sz="4" w:color="C8CDC2"/>
                   </w:tcBorders>
                   <w:tcMar>
-                    <w:top w:w="30" w:type="dxa"/>
+                    <w:top w:w="20" w:type="dxa"/>
                     <w:left w:w="70" w:type="dxa"/>
-                    <w:bottom w:w="30" w:type="dxa"/>
+                    <w:bottom w:w="20" w:type="dxa"/>
                     <w:right w:w="70" w:type="dxa"/>
                   </w:tcMar>
                   <w:vAlign w:val="center"/>
@@ -3207,9 +3483,9 @@
                     <w:right w:val="single" w:sz="4" w:color="C8CDC2"/>
                   </w:tcBorders>
                   <w:tcMar>
-                    <w:top w:w="30" w:type="dxa"/>
+                    <w:top w:w="20" w:type="dxa"/>
                     <w:left w:w="70" w:type="dxa"/>
-                    <w:bottom w:w="30" w:type="dxa"/>
+                    <w:bottom w:w="20" w:type="dxa"/>
                     <w:right w:w="70" w:type="dxa"/>
                   </w:tcMar>
                   <w:vAlign w:val="center"/>
@@ -3402,7 +3678,7 @@
             <w:tr>
               <w:trPr>
                 <w:cantSplit/>
-                <w:trHeight w:val="360" w:hRule="atLeast"/>
+                <w:trHeight w:val="316" w:hRule="atLeast"/>
               </w:trPr>
               <w:tc>
                 <w:tcPr>
@@ -3414,9 +3690,9 @@
                     <w:right w:val="single" w:sz="4" w:color="C8CDC2"/>
                   </w:tcBorders>
                   <w:tcMar>
-                    <w:top w:w="30" w:type="dxa"/>
+                    <w:top w:w="20" w:type="dxa"/>
                     <w:left w:w="70" w:type="dxa"/>
-                    <w:bottom w:w="30" w:type="dxa"/>
+                    <w:bottom w:w="20" w:type="dxa"/>
                     <w:right w:w="70" w:type="dxa"/>
                   </w:tcMar>
                   <w:vAlign w:val="center"/>
@@ -3448,9 +3724,9 @@
                     <w:right w:val="single" w:sz="4" w:color="C8CDC2"/>
                   </w:tcBorders>
                   <w:tcMar>
-                    <w:top w:w="30" w:type="dxa"/>
+                    <w:top w:w="20" w:type="dxa"/>
                     <w:left w:w="70" w:type="dxa"/>
-                    <w:bottom w:w="30" w:type="dxa"/>
+                    <w:bottom w:w="20" w:type="dxa"/>
                     <w:right w:w="70" w:type="dxa"/>
                   </w:tcMar>
                   <w:vAlign w:val="center"/>
@@ -3466,7 +3742,7 @@
             <w:tr>
               <w:trPr>
                 <w:cantSplit/>
-                <w:trHeight w:val="360" w:hRule="atLeast"/>
+                <w:trHeight w:val="316" w:hRule="atLeast"/>
               </w:trPr>
               <w:tc>
                 <w:tcPr>
@@ -3478,9 +3754,9 @@
                     <w:right w:val="single" w:sz="4" w:color="C8CDC2"/>
                   </w:tcBorders>
                   <w:tcMar>
-                    <w:top w:w="30" w:type="dxa"/>
+                    <w:top w:w="20" w:type="dxa"/>
                     <w:left w:w="70" w:type="dxa"/>
-                    <w:bottom w:w="30" w:type="dxa"/>
+                    <w:bottom w:w="20" w:type="dxa"/>
                     <w:right w:w="70" w:type="dxa"/>
                   </w:tcMar>
                   <w:vAlign w:val="center"/>
@@ -3512,9 +3788,9 @@
                     <w:right w:val="single" w:sz="4" w:color="C8CDC2"/>
                   </w:tcBorders>
                   <w:tcMar>
-                    <w:top w:w="30" w:type="dxa"/>
+                    <w:top w:w="20" w:type="dxa"/>
                     <w:left w:w="70" w:type="dxa"/>
-                    <w:bottom w:w="30" w:type="dxa"/>
+                    <w:bottom w:w="20" w:type="dxa"/>
                     <w:right w:w="70" w:type="dxa"/>
                   </w:tcMar>
                   <w:vAlign w:val="center"/>
@@ -3530,7 +3806,7 @@
             <w:tr>
               <w:trPr>
                 <w:cantSplit/>
-                <w:trHeight w:val="360" w:hRule="atLeast"/>
+                <w:trHeight w:val="316" w:hRule="atLeast"/>
               </w:trPr>
               <w:tc>
                 <w:tcPr>
@@ -3542,9 +3818,9 @@
                     <w:right w:val="single" w:sz="4" w:color="C8CDC2"/>
                   </w:tcBorders>
                   <w:tcMar>
-                    <w:top w:w="30" w:type="dxa"/>
+                    <w:top w:w="20" w:type="dxa"/>
                     <w:left w:w="70" w:type="dxa"/>
-                    <w:bottom w:w="30" w:type="dxa"/>
+                    <w:bottom w:w="20" w:type="dxa"/>
                     <w:right w:w="70" w:type="dxa"/>
                   </w:tcMar>
                   <w:vAlign w:val="center"/>
@@ -3576,9 +3852,9 @@
                     <w:right w:val="single" w:sz="4" w:color="C8CDC2"/>
                   </w:tcBorders>
                   <w:tcMar>
-                    <w:top w:w="30" w:type="dxa"/>
+                    <w:top w:w="20" w:type="dxa"/>
                     <w:left w:w="70" w:type="dxa"/>
-                    <w:bottom w:w="30" w:type="dxa"/>
+                    <w:bottom w:w="20" w:type="dxa"/>
                     <w:right w:w="70" w:type="dxa"/>
                   </w:tcMar>
                   <w:vAlign w:val="center"/>
@@ -3594,7 +3870,7 @@
             <w:tr>
               <w:trPr>
                 <w:cantSplit/>
-                <w:trHeight w:val="360" w:hRule="atLeast"/>
+                <w:trHeight w:val="316" w:hRule="atLeast"/>
               </w:trPr>
               <w:tc>
                 <w:tcPr>
@@ -3606,9 +3882,9 @@
                     <w:right w:val="single" w:sz="4" w:color="C8CDC2"/>
                   </w:tcBorders>
                   <w:tcMar>
-                    <w:top w:w="30" w:type="dxa"/>
+                    <w:top w:w="20" w:type="dxa"/>
                     <w:left w:w="70" w:type="dxa"/>
-                    <w:bottom w:w="30" w:type="dxa"/>
+                    <w:bottom w:w="20" w:type="dxa"/>
                     <w:right w:w="70" w:type="dxa"/>
                   </w:tcMar>
                   <w:vAlign w:val="center"/>
@@ -3640,9 +3916,9 @@
                     <w:right w:val="single" w:sz="4" w:color="C8CDC2"/>
                   </w:tcBorders>
                   <w:tcMar>
-                    <w:top w:w="30" w:type="dxa"/>
+                    <w:top w:w="20" w:type="dxa"/>
                     <w:left w:w="70" w:type="dxa"/>
-                    <w:bottom w:w="30" w:type="dxa"/>
+                    <w:bottom w:w="20" w:type="dxa"/>
                     <w:right w:w="70" w:type="dxa"/>
                   </w:tcMar>
                   <w:vAlign w:val="center"/>
@@ -3710,6 +3986,21 @@
                 <w:sz w:val="14"/>
               </w:rPr>
               <w:t>WORKED CHECKS</w:t>
+            </w:r>
+          </w:p>
+          <w:p>
+            <w:pPr>
+              <w:spacing w:after="40" w:before="0"/>
+            </w:pPr>
+            <w:r>
+              <w:rPr>
+                <w:rFonts w:ascii="Trade Gothic Next" w:hAnsi="Trade Gothic Next"/>
+                <w:b w:val="0"/>
+                <w:color w:val="14161B"/>
+                <w:sz w:val="17"/>
+                <w:u w:val="none"/>
+              </w:rPr>
+              <w:t>Worked examples</w:t>
             </w:r>
           </w:p>
         </w:tc>
@@ -4048,6 +4339,21 @@
               <w:t>CONFIGURATION</w:t>
             </w:r>
           </w:p>
+          <w:p>
+            <w:pPr>
+              <w:spacing w:after="40" w:before="0"/>
+            </w:pPr>
+            <w:r>
+              <w:rPr>
+                <w:rFonts w:ascii="Trade Gothic Next" w:hAnsi="Trade Gothic Next"/>
+                <w:b w:val="0"/>
+                <w:color w:val="14161B"/>
+                <w:sz w:val="17"/>
+                <w:u w:val="none"/>
+              </w:rPr>
+              <w:t>Definition — configuration</w:t>
+            </w:r>
+          </w:p>
         </w:tc>
         <w:tc>
           <w:tcPr>
@@ -4076,19 +4382,116 @@
           </w:p>
           <w:p>
             <w:pPr>
-              <w:spacing w:after="120"/>
               <w:pBdr>
-                <w:bottom w:val="single" w:sz="4" w:color="C8CDC2"/>
+                <w:left w:val="single" w:sz="18" w:space="6" w:color="A3E635"/>
               </w:pBdr>
+              <w:spacing w:after="40" w:before="0"/>
             </w:pPr>
+            <w:r>
+              <w:rPr>
+                <w:rFonts w:ascii="Trade Gothic Next" w:hAnsi="Trade Gothic Next"/>
+                <w:b/>
+                <w:color w:val="14161B"/>
+                <w:sz w:val="19"/>
+                <w:u w:val="none"/>
+              </w:rPr>
+              <w:t xml:space="preserve">An electron configuration shows </w:t>
+            </w:r>
+            <w:r>
+              <w:rPr>
+                <w:rFonts w:ascii="Trade Gothic Next" w:hAnsi="Trade Gothic Next"/>
+                <w:b w:val="0"/>
+                <w:color w:val="14161B"/>
+                <w:sz w:val="19"/>
+                <w:u w:val="none"/>
+              </w:rPr>
+              <w:t xml:space="preserve"> _________________________</w:t>
+            </w:r>
+            <w:r>
+              <w:rPr>
+                <w:rFonts w:ascii="Trade Gothic Next" w:hAnsi="Trade Gothic Next"/>
+                <w:b/>
+                <w:color w:val="14161B"/>
+                <w:sz w:val="19"/>
+                <w:u w:val="none"/>
+              </w:rPr>
+              <w:t>.</w:t>
+            </w:r>
           </w:p>
           <w:p>
             <w:pPr>
-              <w:spacing w:after="120"/>
-              <w:pBdr>
-                <w:bottom w:val="single" w:sz="4" w:color="C8CDC2"/>
-              </w:pBdr>
+              <w:spacing w:after="40" w:before="0"/>
             </w:pPr>
+            <w:r>
+              <w:rPr>
+                <w:rFonts w:ascii="Trade Gothic Next" w:hAnsi="Trade Gothic Next"/>
+                <w:b w:val="0"/>
+                <w:color w:val="14161B"/>
+                <w:sz w:val="19"/>
+                <w:u w:val="none"/>
+              </w:rPr>
+              <w:t xml:space="preserve">The three rules: </w:t>
+            </w:r>
+            <w:r>
+              <w:rPr>
+                <w:rFonts w:ascii="Trade Gothic Next" w:hAnsi="Trade Gothic Next"/>
+                <w:b w:val="0"/>
+                <w:color w:val="14161B"/>
+                <w:sz w:val="19"/>
+                <w:u w:val="none"/>
+              </w:rPr>
+              <w:t xml:space="preserve"> ________</w:t>
+            </w:r>
+            <w:r>
+              <w:rPr>
+                <w:rFonts w:ascii="Trade Gothic Next" w:hAnsi="Trade Gothic Next"/>
+                <w:b w:val="0"/>
+                <w:color w:val="14161B"/>
+                <w:sz w:val="19"/>
+                <w:u w:val="none"/>
+              </w:rPr>
+              <w:t xml:space="preserve">, </w:t>
+            </w:r>
+            <w:r>
+              <w:rPr>
+                <w:rFonts w:ascii="Trade Gothic Next" w:hAnsi="Trade Gothic Next"/>
+                <w:b w:val="0"/>
+                <w:color w:val="14161B"/>
+                <w:sz w:val="19"/>
+                <w:u w:val="none"/>
+              </w:rPr>
+              <w:t xml:space="preserve"> _______</w:t>
+            </w:r>
+            <w:r>
+              <w:rPr>
+                <w:rFonts w:ascii="Trade Gothic Next" w:hAnsi="Trade Gothic Next"/>
+                <w:b w:val="0"/>
+                <w:color w:val="14161B"/>
+                <w:sz w:val="19"/>
+                <w:u w:val="none"/>
+              </w:rPr>
+              <w:t xml:space="preserve">, </w:t>
+            </w:r>
+            <w:r>
+              <w:rPr>
+                <w:rFonts w:ascii="Trade Gothic Next" w:hAnsi="Trade Gothic Next"/>
+                <w:b w:val="0"/>
+                <w:color w:val="14161B"/>
+                <w:sz w:val="19"/>
+                <w:u w:val="none"/>
+              </w:rPr>
+              <w:t xml:space="preserve"> ______</w:t>
+            </w:r>
+            <w:r>
+              <w:rPr>
+                <w:rFonts w:ascii="Trade Gothic Next" w:hAnsi="Trade Gothic Next"/>
+                <w:b w:val="0"/>
+                <w:color w:val="14161B"/>
+                <w:sz w:val="19"/>
+                <w:u w:val="none"/>
+              </w:rPr>
+              <w:t>.</w:t>
+            </w:r>
           </w:p>
         </w:tc>
       </w:tr>
@@ -4162,11 +4565,38 @@
           </w:p>
           <w:p>
             <w:pPr>
-              <w:spacing w:after="120"/>
-              <w:pBdr>
-                <w:bottom w:val="single" w:sz="4" w:color="C8CDC2"/>
-              </w:pBdr>
+              <w:spacing w:after="40" w:before="0"/>
             </w:pPr>
+            <w:r>
+              <w:rPr>
+                <w:rFonts w:ascii="Trade Gothic Next" w:hAnsi="Trade Gothic Next"/>
+                <w:b w:val="0"/>
+                <w:color w:val="14161B"/>
+                <w:sz w:val="19"/>
+                <w:u w:val="none"/>
+              </w:rPr>
+              <w:t xml:space="preserve">For a neutral atom, the raised numbers add to the </w:t>
+            </w:r>
+            <w:r>
+              <w:rPr>
+                <w:rFonts w:ascii="Trade Gothic Next" w:hAnsi="Trade Gothic Next"/>
+                <w:b w:val="0"/>
+                <w:color w:val="14161B"/>
+                <w:sz w:val="19"/>
+                <w:u w:val="none"/>
+              </w:rPr>
+              <w:t xml:space="preserve"> _______________</w:t>
+            </w:r>
+            <w:r>
+              <w:rPr>
+                <w:rFonts w:ascii="Trade Gothic Next" w:hAnsi="Trade Gothic Next"/>
+                <w:b w:val="0"/>
+                <w:color w:val="14161B"/>
+                <w:sz w:val="19"/>
+                <w:u w:val="none"/>
+              </w:rPr>
+              <w:t>.</w:t>
+            </w:r>
           </w:p>
           <w:tbl>
             <w:tblPr>
@@ -4249,7 +4679,7 @@
             <w:tr>
               <w:trPr>
                 <w:cantSplit/>
-                <w:trHeight w:val="360" w:hRule="atLeast"/>
+                <w:trHeight w:val="316" w:hRule="atLeast"/>
               </w:trPr>
               <w:tc>
                 <w:tcPr>
@@ -4261,9 +4691,9 @@
                     <w:right w:val="single" w:sz="4" w:color="C8CDC2"/>
                   </w:tcBorders>
                   <w:tcMar>
-                    <w:top w:w="30" w:type="dxa"/>
+                    <w:top w:w="20" w:type="dxa"/>
                     <w:left w:w="70" w:type="dxa"/>
-                    <w:bottom w:w="30" w:type="dxa"/>
+                    <w:bottom w:w="20" w:type="dxa"/>
                     <w:right w:w="70" w:type="dxa"/>
                   </w:tcMar>
                   <w:vAlign w:val="center"/>
@@ -4295,9 +4725,9 @@
                     <w:right w:val="single" w:sz="4" w:color="C8CDC2"/>
                   </w:tcBorders>
                   <w:tcMar>
-                    <w:top w:w="30" w:type="dxa"/>
+                    <w:top w:w="20" w:type="dxa"/>
                     <w:left w:w="70" w:type="dxa"/>
-                    <w:bottom w:w="30" w:type="dxa"/>
+                    <w:bottom w:w="20" w:type="dxa"/>
                     <w:right w:w="70" w:type="dxa"/>
                   </w:tcMar>
                   <w:vAlign w:val="center"/>
@@ -4313,7 +4743,7 @@
             <w:tr>
               <w:trPr>
                 <w:cantSplit/>
-                <w:trHeight w:val="360" w:hRule="atLeast"/>
+                <w:trHeight w:val="316" w:hRule="atLeast"/>
               </w:trPr>
               <w:tc>
                 <w:tcPr>
@@ -4325,9 +4755,9 @@
                     <w:right w:val="single" w:sz="4" w:color="C8CDC2"/>
                   </w:tcBorders>
                   <w:tcMar>
-                    <w:top w:w="30" w:type="dxa"/>
+                    <w:top w:w="20" w:type="dxa"/>
                     <w:left w:w="70" w:type="dxa"/>
-                    <w:bottom w:w="30" w:type="dxa"/>
+                    <w:bottom w:w="20" w:type="dxa"/>
                     <w:right w:w="70" w:type="dxa"/>
                   </w:tcMar>
                   <w:vAlign w:val="center"/>
@@ -4359,9 +4789,9 @@
                     <w:right w:val="single" w:sz="4" w:color="C8CDC2"/>
                   </w:tcBorders>
                   <w:tcMar>
-                    <w:top w:w="30" w:type="dxa"/>
+                    <w:top w:w="20" w:type="dxa"/>
                     <w:left w:w="70" w:type="dxa"/>
-                    <w:bottom w:w="30" w:type="dxa"/>
+                    <w:bottom w:w="20" w:type="dxa"/>
                     <w:right w:w="70" w:type="dxa"/>
                   </w:tcMar>
                   <w:vAlign w:val="center"/>
@@ -4377,7 +4807,7 @@
             <w:tr>
               <w:trPr>
                 <w:cantSplit/>
-                <w:trHeight w:val="360" w:hRule="atLeast"/>
+                <w:trHeight w:val="316" w:hRule="atLeast"/>
               </w:trPr>
               <w:tc>
                 <w:tcPr>
@@ -4389,9 +4819,9 @@
                     <w:right w:val="single" w:sz="4" w:color="C8CDC2"/>
                   </w:tcBorders>
                   <w:tcMar>
-                    <w:top w:w="30" w:type="dxa"/>
+                    <w:top w:w="20" w:type="dxa"/>
                     <w:left w:w="70" w:type="dxa"/>
-                    <w:bottom w:w="30" w:type="dxa"/>
+                    <w:bottom w:w="20" w:type="dxa"/>
                     <w:right w:w="70" w:type="dxa"/>
                   </w:tcMar>
                   <w:vAlign w:val="center"/>
@@ -4423,9 +4853,9 @@
                     <w:right w:val="single" w:sz="4" w:color="C8CDC2"/>
                   </w:tcBorders>
                   <w:tcMar>
-                    <w:top w:w="30" w:type="dxa"/>
+                    <w:top w:w="20" w:type="dxa"/>
                     <w:left w:w="70" w:type="dxa"/>
-                    <w:bottom w:w="30" w:type="dxa"/>
+                    <w:bottom w:w="20" w:type="dxa"/>
                     <w:right w:w="70" w:type="dxa"/>
                   </w:tcMar>
                   <w:vAlign w:val="center"/>
@@ -4495,6 +4925,21 @@
               <w:t>AUFBAU</w:t>
             </w:r>
           </w:p>
+          <w:p>
+            <w:pPr>
+              <w:spacing w:after="40" w:before="0"/>
+            </w:pPr>
+            <w:r>
+              <w:rPr>
+                <w:rFonts w:ascii="Trade Gothic Next" w:hAnsi="Trade Gothic Next"/>
+                <w:b w:val="0"/>
+                <w:color w:val="14161B"/>
+                <w:sz w:val="17"/>
+                <w:u w:val="none"/>
+              </w:rPr>
+              <w:t>Definition — Aufbau</w:t>
+            </w:r>
+          </w:p>
         </w:tc>
         <w:tc>
           <w:tcPr>
@@ -4523,11 +4968,41 @@
           </w:p>
           <w:p>
             <w:pPr>
-              <w:spacing w:after="120"/>
               <w:pBdr>
-                <w:bottom w:val="single" w:sz="4" w:color="C8CDC2"/>
+                <w:left w:val="single" w:sz="18" w:space="6" w:color="A3E635"/>
               </w:pBdr>
+              <w:spacing w:after="40" w:before="0"/>
             </w:pPr>
+            <w:r>
+              <w:rPr>
+                <w:rFonts w:ascii="Trade Gothic Next" w:hAnsi="Trade Gothic Next"/>
+                <w:b/>
+                <w:color w:val="14161B"/>
+                <w:sz w:val="19"/>
+                <w:u w:val="none"/>
+              </w:rPr>
+              <w:t xml:space="preserve">Aufbau: fill the </w:t>
+            </w:r>
+            <w:r>
+              <w:rPr>
+                <w:rFonts w:ascii="Trade Gothic Next" w:hAnsi="Trade Gothic Next"/>
+                <w:b w:val="0"/>
+                <w:color w:val="14161B"/>
+                <w:sz w:val="19"/>
+                <w:u w:val="none"/>
+              </w:rPr>
+              <w:t xml:space="preserve"> ________</w:t>
+            </w:r>
+            <w:r>
+              <w:rPr>
+                <w:rFonts w:ascii="Trade Gothic Next" w:hAnsi="Trade Gothic Next"/>
+                <w:b/>
+                <w:color w:val="14161B"/>
+                <w:sz w:val="19"/>
+                <w:u w:val="none"/>
+              </w:rPr>
+              <w:t>-energy sublevel first.</w:t>
+            </w:r>
           </w:p>
           <w:p>
             <w:pPr>
@@ -4589,6 +5064,21 @@
               <w:t>PAULI</w:t>
             </w:r>
           </w:p>
+          <w:p>
+            <w:pPr>
+              <w:spacing w:after="40" w:before="0"/>
+            </w:pPr>
+            <w:r>
+              <w:rPr>
+                <w:rFonts w:ascii="Trade Gothic Next" w:hAnsi="Trade Gothic Next"/>
+                <w:b w:val="0"/>
+                <w:color w:val="14161B"/>
+                <w:sz w:val="17"/>
+                <w:u w:val="none"/>
+              </w:rPr>
+              <w:t>Definition — Pauli</w:t>
+            </w:r>
+          </w:p>
         </w:tc>
         <w:tc>
           <w:tcPr>
@@ -4617,11 +5107,61 @@
           </w:p>
           <w:p>
             <w:pPr>
-              <w:spacing w:after="120"/>
               <w:pBdr>
-                <w:bottom w:val="single" w:sz="4" w:color="C8CDC2"/>
+                <w:left w:val="single" w:sz="18" w:space="6" w:color="A3E635"/>
               </w:pBdr>
+              <w:spacing w:after="40" w:before="0"/>
             </w:pPr>
+            <w:r>
+              <w:rPr>
+                <w:rFonts w:ascii="Trade Gothic Next" w:hAnsi="Trade Gothic Next"/>
+                <w:b/>
+                <w:color w:val="14161B"/>
+                <w:sz w:val="19"/>
+                <w:u w:val="none"/>
+              </w:rPr>
+              <w:t xml:space="preserve">Pauli: </w:t>
+            </w:r>
+            <w:r>
+              <w:rPr>
+                <w:rFonts w:ascii="Trade Gothic Next" w:hAnsi="Trade Gothic Next"/>
+                <w:b w:val="0"/>
+                <w:color w:val="14161B"/>
+                <w:sz w:val="19"/>
+                <w:u w:val="none"/>
+              </w:rPr>
+              <w:t xml:space="preserve"> ______ </w:t>
+            </w:r>
+            <w:r>
+              <w:rPr>
+                <w:rFonts w:ascii="Trade Gothic Next" w:hAnsi="Trade Gothic Next"/>
+                <w:b/>
+                <w:color w:val="14161B"/>
+                <w:sz w:val="19"/>
+                <w:u w:val="none"/>
+              </w:rPr>
+              <w:t xml:space="preserve"> electrons per orbital, with </w:t>
+            </w:r>
+            <w:r>
+              <w:rPr>
+                <w:rFonts w:ascii="Trade Gothic Next" w:hAnsi="Trade Gothic Next"/>
+                <w:b w:val="0"/>
+                <w:color w:val="14161B"/>
+                <w:sz w:val="19"/>
+                <w:u w:val="none"/>
+              </w:rPr>
+              <w:t xml:space="preserve"> __________ </w:t>
+            </w:r>
+            <w:r>
+              <w:rPr>
+                <w:rFonts w:ascii="Trade Gothic Next" w:hAnsi="Trade Gothic Next"/>
+                <w:b/>
+                <w:color w:val="14161B"/>
+                <w:sz w:val="19"/>
+                <w:u w:val="none"/>
+              </w:rPr>
+              <w:t xml:space="preserve"> spins.</w:t>
+            </w:r>
           </w:p>
           <w:p>
             <w:pPr>
@@ -4652,7 +5192,7 @@
             <w:tr>
               <w:trPr>
                 <w:cantSplit/>
-                <w:trHeight w:val="518" w:hRule="atLeast"/>
+                <w:trHeight w:val="460" w:hRule="atLeast"/>
               </w:trPr>
               <w:tc>
                 <w:tcPr>
@@ -4697,7 +5237,7 @@
             <w:tr>
               <w:trPr>
                 <w:cantSplit/>
-                <w:trHeight w:val="518" w:hRule="atLeast"/>
+                <w:trHeight w:val="460" w:hRule="atLeast"/>
               </w:trPr>
               <w:tc>
                 <w:tcPr>
@@ -4796,6 +5336,21 @@
               <w:t>HUND</w:t>
             </w:r>
           </w:p>
+          <w:p>
+            <w:pPr>
+              <w:spacing w:after="40" w:before="0"/>
+            </w:pPr>
+            <w:r>
+              <w:rPr>
+                <w:rFonts w:ascii="Trade Gothic Next" w:hAnsi="Trade Gothic Next"/>
+                <w:b w:val="0"/>
+                <w:color w:val="14161B"/>
+                <w:sz w:val="17"/>
+                <w:u w:val="none"/>
+              </w:rPr>
+              <w:t>Definition — Hund</w:t>
+            </w:r>
+          </w:p>
         </w:tc>
         <w:tc>
           <w:tcPr>
@@ -4824,11 +5379,41 @@
           </w:p>
           <w:p>
             <w:pPr>
-              <w:spacing w:after="120"/>
               <w:pBdr>
-                <w:bottom w:val="single" w:sz="4" w:color="C8CDC2"/>
+                <w:left w:val="single" w:sz="18" w:space="6" w:color="A3E635"/>
               </w:pBdr>
+              <w:spacing w:after="40" w:before="0"/>
             </w:pPr>
+            <w:r>
+              <w:rPr>
+                <w:rFonts w:ascii="Trade Gothic Next" w:hAnsi="Trade Gothic Next"/>
+                <w:b/>
+                <w:color w:val="14161B"/>
+                <w:sz w:val="19"/>
+                <w:u w:val="none"/>
+              </w:rPr>
+              <w:t xml:space="preserve">Hund: one electron in </w:t>
+            </w:r>
+            <w:r>
+              <w:rPr>
+                <w:rFonts w:ascii="Trade Gothic Next" w:hAnsi="Trade Gothic Next"/>
+                <w:b w:val="0"/>
+                <w:color w:val="14161B"/>
+                <w:sz w:val="19"/>
+                <w:u w:val="none"/>
+              </w:rPr>
+              <w:t xml:space="preserve"> ______ </w:t>
+            </w:r>
+            <w:r>
+              <w:rPr>
+                <w:rFonts w:ascii="Trade Gothic Next" w:hAnsi="Trade Gothic Next"/>
+                <w:b/>
+                <w:color w:val="14161B"/>
+                <w:sz w:val="19"/>
+                <w:u w:val="none"/>
+              </w:rPr>
+              <w:t xml:space="preserve"> box before pairing.</w:t>
+            </w:r>
           </w:p>
           <w:p>
             <w:pPr>
@@ -4861,7 +5446,7 @@
             <w:tr>
               <w:trPr>
                 <w:cantSplit/>
-                <w:trHeight w:val="518" w:hRule="atLeast"/>
+                <w:trHeight w:val="460" w:hRule="atLeast"/>
               </w:trPr>
               <w:tc>
                 <w:tcPr>
@@ -4942,7 +5527,7 @@
             <w:tr>
               <w:trPr>
                 <w:cantSplit/>
-                <w:trHeight w:val="518" w:hRule="atLeast"/>
+                <w:trHeight w:val="460" w:hRule="atLeast"/>
               </w:trPr>
               <w:tc>
                 <w:tcPr>
@@ -5023,7 +5608,7 @@
             <w:tr>
               <w:trPr>
                 <w:cantSplit/>
-                <w:trHeight w:val="518" w:hRule="atLeast"/>
+                <w:trHeight w:val="460" w:hRule="atLeast"/>
               </w:trPr>
               <w:tc>
                 <w:tcPr>
@@ -5158,6 +5743,21 @@
               <w:t>OXYGEN</w:t>
             </w:r>
           </w:p>
+          <w:p>
+            <w:pPr>
+              <w:spacing w:after="40" w:before="0"/>
+            </w:pPr>
+            <w:r>
+              <w:rPr>
+                <w:rFonts w:ascii="Trade Gothic Next" w:hAnsi="Trade Gothic Next"/>
+                <w:b w:val="0"/>
+                <w:color w:val="14161B"/>
+                <w:sz w:val="17"/>
+                <w:u w:val="none"/>
+              </w:rPr>
+              <w:t>Example</w:t>
+            </w:r>
+          </w:p>
         </w:tc>
         <w:tc>
           <w:tcPr>
@@ -5231,7 +5831,7 @@
             <w:tr>
               <w:trPr>
                 <w:cantSplit/>
-                <w:trHeight w:val="518" w:hRule="atLeast"/>
+                <w:trHeight w:val="460" w:hRule="atLeast"/>
               </w:trPr>
               <w:tc>
                 <w:tcPr>
@@ -5288,7 +5888,7 @@
             <w:tr>
               <w:trPr>
                 <w:cantSplit/>
-                <w:trHeight w:val="518" w:hRule="atLeast"/>
+                <w:trHeight w:val="460" w:hRule="atLeast"/>
               </w:trPr>
               <w:tc>
                 <w:tcPr>
@@ -5345,7 +5945,7 @@
             <w:tr>
               <w:trPr>
                 <w:cantSplit/>
-                <w:trHeight w:val="518" w:hRule="atLeast"/>
+                <w:trHeight w:val="460" w:hRule="atLeast"/>
               </w:trPr>
               <w:tc>
                 <w:tcPr>
@@ -5480,6 +6080,21 @@
               <w:t>ARGON</w:t>
             </w:r>
           </w:p>
+          <w:p>
+            <w:pPr>
+              <w:spacing w:after="40" w:before="0"/>
+            </w:pPr>
+            <w:r>
+              <w:rPr>
+                <w:rFonts w:ascii="Trade Gothic Next" w:hAnsi="Trade Gothic Next"/>
+                <w:b w:val="0"/>
+                <w:color w:val="14161B"/>
+                <w:sz w:val="17"/>
+                <w:u w:val="none"/>
+              </w:rPr>
+              <w:t>Example</w:t>
+            </w:r>
+          </w:p>
         </w:tc>
         <w:tc>
           <w:tcPr>
@@ -5566,6 +6181,21 @@
               <w:t>NOBLE-GAS SHORTHAND</w:t>
             </w:r>
           </w:p>
+          <w:p>
+            <w:pPr>
+              <w:spacing w:after="40" w:before="0"/>
+            </w:pPr>
+            <w:r>
+              <w:rPr>
+                <w:rFonts w:ascii="Trade Gothic Next" w:hAnsi="Trade Gothic Next"/>
+                <w:b w:val="0"/>
+                <w:color w:val="14161B"/>
+                <w:sz w:val="17"/>
+                <w:u w:val="none"/>
+              </w:rPr>
+              <w:t>Steps — shorthand</w:t>
+            </w:r>
+          </w:p>
         </w:tc>
         <w:tc>
           <w:tcPr>
@@ -5594,11 +6224,41 @@
           </w:p>
           <w:p>
             <w:pPr>
-              <w:spacing w:after="120"/>
               <w:pBdr>
-                <w:bottom w:val="single" w:sz="4" w:color="C8CDC2"/>
+                <w:left w:val="single" w:sz="18" w:space="6" w:color="A3E635"/>
               </w:pBdr>
+              <w:spacing w:after="40" w:before="0"/>
             </w:pPr>
+            <w:r>
+              <w:rPr>
+                <w:rFonts w:ascii="Trade Gothic Next" w:hAnsi="Trade Gothic Next"/>
+                <w:b/>
+                <w:color w:val="14161B"/>
+                <w:sz w:val="19"/>
+                <w:u w:val="none"/>
+              </w:rPr>
+              <w:t xml:space="preserve">Replace the matching inner electrons with </w:t>
+            </w:r>
+            <w:r>
+              <w:rPr>
+                <w:rFonts w:ascii="Trade Gothic Next" w:hAnsi="Trade Gothic Next"/>
+                <w:b w:val="0"/>
+                <w:color w:val="14161B"/>
+                <w:sz w:val="19"/>
+                <w:u w:val="none"/>
+              </w:rPr>
+              <w:t xml:space="preserve"> ______</w:t>
+            </w:r>
+            <w:r>
+              <w:rPr>
+                <w:rFonts w:ascii="Trade Gothic Next" w:hAnsi="Trade Gothic Next"/>
+                <w:b/>
+                <w:color w:val="14161B"/>
+                <w:sz w:val="19"/>
+                <w:u w:val="none"/>
+              </w:rPr>
+              <w:t>.</w:t>
+            </w:r>
           </w:p>
           <w:p>
             <w:pPr>
@@ -5658,6 +6318,21 @@
                 <w:sz w:val="14"/>
               </w:rPr>
               <w:t>IRON</w:t>
+            </w:r>
+          </w:p>
+          <w:p>
+            <w:pPr>
+              <w:spacing w:after="40" w:before="0"/>
+            </w:pPr>
+            <w:r>
+              <w:rPr>
+                <w:rFonts w:ascii="Trade Gothic Next" w:hAnsi="Trade Gothic Next"/>
+                <w:b w:val="0"/>
+                <w:color w:val="14161B"/>
+                <w:sz w:val="17"/>
+                <w:u w:val="none"/>
+              </w:rPr>
+              <w:t>Example</w:t>
             </w:r>
           </w:p>
         </w:tc>
@@ -5735,7 +6410,7 @@
             <w:tr>
               <w:trPr>
                 <w:cantSplit/>
-                <w:trHeight w:val="518" w:hRule="atLeast"/>
+                <w:trHeight w:val="460" w:hRule="atLeast"/>
               </w:trPr>
               <w:tc>
                 <w:tcPr>
@@ -5804,7 +6479,7 @@
             <w:tr>
               <w:trPr>
                 <w:cantSplit/>
-                <w:trHeight w:val="518" w:hRule="atLeast"/>
+                <w:trHeight w:val="460" w:hRule="atLeast"/>
               </w:trPr>
               <w:tc>
                 <w:tcPr>
@@ -6114,7 +6789,7 @@
             <w:tr>
               <w:trPr>
                 <w:cantSplit/>
-                <w:trHeight w:val="360" w:hRule="atLeast"/>
+                <w:trHeight w:val="316" w:hRule="atLeast"/>
               </w:trPr>
               <w:tc>
                 <w:tcPr>
@@ -6126,9 +6801,9 @@
                     <w:right w:val="single" w:sz="4" w:color="C8CDC2"/>
                   </w:tcBorders>
                   <w:tcMar>
-                    <w:top w:w="30" w:type="dxa"/>
+                    <w:top w:w="20" w:type="dxa"/>
                     <w:left w:w="70" w:type="dxa"/>
-                    <w:bottom w:w="30" w:type="dxa"/>
+                    <w:bottom w:w="20" w:type="dxa"/>
                     <w:right w:w="70" w:type="dxa"/>
                   </w:tcMar>
                   <w:vAlign w:val="center"/>
@@ -6160,9 +6835,9 @@
                     <w:right w:val="single" w:sz="4" w:color="C8CDC2"/>
                   </w:tcBorders>
                   <w:tcMar>
-                    <w:top w:w="30" w:type="dxa"/>
+                    <w:top w:w="20" w:type="dxa"/>
                     <w:left w:w="70" w:type="dxa"/>
-                    <w:bottom w:w="30" w:type="dxa"/>
+                    <w:bottom w:w="20" w:type="dxa"/>
                     <w:right w:w="70" w:type="dxa"/>
                   </w:tcMar>
                   <w:vAlign w:val="center"/>
@@ -6194,9 +6869,9 @@
                     <w:right w:val="single" w:sz="4" w:color="C8CDC2"/>
                   </w:tcBorders>
                   <w:tcMar>
-                    <w:top w:w="30" w:type="dxa"/>
+                    <w:top w:w="20" w:type="dxa"/>
                     <w:left w:w="70" w:type="dxa"/>
-                    <w:bottom w:w="30" w:type="dxa"/>
+                    <w:bottom w:w="20" w:type="dxa"/>
                     <w:right w:w="70" w:type="dxa"/>
                   </w:tcMar>
                   <w:vAlign w:val="center"/>
@@ -6212,7 +6887,7 @@
             <w:tr>
               <w:trPr>
                 <w:cantSplit/>
-                <w:trHeight w:val="360" w:hRule="atLeast"/>
+                <w:trHeight w:val="316" w:hRule="atLeast"/>
               </w:trPr>
               <w:tc>
                 <w:tcPr>
@@ -6224,9 +6899,9 @@
                     <w:right w:val="single" w:sz="4" w:color="C8CDC2"/>
                   </w:tcBorders>
                   <w:tcMar>
-                    <w:top w:w="30" w:type="dxa"/>
+                    <w:top w:w="20" w:type="dxa"/>
                     <w:left w:w="70" w:type="dxa"/>
-                    <w:bottom w:w="30" w:type="dxa"/>
+                    <w:bottom w:w="20" w:type="dxa"/>
                     <w:right w:w="70" w:type="dxa"/>
                   </w:tcMar>
                   <w:vAlign w:val="center"/>
@@ -6258,9 +6933,9 @@
                     <w:right w:val="single" w:sz="4" w:color="C8CDC2"/>
                   </w:tcBorders>
                   <w:tcMar>
-                    <w:top w:w="30" w:type="dxa"/>
+                    <w:top w:w="20" w:type="dxa"/>
                     <w:left w:w="70" w:type="dxa"/>
-                    <w:bottom w:w="30" w:type="dxa"/>
+                    <w:bottom w:w="20" w:type="dxa"/>
                     <w:right w:w="70" w:type="dxa"/>
                   </w:tcMar>
                   <w:vAlign w:val="center"/>
@@ -6292,9 +6967,9 @@
                     <w:right w:val="single" w:sz="4" w:color="C8CDC2"/>
                   </w:tcBorders>
                   <w:tcMar>
-                    <w:top w:w="30" w:type="dxa"/>
+                    <w:top w:w="20" w:type="dxa"/>
                     <w:left w:w="70" w:type="dxa"/>
-                    <w:bottom w:w="30" w:type="dxa"/>
+                    <w:bottom w:w="20" w:type="dxa"/>
                     <w:right w:w="70" w:type="dxa"/>
                   </w:tcMar>
                   <w:vAlign w:val="center"/>
@@ -6392,11 +7067,58 @@
           </w:p>
           <w:p>
             <w:pPr>
-              <w:spacing w:after="120"/>
-              <w:pBdr>
-                <w:bottom w:val="single" w:sz="4" w:color="C8CDC2"/>
-              </w:pBdr>
+              <w:spacing w:after="40" w:before="0"/>
             </w:pPr>
+            <w:r>
+              <w:rPr>
+                <w:rFonts w:ascii="Trade Gothic Next" w:hAnsi="Trade Gothic Next"/>
+                <w:b w:val="0"/>
+                <w:color w:val="14161B"/>
+                <w:sz w:val="19"/>
+                <w:u w:val="none"/>
+              </w:rPr>
+              <w:t xml:space="preserve">4s and 3d energies are </w:t>
+            </w:r>
+            <w:r>
+              <w:rPr>
+                <w:rFonts w:ascii="Trade Gothic Next" w:hAnsi="Trade Gothic Next"/>
+                <w:b w:val="0"/>
+                <w:color w:val="14161B"/>
+                <w:sz w:val="19"/>
+                <w:u w:val="none"/>
+              </w:rPr>
+              <w:t xml:space="preserve"> _______</w:t>
+            </w:r>
+            <w:r>
+              <w:rPr>
+                <w:rFonts w:ascii="Trade Gothic Next" w:hAnsi="Trade Gothic Next"/>
+                <w:b w:val="0"/>
+                <w:color w:val="14161B"/>
+                <w:sz w:val="19"/>
+                <w:u w:val="none"/>
+              </w:rPr>
+              <w:t xml:space="preserve">, so the actual arrangement has </w:t>
+            </w:r>
+            <w:r>
+              <w:rPr>
+                <w:rFonts w:ascii="Trade Gothic Next" w:hAnsi="Trade Gothic Next"/>
+                <w:b w:val="0"/>
+                <w:color w:val="14161B"/>
+                <w:sz w:val="19"/>
+                <w:u w:val="none"/>
+              </w:rPr>
+              <w:t xml:space="preserve"> ______ </w:t>
+            </w:r>
+            <w:r>
+              <w:rPr>
+                <w:rFonts w:ascii="Trade Gothic Next" w:hAnsi="Trade Gothic Next"/>
+                <w:b w:val="0"/>
+                <w:color w:val="14161B"/>
+                <w:sz w:val="19"/>
+                <w:u w:val="none"/>
+              </w:rPr>
+              <w:t xml:space="preserve"> total energy.</w:t>
+            </w:r>
           </w:p>
           <w:tbl>
             <w:tblPr>
@@ -6511,7 +7233,7 @@
             <w:tr>
               <w:trPr>
                 <w:cantSplit/>
-                <w:trHeight w:val="360" w:hRule="atLeast"/>
+                <w:trHeight w:val="316" w:hRule="atLeast"/>
               </w:trPr>
               <w:tc>
                 <w:tcPr>
@@ -6523,9 +7245,9 @@
                     <w:right w:val="single" w:sz="4" w:color="C8CDC2"/>
                   </w:tcBorders>
                   <w:tcMar>
-                    <w:top w:w="30" w:type="dxa"/>
+                    <w:top w:w="20" w:type="dxa"/>
                     <w:left w:w="70" w:type="dxa"/>
-                    <w:bottom w:w="30" w:type="dxa"/>
+                    <w:bottom w:w="20" w:type="dxa"/>
                     <w:right w:w="70" w:type="dxa"/>
                   </w:tcMar>
                   <w:vAlign w:val="center"/>
@@ -6557,9 +7279,9 @@
                     <w:right w:val="single" w:sz="4" w:color="C8CDC2"/>
                   </w:tcBorders>
                   <w:tcMar>
-                    <w:top w:w="30" w:type="dxa"/>
+                    <w:top w:w="20" w:type="dxa"/>
                     <w:left w:w="70" w:type="dxa"/>
-                    <w:bottom w:w="30" w:type="dxa"/>
+                    <w:bottom w:w="20" w:type="dxa"/>
                     <w:right w:w="70" w:type="dxa"/>
                   </w:tcMar>
                   <w:vAlign w:val="center"/>
@@ -6591,9 +7313,9 @@
                     <w:right w:val="single" w:sz="4" w:color="C8CDC2"/>
                   </w:tcBorders>
                   <w:tcMar>
-                    <w:top w:w="30" w:type="dxa"/>
+                    <w:top w:w="20" w:type="dxa"/>
                     <w:left w:w="70" w:type="dxa"/>
-                    <w:bottom w:w="30" w:type="dxa"/>
+                    <w:bottom w:w="20" w:type="dxa"/>
                     <w:right w:w="70" w:type="dxa"/>
                   </w:tcMar>
                   <w:vAlign w:val="center"/>
@@ -6609,7 +7331,7 @@
             <w:tr>
               <w:trPr>
                 <w:cantSplit/>
-                <w:trHeight w:val="360" w:hRule="atLeast"/>
+                <w:trHeight w:val="316" w:hRule="atLeast"/>
               </w:trPr>
               <w:tc>
                 <w:tcPr>
@@ -6621,9 +7343,9 @@
                     <w:right w:val="single" w:sz="4" w:color="C8CDC2"/>
                   </w:tcBorders>
                   <w:tcMar>
-                    <w:top w:w="30" w:type="dxa"/>
+                    <w:top w:w="20" w:type="dxa"/>
                     <w:left w:w="70" w:type="dxa"/>
-                    <w:bottom w:w="30" w:type="dxa"/>
+                    <w:bottom w:w="20" w:type="dxa"/>
                     <w:right w:w="70" w:type="dxa"/>
                   </w:tcMar>
                   <w:vAlign w:val="center"/>
@@ -6655,9 +7377,9 @@
                     <w:right w:val="single" w:sz="4" w:color="C8CDC2"/>
                   </w:tcBorders>
                   <w:tcMar>
-                    <w:top w:w="30" w:type="dxa"/>
+                    <w:top w:w="20" w:type="dxa"/>
                     <w:left w:w="70" w:type="dxa"/>
-                    <w:bottom w:w="30" w:type="dxa"/>
+                    <w:bottom w:w="20" w:type="dxa"/>
                     <w:right w:w="70" w:type="dxa"/>
                   </w:tcMar>
                   <w:vAlign w:val="center"/>
@@ -6689,9 +7411,9 @@
                     <w:right w:val="single" w:sz="4" w:color="C8CDC2"/>
                   </w:tcBorders>
                   <w:tcMar>
-                    <w:top w:w="30" w:type="dxa"/>
+                    <w:top w:w="20" w:type="dxa"/>
                     <w:left w:w="70" w:type="dxa"/>
-                    <w:bottom w:w="30" w:type="dxa"/>
+                    <w:bottom w:w="20" w:type="dxa"/>
                     <w:right w:w="70" w:type="dxa"/>
                   </w:tcMar>
                   <w:vAlign w:val="center"/>
@@ -6900,7 +7622,7 @@
             <w:tr>
               <w:trPr>
                 <w:cantSplit/>
-                <w:trHeight w:val="360" w:hRule="atLeast"/>
+                <w:trHeight w:val="316" w:hRule="atLeast"/>
               </w:trPr>
               <w:tc>
                 <w:tcPr>
@@ -6912,9 +7634,9 @@
                     <w:right w:val="single" w:sz="4" w:color="C8CDC2"/>
                   </w:tcBorders>
                   <w:tcMar>
-                    <w:top w:w="30" w:type="dxa"/>
+                    <w:top w:w="20" w:type="dxa"/>
                     <w:left w:w="70" w:type="dxa"/>
-                    <w:bottom w:w="30" w:type="dxa"/>
+                    <w:bottom w:w="20" w:type="dxa"/>
                     <w:right w:w="70" w:type="dxa"/>
                   </w:tcMar>
                   <w:vAlign w:val="center"/>
@@ -6946,9 +7668,9 @@
                     <w:right w:val="single" w:sz="4" w:color="C8CDC2"/>
                   </w:tcBorders>
                   <w:tcMar>
-                    <w:top w:w="30" w:type="dxa"/>
+                    <w:top w:w="20" w:type="dxa"/>
                     <w:left w:w="70" w:type="dxa"/>
-                    <w:bottom w:w="30" w:type="dxa"/>
+                    <w:bottom w:w="20" w:type="dxa"/>
                     <w:right w:w="70" w:type="dxa"/>
                   </w:tcMar>
                   <w:vAlign w:val="center"/>
@@ -6980,9 +7702,9 @@
                     <w:right w:val="single" w:sz="4" w:color="C8CDC2"/>
                   </w:tcBorders>
                   <w:tcMar>
-                    <w:top w:w="30" w:type="dxa"/>
+                    <w:top w:w="20" w:type="dxa"/>
                     <w:left w:w="70" w:type="dxa"/>
-                    <w:bottom w:w="30" w:type="dxa"/>
+                    <w:bottom w:w="20" w:type="dxa"/>
                     <w:right w:w="70" w:type="dxa"/>
                   </w:tcMar>
                   <w:vAlign w:val="center"/>
@@ -6998,7 +7720,7 @@
             <w:tr>
               <w:trPr>
                 <w:cantSplit/>
-                <w:trHeight w:val="360" w:hRule="atLeast"/>
+                <w:trHeight w:val="316" w:hRule="atLeast"/>
               </w:trPr>
               <w:tc>
                 <w:tcPr>
@@ -7010,9 +7732,9 @@
                     <w:right w:val="single" w:sz="4" w:color="C8CDC2"/>
                   </w:tcBorders>
                   <w:tcMar>
-                    <w:top w:w="30" w:type="dxa"/>
+                    <w:top w:w="20" w:type="dxa"/>
                     <w:left w:w="70" w:type="dxa"/>
-                    <w:bottom w:w="30" w:type="dxa"/>
+                    <w:bottom w:w="20" w:type="dxa"/>
                     <w:right w:w="70" w:type="dxa"/>
                   </w:tcMar>
                   <w:vAlign w:val="center"/>
@@ -7044,9 +7766,9 @@
                     <w:right w:val="single" w:sz="4" w:color="C8CDC2"/>
                   </w:tcBorders>
                   <w:tcMar>
-                    <w:top w:w="30" w:type="dxa"/>
+                    <w:top w:w="20" w:type="dxa"/>
                     <w:left w:w="70" w:type="dxa"/>
-                    <w:bottom w:w="30" w:type="dxa"/>
+                    <w:bottom w:w="20" w:type="dxa"/>
                     <w:right w:w="70" w:type="dxa"/>
                   </w:tcMar>
                   <w:vAlign w:val="center"/>
@@ -7078,9 +7800,9 @@
                     <w:right w:val="single" w:sz="4" w:color="C8CDC2"/>
                   </w:tcBorders>
                   <w:tcMar>
-                    <w:top w:w="30" w:type="dxa"/>
+                    <w:top w:w="20" w:type="dxa"/>
                     <w:left w:w="70" w:type="dxa"/>
-                    <w:bottom w:w="30" w:type="dxa"/>
+                    <w:bottom w:w="20" w:type="dxa"/>
                     <w:right w:w="70" w:type="dxa"/>
                   </w:tcMar>
                   <w:vAlign w:val="center"/>
@@ -7096,7 +7818,7 @@
             <w:tr>
               <w:trPr>
                 <w:cantSplit/>
-                <w:trHeight w:val="360" w:hRule="atLeast"/>
+                <w:trHeight w:val="316" w:hRule="atLeast"/>
               </w:trPr>
               <w:tc>
                 <w:tcPr>
@@ -7108,9 +7830,9 @@
                     <w:right w:val="single" w:sz="4" w:color="C8CDC2"/>
                   </w:tcBorders>
                   <w:tcMar>
-                    <w:top w:w="30" w:type="dxa"/>
+                    <w:top w:w="20" w:type="dxa"/>
                     <w:left w:w="70" w:type="dxa"/>
-                    <w:bottom w:w="30" w:type="dxa"/>
+                    <w:bottom w:w="20" w:type="dxa"/>
                     <w:right w:w="70" w:type="dxa"/>
                   </w:tcMar>
                   <w:vAlign w:val="center"/>
@@ -7142,9 +7864,9 @@
                     <w:right w:val="single" w:sz="4" w:color="C8CDC2"/>
                   </w:tcBorders>
                   <w:tcMar>
-                    <w:top w:w="30" w:type="dxa"/>
+                    <w:top w:w="20" w:type="dxa"/>
                     <w:left w:w="70" w:type="dxa"/>
-                    <w:bottom w:w="30" w:type="dxa"/>
+                    <w:bottom w:w="20" w:type="dxa"/>
                     <w:right w:w="70" w:type="dxa"/>
                   </w:tcMar>
                   <w:vAlign w:val="center"/>
@@ -7176,9 +7898,9 @@
                     <w:right w:val="single" w:sz="4" w:color="C8CDC2"/>
                   </w:tcBorders>
                   <w:tcMar>
-                    <w:top w:w="30" w:type="dxa"/>
+                    <w:top w:w="20" w:type="dxa"/>
                     <w:left w:w="70" w:type="dxa"/>
-                    <w:bottom w:w="30" w:type="dxa"/>
+                    <w:bottom w:w="20" w:type="dxa"/>
                     <w:right w:w="70" w:type="dxa"/>
                   </w:tcMar>
                   <w:vAlign w:val="center"/>
@@ -7387,7 +8109,7 @@
             <w:tr>
               <w:trPr>
                 <w:cantSplit/>
-                <w:trHeight w:val="360" w:hRule="atLeast"/>
+                <w:trHeight w:val="316" w:hRule="atLeast"/>
               </w:trPr>
               <w:tc>
                 <w:tcPr>
@@ -7399,9 +8121,9 @@
                     <w:right w:val="single" w:sz="4" w:color="C8CDC2"/>
                   </w:tcBorders>
                   <w:tcMar>
-                    <w:top w:w="30" w:type="dxa"/>
+                    <w:top w:w="20" w:type="dxa"/>
                     <w:left w:w="70" w:type="dxa"/>
-                    <w:bottom w:w="30" w:type="dxa"/>
+                    <w:bottom w:w="20" w:type="dxa"/>
                     <w:right w:w="70" w:type="dxa"/>
                   </w:tcMar>
                   <w:vAlign w:val="center"/>
@@ -7433,9 +8155,9 @@
                     <w:right w:val="single" w:sz="4" w:color="C8CDC2"/>
                   </w:tcBorders>
                   <w:tcMar>
-                    <w:top w:w="30" w:type="dxa"/>
+                    <w:top w:w="20" w:type="dxa"/>
                     <w:left w:w="70" w:type="dxa"/>
-                    <w:bottom w:w="30" w:type="dxa"/>
+                    <w:bottom w:w="20" w:type="dxa"/>
                     <w:right w:w="70" w:type="dxa"/>
                   </w:tcMar>
                   <w:vAlign w:val="center"/>
@@ -7457,9 +8179,9 @@
                     <w:right w:val="single" w:sz="4" w:color="C8CDC2"/>
                   </w:tcBorders>
                   <w:tcMar>
-                    <w:top w:w="30" w:type="dxa"/>
+                    <w:top w:w="20" w:type="dxa"/>
                     <w:left w:w="70" w:type="dxa"/>
-                    <w:bottom w:w="30" w:type="dxa"/>
+                    <w:bottom w:w="20" w:type="dxa"/>
                     <w:right w:w="70" w:type="dxa"/>
                   </w:tcMar>
                   <w:vAlign w:val="center"/>
@@ -7475,7 +8197,7 @@
             <w:tr>
               <w:trPr>
                 <w:cantSplit/>
-                <w:trHeight w:val="360" w:hRule="atLeast"/>
+                <w:trHeight w:val="316" w:hRule="atLeast"/>
               </w:trPr>
               <w:tc>
                 <w:tcPr>
@@ -7487,9 +8209,9 @@
                     <w:right w:val="single" w:sz="4" w:color="C8CDC2"/>
                   </w:tcBorders>
                   <w:tcMar>
-                    <w:top w:w="30" w:type="dxa"/>
+                    <w:top w:w="20" w:type="dxa"/>
                     <w:left w:w="70" w:type="dxa"/>
-                    <w:bottom w:w="30" w:type="dxa"/>
+                    <w:bottom w:w="20" w:type="dxa"/>
                     <w:right w:w="70" w:type="dxa"/>
                   </w:tcMar>
                   <w:vAlign w:val="center"/>
@@ -7521,9 +8243,9 @@
                     <w:right w:val="single" w:sz="4" w:color="C8CDC2"/>
                   </w:tcBorders>
                   <w:tcMar>
-                    <w:top w:w="30" w:type="dxa"/>
+                    <w:top w:w="20" w:type="dxa"/>
                     <w:left w:w="70" w:type="dxa"/>
-                    <w:bottom w:w="30" w:type="dxa"/>
+                    <w:bottom w:w="20" w:type="dxa"/>
                     <w:right w:w="70" w:type="dxa"/>
                   </w:tcMar>
                   <w:vAlign w:val="center"/>
@@ -7545,9 +8267,9 @@
                     <w:right w:val="single" w:sz="4" w:color="C8CDC2"/>
                   </w:tcBorders>
                   <w:tcMar>
-                    <w:top w:w="30" w:type="dxa"/>
+                    <w:top w:w="20" w:type="dxa"/>
                     <w:left w:w="70" w:type="dxa"/>
-                    <w:bottom w:w="30" w:type="dxa"/>
+                    <w:bottom w:w="20" w:type="dxa"/>
                     <w:right w:w="70" w:type="dxa"/>
                   </w:tcMar>
                   <w:vAlign w:val="center"/>
@@ -7851,6 +8573,21 @@
               <w:t>VALENCE ELECTRONS</w:t>
             </w:r>
           </w:p>
+          <w:p>
+            <w:pPr>
+              <w:spacing w:after="40" w:before="0"/>
+            </w:pPr>
+            <w:r>
+              <w:rPr>
+                <w:rFonts w:ascii="Trade Gothic Next" w:hAnsi="Trade Gothic Next"/>
+                <w:b w:val="0"/>
+                <w:color w:val="14161B"/>
+                <w:sz w:val="17"/>
+                <w:u w:val="none"/>
+              </w:rPr>
+              <w:t>Definition — valence electrons</w:t>
+            </w:r>
+          </w:p>
         </w:tc>
         <w:tc>
           <w:tcPr>
@@ -7875,6 +8612,44 @@
                 <w:spacing w:val="26"/>
               </w:rPr>
               <w:t>VALENCE ELECTRONS</w:t>
+            </w:r>
+          </w:p>
+          <w:p>
+            <w:pPr>
+              <w:pBdr>
+                <w:left w:val="single" w:sz="18" w:space="6" w:color="A3E635"/>
+              </w:pBdr>
+              <w:spacing w:after="40" w:before="0"/>
+            </w:pPr>
+            <w:r>
+              <w:rPr>
+                <w:rFonts w:ascii="Trade Gothic Next" w:hAnsi="Trade Gothic Next"/>
+                <w:b/>
+                <w:color w:val="14161B"/>
+                <w:sz w:val="19"/>
+                <w:u w:val="none"/>
+              </w:rPr>
+              <w:t xml:space="preserve">Valence electrons are the </w:t>
+            </w:r>
+            <w:r>
+              <w:rPr>
+                <w:rFonts w:ascii="Trade Gothic Next" w:hAnsi="Trade Gothic Next"/>
+                <w:b w:val="0"/>
+                <w:color w:val="14161B"/>
+                <w:sz w:val="19"/>
+                <w:u w:val="none"/>
+              </w:rPr>
+              <w:t xml:space="preserve"> _______ </w:t>
+            </w:r>
+            <w:r>
+              <w:rPr>
+                <w:rFonts w:ascii="Trade Gothic Next" w:hAnsi="Trade Gothic Next"/>
+                <w:b/>
+                <w:color w:val="14161B"/>
+                <w:sz w:val="19"/>
+                <w:u w:val="none"/>
+              </w:rPr>
+              <w:t xml:space="preserve"> electrons.</w:t>
             </w:r>
           </w:p>
           <w:p>
@@ -8268,7 +9043,7 @@
             <w:tr>
               <w:trPr>
                 <w:cantSplit/>
-                <w:trHeight w:val="360" w:hRule="atLeast"/>
+                <w:trHeight w:val="316" w:hRule="atLeast"/>
               </w:trPr>
               <w:tc>
                 <w:tcPr>
@@ -8280,9 +9055,9 @@
                     <w:right w:val="single" w:sz="4" w:color="C8CDC2"/>
                   </w:tcBorders>
                   <w:tcMar>
-                    <w:top w:w="30" w:type="dxa"/>
+                    <w:top w:w="20" w:type="dxa"/>
                     <w:left w:w="70" w:type="dxa"/>
-                    <w:bottom w:w="30" w:type="dxa"/>
+                    <w:bottom w:w="20" w:type="dxa"/>
                     <w:right w:w="70" w:type="dxa"/>
                   </w:tcMar>
                   <w:vAlign w:val="center"/>
@@ -8325,9 +9100,9 @@
                     <w:right w:val="single" w:sz="4" w:color="C8CDC2"/>
                   </w:tcBorders>
                   <w:tcMar>
-                    <w:top w:w="30" w:type="dxa"/>
+                    <w:top w:w="20" w:type="dxa"/>
                     <w:left w:w="70" w:type="dxa"/>
-                    <w:bottom w:w="30" w:type="dxa"/>
+                    <w:bottom w:w="20" w:type="dxa"/>
                     <w:right w:w="70" w:type="dxa"/>
                   </w:tcMar>
                   <w:vAlign w:val="center"/>
@@ -8349,9 +9124,9 @@
                     <w:right w:val="single" w:sz="4" w:color="C8CDC2"/>
                   </w:tcBorders>
                   <w:tcMar>
-                    <w:top w:w="30" w:type="dxa"/>
+                    <w:top w:w="20" w:type="dxa"/>
                     <w:left w:w="70" w:type="dxa"/>
-                    <w:bottom w:w="30" w:type="dxa"/>
+                    <w:bottom w:w="20" w:type="dxa"/>
                     <w:right w:w="70" w:type="dxa"/>
                   </w:tcMar>
                   <w:vAlign w:val="center"/>
@@ -8373,9 +9148,9 @@
                     <w:right w:val="single" w:sz="4" w:color="C8CDC2"/>
                   </w:tcBorders>
                   <w:tcMar>
-                    <w:top w:w="30" w:type="dxa"/>
+                    <w:top w:w="20" w:type="dxa"/>
                     <w:left w:w="70" w:type="dxa"/>
-                    <w:bottom w:w="30" w:type="dxa"/>
+                    <w:bottom w:w="20" w:type="dxa"/>
                     <w:right w:w="70" w:type="dxa"/>
                   </w:tcMar>
                   <w:vAlign w:val="center"/>
@@ -8397,9 +9172,9 @@
                     <w:right w:val="single" w:sz="4" w:color="C8CDC2"/>
                   </w:tcBorders>
                   <w:tcMar>
-                    <w:top w:w="30" w:type="dxa"/>
+                    <w:top w:w="20" w:type="dxa"/>
                     <w:left w:w="70" w:type="dxa"/>
-                    <w:bottom w:w="30" w:type="dxa"/>
+                    <w:bottom w:w="20" w:type="dxa"/>
                     <w:right w:w="70" w:type="dxa"/>
                   </w:tcMar>
                   <w:vAlign w:val="center"/>
@@ -8421,9 +9196,9 @@
                     <w:right w:val="single" w:sz="4" w:color="C8CDC2"/>
                   </w:tcBorders>
                   <w:tcMar>
-                    <w:top w:w="30" w:type="dxa"/>
+                    <w:top w:w="20" w:type="dxa"/>
                     <w:left w:w="70" w:type="dxa"/>
-                    <w:bottom w:w="30" w:type="dxa"/>
+                    <w:bottom w:w="20" w:type="dxa"/>
                     <w:right w:w="70" w:type="dxa"/>
                   </w:tcMar>
                   <w:vAlign w:val="center"/>
@@ -8445,9 +9220,9 @@
                     <w:right w:val="single" w:sz="4" w:color="C8CDC2"/>
                   </w:tcBorders>
                   <w:tcMar>
-                    <w:top w:w="30" w:type="dxa"/>
+                    <w:top w:w="20" w:type="dxa"/>
                     <w:left w:w="70" w:type="dxa"/>
-                    <w:bottom w:w="30" w:type="dxa"/>
+                    <w:bottom w:w="20" w:type="dxa"/>
                     <w:right w:w="70" w:type="dxa"/>
                   </w:tcMar>
                   <w:vAlign w:val="center"/>
@@ -8469,9 +9244,9 @@
                     <w:right w:val="single" w:sz="4" w:color="C8CDC2"/>
                   </w:tcBorders>
                   <w:tcMar>
-                    <w:top w:w="30" w:type="dxa"/>
+                    <w:top w:w="20" w:type="dxa"/>
                     <w:left w:w="70" w:type="dxa"/>
-                    <w:bottom w:w="30" w:type="dxa"/>
+                    <w:bottom w:w="20" w:type="dxa"/>
                     <w:right w:w="70" w:type="dxa"/>
                   </w:tcMar>
                   <w:vAlign w:val="center"/>
@@ -8493,9 +9268,9 @@
                     <w:right w:val="single" w:sz="4" w:color="C8CDC2"/>
                   </w:tcBorders>
                   <w:tcMar>
-                    <w:top w:w="30" w:type="dxa"/>
+                    <w:top w:w="20" w:type="dxa"/>
                     <w:left w:w="70" w:type="dxa"/>
-                    <w:bottom w:w="30" w:type="dxa"/>
+                    <w:bottom w:w="20" w:type="dxa"/>
                     <w:right w:w="70" w:type="dxa"/>
                   </w:tcMar>
                   <w:vAlign w:val="center"/>
@@ -8565,6 +9340,36 @@
               <w:t>IONS</w:t>
             </w:r>
           </w:p>
+          <w:p>
+            <w:pPr>
+              <w:spacing w:after="40" w:before="0"/>
+            </w:pPr>
+            <w:r>
+              <w:rPr>
+                <w:rFonts w:ascii="Trade Gothic Next" w:hAnsi="Trade Gothic Next"/>
+                <w:b w:val="0"/>
+                <w:color w:val="14161B"/>
+                <w:sz w:val="17"/>
+                <w:u w:val="none"/>
+              </w:rPr>
+              <w:t>Cation and anion</w:t>
+            </w:r>
+          </w:p>
+          <w:p>
+            <w:pPr>
+              <w:spacing w:after="40" w:before="0"/>
+            </w:pPr>
+            <w:r>
+              <w:rPr>
+                <w:rFonts w:ascii="Trade Gothic Next" w:hAnsi="Trade Gothic Next"/>
+                <w:b w:val="0"/>
+                <w:color w:val="14161B"/>
+                <w:sz w:val="17"/>
+                <w:u w:val="none"/>
+              </w:rPr>
+              <w:t>Electron count in an ion</w:t>
+            </w:r>
+          </w:p>
         </w:tc>
         <w:tc>
           <w:tcPr>
@@ -8593,11 +9398,136 @@
           </w:p>
           <w:p>
             <w:pPr>
-              <w:spacing w:after="120"/>
+              <w:spacing w:after="40" w:before="0"/>
+            </w:pPr>
+            <w:r>
+              <w:rPr>
+                <w:rFonts w:ascii="Trade Gothic Next" w:hAnsi="Trade Gothic Next"/>
+                <w:b w:val="0"/>
+                <w:color w:val="14161B"/>
+                <w:sz w:val="19"/>
+                <w:u w:val="none"/>
+              </w:rPr>
+              <w:t xml:space="preserve">Cation: </w:t>
+            </w:r>
+            <w:r>
+              <w:rPr>
+                <w:rFonts w:ascii="Trade Gothic Next" w:hAnsi="Trade Gothic Next"/>
+                <w:b w:val="0"/>
+                <w:color w:val="14161B"/>
+                <w:sz w:val="19"/>
+                <w:u w:val="none"/>
+              </w:rPr>
+              <w:t xml:space="preserve"> _______ </w:t>
+            </w:r>
+            <w:r>
+              <w:rPr>
+                <w:rFonts w:ascii="Trade Gothic Next" w:hAnsi="Trade Gothic Next"/>
+                <w:b w:val="0"/>
+                <w:color w:val="14161B"/>
+                <w:sz w:val="19"/>
+                <w:u w:val="none"/>
+              </w:rPr>
+              <w:t xml:space="preserve"> electrons, charge </w:t>
+            </w:r>
+            <w:r>
+              <w:rPr>
+                <w:rFonts w:ascii="Trade Gothic Next" w:hAnsi="Trade Gothic Next"/>
+                <w:b w:val="0"/>
+                <w:color w:val="14161B"/>
+                <w:sz w:val="19"/>
+                <w:u w:val="none"/>
+              </w:rPr>
+              <w:t xml:space="preserve"> __________</w:t>
+            </w:r>
+            <w:r>
+              <w:rPr>
+                <w:rFonts w:ascii="Trade Gothic Next" w:hAnsi="Trade Gothic Next"/>
+                <w:b w:val="0"/>
+                <w:color w:val="14161B"/>
+                <w:sz w:val="19"/>
+                <w:u w:val="none"/>
+              </w:rPr>
+              <w:t xml:space="preserve">. Anion: </w:t>
+            </w:r>
+            <w:r>
+              <w:rPr>
+                <w:rFonts w:ascii="Trade Gothic Next" w:hAnsi="Trade Gothic Next"/>
+                <w:b w:val="0"/>
+                <w:color w:val="14161B"/>
+                <w:sz w:val="19"/>
+                <w:u w:val="none"/>
+              </w:rPr>
+              <w:t xml:space="preserve"> _______ </w:t>
+            </w:r>
+            <w:r>
+              <w:rPr>
+                <w:rFonts w:ascii="Trade Gothic Next" w:hAnsi="Trade Gothic Next"/>
+                <w:b w:val="0"/>
+                <w:color w:val="14161B"/>
+                <w:sz w:val="19"/>
+                <w:u w:val="none"/>
+              </w:rPr>
+              <w:t xml:space="preserve"> electrons, charge </w:t>
+            </w:r>
+            <w:r>
+              <w:rPr>
+                <w:rFonts w:ascii="Trade Gothic Next" w:hAnsi="Trade Gothic Next"/>
+                <w:b w:val="0"/>
+                <w:color w:val="14161B"/>
+                <w:sz w:val="19"/>
+                <w:u w:val="none"/>
+              </w:rPr>
+              <w:t xml:space="preserve"> __________</w:t>
+            </w:r>
+            <w:r>
+              <w:rPr>
+                <w:rFonts w:ascii="Trade Gothic Next" w:hAnsi="Trade Gothic Next"/>
+                <w:b w:val="0"/>
+                <w:color w:val="14161B"/>
+                <w:sz w:val="19"/>
+                <w:u w:val="none"/>
+              </w:rPr>
+              <w:t>.</w:t>
+            </w:r>
+          </w:p>
+          <w:p>
+            <w:pPr>
               <w:pBdr>
-                <w:bottom w:val="single" w:sz="4" w:color="C8CDC2"/>
+                <w:left w:val="single" w:sz="18" w:space="6" w:color="A3E635"/>
               </w:pBdr>
+              <w:spacing w:after="40" w:before="0"/>
             </w:pPr>
+            <w:r>
+              <w:rPr>
+                <w:rFonts w:ascii="Trade Gothic Next" w:hAnsi="Trade Gothic Next"/>
+                <w:b/>
+                <w:color w:val="14161B"/>
+                <w:sz w:val="19"/>
+                <w:u w:val="none"/>
+              </w:rPr>
+              <w:t xml:space="preserve">Electrons = atomic number − </w:t>
+            </w:r>
+            <w:r>
+              <w:rPr>
+                <w:rFonts w:ascii="Trade Gothic Next" w:hAnsi="Trade Gothic Next"/>
+                <w:b w:val="0"/>
+                <w:color w:val="14161B"/>
+                <w:sz w:val="19"/>
+                <w:u w:val="none"/>
+              </w:rPr>
+              <w:t xml:space="preserve"> ________</w:t>
+            </w:r>
+            <w:r>
+              <w:rPr>
+                <w:rFonts w:ascii="Trade Gothic Next" w:hAnsi="Trade Gothic Next"/>
+                <w:b/>
+                <w:color w:val="14161B"/>
+                <w:sz w:val="19"/>
+                <w:u w:val="none"/>
+              </w:rPr>
+              <w:t>.</w:t>
+            </w:r>
           </w:p>
           <w:p>
             <w:pPr>
@@ -8926,7 +9856,7 @@
             <w:tr>
               <w:trPr>
                 <w:cantSplit/>
-                <w:trHeight w:val="360" w:hRule="atLeast"/>
+                <w:trHeight w:val="316" w:hRule="atLeast"/>
               </w:trPr>
               <w:tc>
                 <w:tcPr>
@@ -8938,9 +9868,9 @@
                     <w:right w:val="single" w:sz="4" w:color="C8CDC2"/>
                   </w:tcBorders>
                   <w:tcMar>
-                    <w:top w:w="30" w:type="dxa"/>
+                    <w:top w:w="20" w:type="dxa"/>
                     <w:left w:w="70" w:type="dxa"/>
-                    <w:bottom w:w="30" w:type="dxa"/>
+                    <w:bottom w:w="20" w:type="dxa"/>
                     <w:right w:w="70" w:type="dxa"/>
                   </w:tcMar>
                   <w:vAlign w:val="center"/>
@@ -8972,9 +9902,9 @@
                     <w:right w:val="single" w:sz="4" w:color="C8CDC2"/>
                   </w:tcBorders>
                   <w:tcMar>
-                    <w:top w:w="30" w:type="dxa"/>
+                    <w:top w:w="20" w:type="dxa"/>
                     <w:left w:w="70" w:type="dxa"/>
-                    <w:bottom w:w="30" w:type="dxa"/>
+                    <w:bottom w:w="20" w:type="dxa"/>
                     <w:right w:w="70" w:type="dxa"/>
                   </w:tcMar>
                   <w:vAlign w:val="center"/>
@@ -8996,9 +9926,9 @@
                     <w:right w:val="single" w:sz="4" w:color="C8CDC2"/>
                   </w:tcBorders>
                   <w:tcMar>
-                    <w:top w:w="30" w:type="dxa"/>
+                    <w:top w:w="20" w:type="dxa"/>
                     <w:left w:w="70" w:type="dxa"/>
-                    <w:bottom w:w="30" w:type="dxa"/>
+                    <w:bottom w:w="20" w:type="dxa"/>
                     <w:right w:w="70" w:type="dxa"/>
                   </w:tcMar>
                   <w:vAlign w:val="center"/>
@@ -9020,9 +9950,9 @@
                     <w:right w:val="single" w:sz="4" w:color="C8CDC2"/>
                   </w:tcBorders>
                   <w:tcMar>
-                    <w:top w:w="30" w:type="dxa"/>
+                    <w:top w:w="20" w:type="dxa"/>
                     <w:left w:w="70" w:type="dxa"/>
-                    <w:bottom w:w="30" w:type="dxa"/>
+                    <w:bottom w:w="20" w:type="dxa"/>
                     <w:right w:w="70" w:type="dxa"/>
                   </w:tcMar>
                   <w:vAlign w:val="center"/>
@@ -9044,9 +9974,9 @@
                     <w:right w:val="single" w:sz="4" w:color="C8CDC2"/>
                   </w:tcBorders>
                   <w:tcMar>
-                    <w:top w:w="30" w:type="dxa"/>
+                    <w:top w:w="20" w:type="dxa"/>
                     <w:left w:w="70" w:type="dxa"/>
-                    <w:bottom w:w="30" w:type="dxa"/>
+                    <w:bottom w:w="20" w:type="dxa"/>
                     <w:right w:w="70" w:type="dxa"/>
                   </w:tcMar>
                   <w:vAlign w:val="center"/>
@@ -9068,9 +9998,9 @@
                     <w:right w:val="single" w:sz="4" w:color="C8CDC2"/>
                   </w:tcBorders>
                   <w:tcMar>
-                    <w:top w:w="30" w:type="dxa"/>
+                    <w:top w:w="20" w:type="dxa"/>
                     <w:left w:w="70" w:type="dxa"/>
-                    <w:bottom w:w="30" w:type="dxa"/>
+                    <w:bottom w:w="20" w:type="dxa"/>
                     <w:right w:w="70" w:type="dxa"/>
                   </w:tcMar>
                   <w:vAlign w:val="center"/>
@@ -9092,9 +10022,9 @@
                     <w:right w:val="single" w:sz="4" w:color="C8CDC2"/>
                   </w:tcBorders>
                   <w:tcMar>
-                    <w:top w:w="30" w:type="dxa"/>
+                    <w:top w:w="20" w:type="dxa"/>
                     <w:left w:w="70" w:type="dxa"/>
-                    <w:bottom w:w="30" w:type="dxa"/>
+                    <w:bottom w:w="20" w:type="dxa"/>
                     <w:right w:w="70" w:type="dxa"/>
                   </w:tcMar>
                   <w:vAlign w:val="center"/>
@@ -9410,7 +10340,7 @@
             <w:tr>
               <w:trPr>
                 <w:cantSplit/>
-                <w:trHeight w:val="360" w:hRule="atLeast"/>
+                <w:trHeight w:val="316" w:hRule="atLeast"/>
               </w:trPr>
               <w:tc>
                 <w:tcPr>
@@ -9422,9 +10352,9 @@
                     <w:right w:val="single" w:sz="4" w:color="C8CDC2"/>
                   </w:tcBorders>
                   <w:tcMar>
-                    <w:top w:w="30" w:type="dxa"/>
+                    <w:top w:w="20" w:type="dxa"/>
                     <w:left w:w="70" w:type="dxa"/>
-                    <w:bottom w:w="30" w:type="dxa"/>
+                    <w:bottom w:w="20" w:type="dxa"/>
                     <w:right w:w="70" w:type="dxa"/>
                   </w:tcMar>
                   <w:vAlign w:val="center"/>
@@ -9456,9 +10386,9 @@
                     <w:right w:val="single" w:sz="4" w:color="C8CDC2"/>
                   </w:tcBorders>
                   <w:tcMar>
-                    <w:top w:w="30" w:type="dxa"/>
+                    <w:top w:w="20" w:type="dxa"/>
                     <w:left w:w="70" w:type="dxa"/>
-                    <w:bottom w:w="30" w:type="dxa"/>
+                    <w:bottom w:w="20" w:type="dxa"/>
                     <w:right w:w="70" w:type="dxa"/>
                   </w:tcMar>
                   <w:vAlign w:val="center"/>
@@ -9490,9 +10420,9 @@
                     <w:right w:val="single" w:sz="4" w:color="C8CDC2"/>
                   </w:tcBorders>
                   <w:tcMar>
-                    <w:top w:w="30" w:type="dxa"/>
+                    <w:top w:w="20" w:type="dxa"/>
                     <w:left w:w="70" w:type="dxa"/>
-                    <w:bottom w:w="30" w:type="dxa"/>
+                    <w:bottom w:w="20" w:type="dxa"/>
                     <w:right w:w="70" w:type="dxa"/>
                   </w:tcMar>
                   <w:vAlign w:val="center"/>
@@ -9514,9 +10444,9 @@
                     <w:right w:val="single" w:sz="4" w:color="C8CDC2"/>
                   </w:tcBorders>
                   <w:tcMar>
-                    <w:top w:w="30" w:type="dxa"/>
+                    <w:top w:w="20" w:type="dxa"/>
                     <w:left w:w="70" w:type="dxa"/>
-                    <w:bottom w:w="30" w:type="dxa"/>
+                    <w:bottom w:w="20" w:type="dxa"/>
                     <w:right w:w="70" w:type="dxa"/>
                   </w:tcMar>
                   <w:vAlign w:val="center"/>
@@ -9538,9 +10468,9 @@
                     <w:right w:val="single" w:sz="4" w:color="C8CDC2"/>
                   </w:tcBorders>
                   <w:tcMar>
-                    <w:top w:w="30" w:type="dxa"/>
+                    <w:top w:w="20" w:type="dxa"/>
                     <w:left w:w="70" w:type="dxa"/>
-                    <w:bottom w:w="30" w:type="dxa"/>
+                    <w:bottom w:w="20" w:type="dxa"/>
                     <w:right w:w="70" w:type="dxa"/>
                   </w:tcMar>
                   <w:vAlign w:val="center"/>
@@ -9562,9 +10492,9 @@
                     <w:right w:val="single" w:sz="4" w:color="C8CDC2"/>
                   </w:tcBorders>
                   <w:tcMar>
-                    <w:top w:w="30" w:type="dxa"/>
+                    <w:top w:w="20" w:type="dxa"/>
                     <w:left w:w="70" w:type="dxa"/>
-                    <w:bottom w:w="30" w:type="dxa"/>
+                    <w:bottom w:w="20" w:type="dxa"/>
                     <w:right w:w="70" w:type="dxa"/>
                   </w:tcMar>
                   <w:vAlign w:val="center"/>
@@ -9580,7 +10510,7 @@
             <w:tr>
               <w:trPr>
                 <w:cantSplit/>
-                <w:trHeight w:val="360" w:hRule="atLeast"/>
+                <w:trHeight w:val="316" w:hRule="atLeast"/>
               </w:trPr>
               <w:tc>
                 <w:tcPr>
@@ -9592,9 +10522,9 @@
                     <w:right w:val="single" w:sz="4" w:color="C8CDC2"/>
                   </w:tcBorders>
                   <w:tcMar>
-                    <w:top w:w="30" w:type="dxa"/>
+                    <w:top w:w="20" w:type="dxa"/>
                     <w:left w:w="70" w:type="dxa"/>
-                    <w:bottom w:w="30" w:type="dxa"/>
+                    <w:bottom w:w="20" w:type="dxa"/>
                     <w:right w:w="70" w:type="dxa"/>
                   </w:tcMar>
                   <w:vAlign w:val="center"/>
@@ -9626,9 +10556,9 @@
                     <w:right w:val="single" w:sz="4" w:color="C8CDC2"/>
                   </w:tcBorders>
                   <w:tcMar>
-                    <w:top w:w="30" w:type="dxa"/>
+                    <w:top w:w="20" w:type="dxa"/>
                     <w:left w:w="70" w:type="dxa"/>
-                    <w:bottom w:w="30" w:type="dxa"/>
+                    <w:bottom w:w="20" w:type="dxa"/>
                     <w:right w:w="70" w:type="dxa"/>
                   </w:tcMar>
                   <w:vAlign w:val="center"/>
@@ -9660,9 +10590,9 @@
                     <w:right w:val="single" w:sz="4" w:color="C8CDC2"/>
                   </w:tcBorders>
                   <w:tcMar>
-                    <w:top w:w="30" w:type="dxa"/>
+                    <w:top w:w="20" w:type="dxa"/>
                     <w:left w:w="70" w:type="dxa"/>
-                    <w:bottom w:w="30" w:type="dxa"/>
+                    <w:bottom w:w="20" w:type="dxa"/>
                     <w:right w:w="70" w:type="dxa"/>
                   </w:tcMar>
                   <w:vAlign w:val="center"/>
@@ -9684,9 +10614,9 @@
                     <w:right w:val="single" w:sz="4" w:color="C8CDC2"/>
                   </w:tcBorders>
                   <w:tcMar>
-                    <w:top w:w="30" w:type="dxa"/>
+                    <w:top w:w="20" w:type="dxa"/>
                     <w:left w:w="70" w:type="dxa"/>
-                    <w:bottom w:w="30" w:type="dxa"/>
+                    <w:bottom w:w="20" w:type="dxa"/>
                     <w:right w:w="70" w:type="dxa"/>
                   </w:tcMar>
                   <w:vAlign w:val="center"/>
@@ -9708,9 +10638,9 @@
                     <w:right w:val="single" w:sz="4" w:color="C8CDC2"/>
                   </w:tcBorders>
                   <w:tcMar>
-                    <w:top w:w="30" w:type="dxa"/>
+                    <w:top w:w="20" w:type="dxa"/>
                     <w:left w:w="70" w:type="dxa"/>
-                    <w:bottom w:w="30" w:type="dxa"/>
+                    <w:bottom w:w="20" w:type="dxa"/>
                     <w:right w:w="70" w:type="dxa"/>
                   </w:tcMar>
                   <w:vAlign w:val="center"/>
@@ -9732,9 +10662,9 @@
                     <w:right w:val="single" w:sz="4" w:color="C8CDC2"/>
                   </w:tcBorders>
                   <w:tcMar>
-                    <w:top w:w="30" w:type="dxa"/>
+                    <w:top w:w="20" w:type="dxa"/>
                     <w:left w:w="70" w:type="dxa"/>
-                    <w:bottom w:w="30" w:type="dxa"/>
+                    <w:bottom w:w="20" w:type="dxa"/>
                     <w:right w:w="70" w:type="dxa"/>
                   </w:tcMar>
                   <w:vAlign w:val="center"/>
@@ -9750,7 +10680,7 @@
             <w:tr>
               <w:trPr>
                 <w:cantSplit/>
-                <w:trHeight w:val="360" w:hRule="atLeast"/>
+                <w:trHeight w:val="316" w:hRule="atLeast"/>
               </w:trPr>
               <w:tc>
                 <w:tcPr>
@@ -9762,9 +10692,9 @@
                     <w:right w:val="single" w:sz="4" w:color="C8CDC2"/>
                   </w:tcBorders>
                   <w:tcMar>
-                    <w:top w:w="30" w:type="dxa"/>
+                    <w:top w:w="20" w:type="dxa"/>
                     <w:left w:w="70" w:type="dxa"/>
-                    <w:bottom w:w="30" w:type="dxa"/>
+                    <w:bottom w:w="20" w:type="dxa"/>
                     <w:right w:w="70" w:type="dxa"/>
                   </w:tcMar>
                   <w:vAlign w:val="center"/>
@@ -9796,9 +10726,9 @@
                     <w:right w:val="single" w:sz="4" w:color="C8CDC2"/>
                   </w:tcBorders>
                   <w:tcMar>
-                    <w:top w:w="30" w:type="dxa"/>
+                    <w:top w:w="20" w:type="dxa"/>
                     <w:left w:w="70" w:type="dxa"/>
-                    <w:bottom w:w="30" w:type="dxa"/>
+                    <w:bottom w:w="20" w:type="dxa"/>
                     <w:right w:w="70" w:type="dxa"/>
                   </w:tcMar>
                   <w:vAlign w:val="center"/>
@@ -9830,9 +10760,9 @@
                     <w:right w:val="single" w:sz="4" w:color="C8CDC2"/>
                   </w:tcBorders>
                   <w:tcMar>
-                    <w:top w:w="30" w:type="dxa"/>
+                    <w:top w:w="20" w:type="dxa"/>
                     <w:left w:w="70" w:type="dxa"/>
-                    <w:bottom w:w="30" w:type="dxa"/>
+                    <w:bottom w:w="20" w:type="dxa"/>
                     <w:right w:w="70" w:type="dxa"/>
                   </w:tcMar>
                   <w:vAlign w:val="center"/>
@@ -9854,9 +10784,9 @@
                     <w:right w:val="single" w:sz="4" w:color="C8CDC2"/>
                   </w:tcBorders>
                   <w:tcMar>
-                    <w:top w:w="30" w:type="dxa"/>
+                    <w:top w:w="20" w:type="dxa"/>
                     <w:left w:w="70" w:type="dxa"/>
-                    <w:bottom w:w="30" w:type="dxa"/>
+                    <w:bottom w:w="20" w:type="dxa"/>
                     <w:right w:w="70" w:type="dxa"/>
                   </w:tcMar>
                   <w:vAlign w:val="center"/>
@@ -9878,9 +10808,9 @@
                     <w:right w:val="single" w:sz="4" w:color="C8CDC2"/>
                   </w:tcBorders>
                   <w:tcMar>
-                    <w:top w:w="30" w:type="dxa"/>
+                    <w:top w:w="20" w:type="dxa"/>
                     <w:left w:w="70" w:type="dxa"/>
-                    <w:bottom w:w="30" w:type="dxa"/>
+                    <w:bottom w:w="20" w:type="dxa"/>
                     <w:right w:w="70" w:type="dxa"/>
                   </w:tcMar>
                   <w:vAlign w:val="center"/>
@@ -9902,9 +10832,9 @@
                     <w:right w:val="single" w:sz="4" w:color="C8CDC2"/>
                   </w:tcBorders>
                   <w:tcMar>
-                    <w:top w:w="30" w:type="dxa"/>
+                    <w:top w:w="20" w:type="dxa"/>
                     <w:left w:w="70" w:type="dxa"/>
-                    <w:bottom w:w="30" w:type="dxa"/>
+                    <w:bottom w:w="20" w:type="dxa"/>
                     <w:right w:w="70" w:type="dxa"/>
                   </w:tcMar>
                   <w:vAlign w:val="center"/>
@@ -9920,7 +10850,7 @@
             <w:tr>
               <w:trPr>
                 <w:cantSplit/>
-                <w:trHeight w:val="360" w:hRule="atLeast"/>
+                <w:trHeight w:val="316" w:hRule="atLeast"/>
               </w:trPr>
               <w:tc>
                 <w:tcPr>
@@ -9932,9 +10862,9 @@
                     <w:right w:val="single" w:sz="4" w:color="C8CDC2"/>
                   </w:tcBorders>
                   <w:tcMar>
-                    <w:top w:w="30" w:type="dxa"/>
+                    <w:top w:w="20" w:type="dxa"/>
                     <w:left w:w="70" w:type="dxa"/>
-                    <w:bottom w:w="30" w:type="dxa"/>
+                    <w:bottom w:w="20" w:type="dxa"/>
                     <w:right w:w="70" w:type="dxa"/>
                   </w:tcMar>
                   <w:vAlign w:val="center"/>
@@ -9966,9 +10896,9 @@
                     <w:right w:val="single" w:sz="4" w:color="C8CDC2"/>
                   </w:tcBorders>
                   <w:tcMar>
-                    <w:top w:w="30" w:type="dxa"/>
+                    <w:top w:w="20" w:type="dxa"/>
                     <w:left w:w="70" w:type="dxa"/>
-                    <w:bottom w:w="30" w:type="dxa"/>
+                    <w:bottom w:w="20" w:type="dxa"/>
                     <w:right w:w="70" w:type="dxa"/>
                   </w:tcMar>
                   <w:vAlign w:val="center"/>
@@ -10000,9 +10930,9 @@
                     <w:right w:val="single" w:sz="4" w:color="C8CDC2"/>
                   </w:tcBorders>
                   <w:tcMar>
-                    <w:top w:w="30" w:type="dxa"/>
+                    <w:top w:w="20" w:type="dxa"/>
                     <w:left w:w="70" w:type="dxa"/>
-                    <w:bottom w:w="30" w:type="dxa"/>
+                    <w:bottom w:w="20" w:type="dxa"/>
                     <w:right w:w="70" w:type="dxa"/>
                   </w:tcMar>
                   <w:vAlign w:val="center"/>
@@ -10024,9 +10954,9 @@
                     <w:right w:val="single" w:sz="4" w:color="C8CDC2"/>
                   </w:tcBorders>
                   <w:tcMar>
-                    <w:top w:w="30" w:type="dxa"/>
+                    <w:top w:w="20" w:type="dxa"/>
                     <w:left w:w="70" w:type="dxa"/>
-                    <w:bottom w:w="30" w:type="dxa"/>
+                    <w:bottom w:w="20" w:type="dxa"/>
                     <w:right w:w="70" w:type="dxa"/>
                   </w:tcMar>
                   <w:vAlign w:val="center"/>
@@ -10048,9 +10978,9 @@
                     <w:right w:val="single" w:sz="4" w:color="C8CDC2"/>
                   </w:tcBorders>
                   <w:tcMar>
-                    <w:top w:w="30" w:type="dxa"/>
+                    <w:top w:w="20" w:type="dxa"/>
                     <w:left w:w="70" w:type="dxa"/>
-                    <w:bottom w:w="30" w:type="dxa"/>
+                    <w:bottom w:w="20" w:type="dxa"/>
                     <w:right w:w="70" w:type="dxa"/>
                   </w:tcMar>
                   <w:vAlign w:val="center"/>
@@ -10072,9 +11002,9 @@
                     <w:right w:val="single" w:sz="4" w:color="C8CDC2"/>
                   </w:tcBorders>
                   <w:tcMar>
-                    <w:top w:w="30" w:type="dxa"/>
+                    <w:top w:w="20" w:type="dxa"/>
                     <w:left w:w="70" w:type="dxa"/>
-                    <w:bottom w:w="30" w:type="dxa"/>
+                    <w:bottom w:w="20" w:type="dxa"/>
                     <w:right w:w="70" w:type="dxa"/>
                   </w:tcMar>
                   <w:vAlign w:val="center"/>
@@ -10172,11 +11102,58 @@
           </w:p>
           <w:p>
             <w:pPr>
-              <w:spacing w:after="120"/>
-              <w:pBdr>
-                <w:bottom w:val="single" w:sz="4" w:color="C8CDC2"/>
-              </w:pBdr>
+              <w:spacing w:after="40" w:before="0"/>
             </w:pPr>
+            <w:r>
+              <w:rPr>
+                <w:rFonts w:ascii="Trade Gothic Next" w:hAnsi="Trade Gothic Next"/>
+                <w:b w:val="0"/>
+                <w:color w:val="14161B"/>
+                <w:sz w:val="19"/>
+                <w:u w:val="none"/>
+              </w:rPr>
+              <w:t xml:space="preserve">The </w:t>
+            </w:r>
+            <w:r>
+              <w:rPr>
+                <w:rFonts w:ascii="Trade Gothic Next" w:hAnsi="Trade Gothic Next"/>
+                <w:b w:val="0"/>
+                <w:color w:val="14161B"/>
+                <w:sz w:val="19"/>
+                <w:u w:val="none"/>
+              </w:rPr>
+              <w:t xml:space="preserve"> ______ </w:t>
+            </w:r>
+            <w:r>
+              <w:rPr>
+                <w:rFonts w:ascii="Trade Gothic Next" w:hAnsi="Trade Gothic Next"/>
+                <w:b w:val="0"/>
+                <w:color w:val="14161B"/>
+                <w:sz w:val="19"/>
+                <w:u w:val="none"/>
+              </w:rPr>
+              <w:t xml:space="preserve"> electrons leave before the </w:t>
+            </w:r>
+            <w:r>
+              <w:rPr>
+                <w:rFonts w:ascii="Trade Gothic Next" w:hAnsi="Trade Gothic Next"/>
+                <w:b w:val="0"/>
+                <w:color w:val="14161B"/>
+                <w:sz w:val="19"/>
+                <w:u w:val="none"/>
+              </w:rPr>
+              <w:t xml:space="preserve"> ______ </w:t>
+            </w:r>
+            <w:r>
+              <w:rPr>
+                <w:rFonts w:ascii="Trade Gothic Next" w:hAnsi="Trade Gothic Next"/>
+                <w:b w:val="0"/>
+                <w:color w:val="14161B"/>
+                <w:sz w:val="19"/>
+                <w:u w:val="none"/>
+              </w:rPr>
+              <w:t xml:space="preserve"> electrons.</w:t>
+            </w:r>
           </w:p>
           <w:tbl>
             <w:tblPr>
@@ -10291,7 +11268,7 @@
             <w:tr>
               <w:trPr>
                 <w:cantSplit/>
-                <w:trHeight w:val="360" w:hRule="atLeast"/>
+                <w:trHeight w:val="316" w:hRule="atLeast"/>
               </w:trPr>
               <w:tc>
                 <w:tcPr>
@@ -10303,9 +11280,9 @@
                     <w:right w:val="single" w:sz="4" w:color="C8CDC2"/>
                   </w:tcBorders>
                   <w:tcMar>
-                    <w:top w:w="30" w:type="dxa"/>
+                    <w:top w:w="20" w:type="dxa"/>
                     <w:left w:w="70" w:type="dxa"/>
-                    <w:bottom w:w="30" w:type="dxa"/>
+                    <w:bottom w:w="20" w:type="dxa"/>
                     <w:right w:w="70" w:type="dxa"/>
                   </w:tcMar>
                   <w:vAlign w:val="center"/>
@@ -10337,9 +11314,9 @@
                     <w:right w:val="single" w:sz="4" w:color="C8CDC2"/>
                   </w:tcBorders>
                   <w:tcMar>
-                    <w:top w:w="30" w:type="dxa"/>
+                    <w:top w:w="20" w:type="dxa"/>
                     <w:left w:w="70" w:type="dxa"/>
-                    <w:bottom w:w="30" w:type="dxa"/>
+                    <w:bottom w:w="20" w:type="dxa"/>
                     <w:right w:w="70" w:type="dxa"/>
                   </w:tcMar>
                   <w:vAlign w:val="center"/>
@@ -10403,9 +11380,9 @@
                     <w:right w:val="single" w:sz="4" w:color="C8CDC2"/>
                   </w:tcBorders>
                   <w:tcMar>
-                    <w:top w:w="30" w:type="dxa"/>
+                    <w:top w:w="20" w:type="dxa"/>
                     <w:left w:w="70" w:type="dxa"/>
-                    <w:bottom w:w="30" w:type="dxa"/>
+                    <w:bottom w:w="20" w:type="dxa"/>
                     <w:right w:w="70" w:type="dxa"/>
                   </w:tcMar>
                   <w:vAlign w:val="center"/>
@@ -10431,7 +11408,7 @@
             <w:tr>
               <w:trPr>
                 <w:cantSplit/>
-                <w:trHeight w:val="360" w:hRule="atLeast"/>
+                <w:trHeight w:val="316" w:hRule="atLeast"/>
               </w:trPr>
               <w:tc>
                 <w:tcPr>
@@ -10443,9 +11420,9 @@
                     <w:right w:val="single" w:sz="4" w:color="C8CDC2"/>
                   </w:tcBorders>
                   <w:tcMar>
-                    <w:top w:w="30" w:type="dxa"/>
+                    <w:top w:w="20" w:type="dxa"/>
                     <w:left w:w="70" w:type="dxa"/>
-                    <w:bottom w:w="30" w:type="dxa"/>
+                    <w:bottom w:w="20" w:type="dxa"/>
                     <w:right w:w="70" w:type="dxa"/>
                   </w:tcMar>
                   <w:vAlign w:val="center"/>
@@ -10477,9 +11454,9 @@
                     <w:right w:val="single" w:sz="4" w:color="C8CDC2"/>
                   </w:tcBorders>
                   <w:tcMar>
-                    <w:top w:w="30" w:type="dxa"/>
+                    <w:top w:w="20" w:type="dxa"/>
                     <w:left w:w="70" w:type="dxa"/>
-                    <w:bottom w:w="30" w:type="dxa"/>
+                    <w:bottom w:w="20" w:type="dxa"/>
                     <w:right w:w="70" w:type="dxa"/>
                   </w:tcMar>
                   <w:vAlign w:val="center"/>
@@ -10543,9 +11520,9 @@
                     <w:right w:val="single" w:sz="4" w:color="C8CDC2"/>
                   </w:tcBorders>
                   <w:tcMar>
-                    <w:top w:w="30" w:type="dxa"/>
+                    <w:top w:w="20" w:type="dxa"/>
                     <w:left w:w="70" w:type="dxa"/>
-                    <w:bottom w:w="30" w:type="dxa"/>
+                    <w:bottom w:w="20" w:type="dxa"/>
                     <w:right w:w="70" w:type="dxa"/>
                   </w:tcMar>
                   <w:vAlign w:val="center"/>
@@ -10571,7 +11548,7 @@
             <w:tr>
               <w:trPr>
                 <w:cantSplit/>
-                <w:trHeight w:val="360" w:hRule="atLeast"/>
+                <w:trHeight w:val="316" w:hRule="atLeast"/>
               </w:trPr>
               <w:tc>
                 <w:tcPr>
@@ -10583,9 +11560,9 @@
                     <w:right w:val="single" w:sz="4" w:color="C8CDC2"/>
                   </w:tcBorders>
                   <w:tcMar>
-                    <w:top w:w="30" w:type="dxa"/>
+                    <w:top w:w="20" w:type="dxa"/>
                     <w:left w:w="70" w:type="dxa"/>
-                    <w:bottom w:w="30" w:type="dxa"/>
+                    <w:bottom w:w="20" w:type="dxa"/>
                     <w:right w:w="70" w:type="dxa"/>
                   </w:tcMar>
                   <w:vAlign w:val="center"/>
@@ -10617,9 +11594,9 @@
                     <w:right w:val="single" w:sz="4" w:color="C8CDC2"/>
                   </w:tcBorders>
                   <w:tcMar>
-                    <w:top w:w="30" w:type="dxa"/>
+                    <w:top w:w="20" w:type="dxa"/>
                     <w:left w:w="70" w:type="dxa"/>
-                    <w:bottom w:w="30" w:type="dxa"/>
+                    <w:bottom w:w="20" w:type="dxa"/>
                     <w:right w:w="70" w:type="dxa"/>
                   </w:tcMar>
                   <w:vAlign w:val="center"/>
@@ -10662,9 +11639,9 @@
                     <w:right w:val="single" w:sz="4" w:color="C8CDC2"/>
                   </w:tcBorders>
                   <w:tcMar>
-                    <w:top w:w="30" w:type="dxa"/>
+                    <w:top w:w="20" w:type="dxa"/>
                     <w:left w:w="70" w:type="dxa"/>
-                    <w:bottom w:w="30" w:type="dxa"/>
+                    <w:bottom w:w="20" w:type="dxa"/>
                     <w:right w:w="70" w:type="dxa"/>
                   </w:tcMar>
                   <w:vAlign w:val="center"/>
@@ -10734,6 +11711,21 @@
               <w:t>ISOELECTRONIC</w:t>
             </w:r>
           </w:p>
+          <w:p>
+            <w:pPr>
+              <w:spacing w:after="40" w:before="0"/>
+            </w:pPr>
+            <w:r>
+              <w:rPr>
+                <w:rFonts w:ascii="Trade Gothic Next" w:hAnsi="Trade Gothic Next"/>
+                <w:b w:val="0"/>
+                <w:color w:val="14161B"/>
+                <w:sz w:val="17"/>
+                <w:u w:val="none"/>
+              </w:rPr>
+              <w:t>Definition — isoelectronic</w:t>
+            </w:r>
+          </w:p>
         </w:tc>
         <w:tc>
           <w:tcPr>
@@ -10758,6 +11750,44 @@
                 <w:spacing w:val="26"/>
               </w:rPr>
               <w:t>DIFFERENT ATOMS, SAME ELECTRON COUNT</w:t>
+            </w:r>
+          </w:p>
+          <w:p>
+            <w:pPr>
+              <w:pBdr>
+                <w:left w:val="single" w:sz="18" w:space="6" w:color="A3E635"/>
+              </w:pBdr>
+              <w:spacing w:after="40" w:before="0"/>
+            </w:pPr>
+            <w:r>
+              <w:rPr>
+                <w:rFonts w:ascii="Trade Gothic Next" w:hAnsi="Trade Gothic Next"/>
+                <w:b/>
+                <w:color w:val="14161B"/>
+                <w:sz w:val="19"/>
+                <w:u w:val="none"/>
+              </w:rPr>
+              <w:t xml:space="preserve">Isoelectronic means the same </w:t>
+            </w:r>
+            <w:r>
+              <w:rPr>
+                <w:rFonts w:ascii="Trade Gothic Next" w:hAnsi="Trade Gothic Next"/>
+                <w:b w:val="0"/>
+                <w:color w:val="14161B"/>
+                <w:sz w:val="19"/>
+                <w:u w:val="none"/>
+              </w:rPr>
+              <w:t xml:space="preserve"> ________________ </w:t>
+            </w:r>
+            <w:r>
+              <w:rPr>
+                <w:rFonts w:ascii="Trade Gothic Next" w:hAnsi="Trade Gothic Next"/>
+                <w:b/>
+                <w:color w:val="14161B"/>
+                <w:sz w:val="19"/>
+                <w:u w:val="none"/>
+              </w:rPr>
+              <w:t xml:space="preserve"> and arrangement.</w:t>
             </w:r>
           </w:p>
           <w:p>
@@ -11054,6 +12084,21 @@
               <w:t>ABSORPTION AND EMISSION</w:t>
             </w:r>
           </w:p>
+          <w:p>
+            <w:pPr>
+              <w:spacing w:after="40" w:before="0"/>
+            </w:pPr>
+            <w:r>
+              <w:rPr>
+                <w:rFonts w:ascii="Trade Gothic Next" w:hAnsi="Trade Gothic Next"/>
+                <w:b w:val="0"/>
+                <w:color w:val="14161B"/>
+                <w:sz w:val="17"/>
+                <w:u w:val="none"/>
+              </w:rPr>
+              <w:t>Definition — photon</w:t>
+            </w:r>
+          </w:p>
         </w:tc>
         <w:tc>
           <w:tcPr>
@@ -11082,19 +12127,61 @@
           </w:p>
           <w:p>
             <w:pPr>
-              <w:spacing w:after="120"/>
               <w:pBdr>
-                <w:bottom w:val="single" w:sz="4" w:color="C8CDC2"/>
+                <w:left w:val="single" w:sz="18" w:space="6" w:color="A3E635"/>
               </w:pBdr>
+              <w:spacing w:after="40" w:before="0"/>
             </w:pPr>
-          </w:p>
-          <w:p>
-            <w:pPr>
-              <w:spacing w:after="120"/>
-              <w:pBdr>
-                <w:bottom w:val="single" w:sz="4" w:color="C8CDC2"/>
-              </w:pBdr>
-            </w:pPr>
+            <w:r>
+              <w:rPr>
+                <w:rFonts w:ascii="Trade Gothic Next" w:hAnsi="Trade Gothic Next"/>
+                <w:b/>
+                <w:color w:val="14161B"/>
+                <w:sz w:val="19"/>
+                <w:u w:val="none"/>
+              </w:rPr>
+              <w:t xml:space="preserve">A photon is a packet of </w:t>
+            </w:r>
+            <w:r>
+              <w:rPr>
+                <w:rFonts w:ascii="Trade Gothic Next" w:hAnsi="Trade Gothic Next"/>
+                <w:b w:val="0"/>
+                <w:color w:val="14161B"/>
+                <w:sz w:val="19"/>
+                <w:u w:val="none"/>
+              </w:rPr>
+              <w:t xml:space="preserve"> ______________</w:t>
+            </w:r>
+            <w:r>
+              <w:rPr>
+                <w:rFonts w:ascii="Trade Gothic Next" w:hAnsi="Trade Gothic Next"/>
+                <w:b/>
+                <w:color w:val="14161B"/>
+                <w:sz w:val="19"/>
+                <w:u w:val="none"/>
+              </w:rPr>
+              <w:t xml:space="preserve">; its energy equals the </w:t>
+            </w:r>
+            <w:r>
+              <w:rPr>
+                <w:rFonts w:ascii="Trade Gothic Next" w:hAnsi="Trade Gothic Next"/>
+                <w:b w:val="0"/>
+                <w:color w:val="14161B"/>
+                <w:sz w:val="19"/>
+                <w:u w:val="none"/>
+              </w:rPr>
+              <w:t xml:space="preserve"> ______ </w:t>
+            </w:r>
+            <w:r>
+              <w:rPr>
+                <w:rFonts w:ascii="Trade Gothic Next" w:hAnsi="Trade Gothic Next"/>
+                <w:b/>
+                <w:color w:val="14161B"/>
+                <w:sz w:val="19"/>
+                <w:u w:val="none"/>
+              </w:rPr>
+              <w:t xml:space="preserve"> between levels.</w:t>
+            </w:r>
           </w:p>
           <w:tbl>
             <w:tblPr>
@@ -11177,7 +12264,7 @@
             <w:tr>
               <w:trPr>
                 <w:cantSplit/>
-                <w:trHeight w:val="360" w:hRule="atLeast"/>
+                <w:trHeight w:val="316" w:hRule="atLeast"/>
               </w:trPr>
               <w:tc>
                 <w:tcPr>
@@ -11189,9 +12276,9 @@
                     <w:right w:val="single" w:sz="4" w:color="C8CDC2"/>
                   </w:tcBorders>
                   <w:tcMar>
-                    <w:top w:w="30" w:type="dxa"/>
+                    <w:top w:w="20" w:type="dxa"/>
                     <w:left w:w="70" w:type="dxa"/>
-                    <w:bottom w:w="30" w:type="dxa"/>
+                    <w:bottom w:w="20" w:type="dxa"/>
                     <w:right w:w="70" w:type="dxa"/>
                   </w:tcMar>
                   <w:vAlign w:val="center"/>
@@ -11223,9 +12310,9 @@
                     <w:right w:val="single" w:sz="4" w:color="C8CDC2"/>
                   </w:tcBorders>
                   <w:tcMar>
-                    <w:top w:w="30" w:type="dxa"/>
+                    <w:top w:w="20" w:type="dxa"/>
                     <w:left w:w="70" w:type="dxa"/>
-                    <w:bottom w:w="30" w:type="dxa"/>
+                    <w:bottom w:w="20" w:type="dxa"/>
                     <w:right w:w="70" w:type="dxa"/>
                   </w:tcMar>
                   <w:vAlign w:val="center"/>
@@ -11241,7 +12328,7 @@
             <w:tr>
               <w:trPr>
                 <w:cantSplit/>
-                <w:trHeight w:val="360" w:hRule="atLeast"/>
+                <w:trHeight w:val="316" w:hRule="atLeast"/>
               </w:trPr>
               <w:tc>
                 <w:tcPr>
@@ -11253,9 +12340,9 @@
                     <w:right w:val="single" w:sz="4" w:color="C8CDC2"/>
                   </w:tcBorders>
                   <w:tcMar>
-                    <w:top w:w="30" w:type="dxa"/>
+                    <w:top w:w="20" w:type="dxa"/>
                     <w:left w:w="70" w:type="dxa"/>
-                    <w:bottom w:w="30" w:type="dxa"/>
+                    <w:bottom w:w="20" w:type="dxa"/>
                     <w:right w:w="70" w:type="dxa"/>
                   </w:tcMar>
                   <w:vAlign w:val="center"/>
@@ -11287,9 +12374,9 @@
                     <w:right w:val="single" w:sz="4" w:color="C8CDC2"/>
                   </w:tcBorders>
                   <w:tcMar>
-                    <w:top w:w="30" w:type="dxa"/>
+                    <w:top w:w="20" w:type="dxa"/>
                     <w:left w:w="70" w:type="dxa"/>
-                    <w:bottom w:w="30" w:type="dxa"/>
+                    <w:bottom w:w="20" w:type="dxa"/>
                     <w:right w:w="70" w:type="dxa"/>
                   </w:tcMar>
                   <w:vAlign w:val="center"/>
@@ -11357,6 +12444,21 @@
                 <w:sz w:val="14"/>
               </w:rPr>
               <w:t>LARGEST ENERGY DROP</w:t>
+            </w:r>
+          </w:p>
+          <w:p>
+            <w:pPr>
+              <w:spacing w:after="40" w:before="0"/>
+            </w:pPr>
+            <w:r>
+              <w:rPr>
+                <w:rFonts w:ascii="Trade Gothic Next" w:hAnsi="Trade Gothic Next"/>
+                <w:b w:val="0"/>
+                <w:color w:val="14161B"/>
+                <w:sz w:val="17"/>
+                <w:u w:val="none"/>
+              </w:rPr>
+              <w:t>Example</w:t>
             </w:r>
           </w:p>
         </w:tc>
@@ -11473,11 +12575,58 @@
           </w:p>
           <w:p>
             <w:pPr>
-              <w:spacing w:after="120"/>
-              <w:pBdr>
-                <w:bottom w:val="single" w:sz="4" w:color="C8CDC2"/>
-              </w:pBdr>
+              <w:spacing w:after="40" w:before="0"/>
             </w:pPr>
+            <w:r>
+              <w:rPr>
+                <w:rFonts w:ascii="Trade Gothic Next" w:hAnsi="Trade Gothic Next"/>
+                <w:b w:val="0"/>
+                <w:color w:val="14161B"/>
+                <w:sz w:val="19"/>
+                <w:u w:val="none"/>
+              </w:rPr>
+              <w:t xml:space="preserve">Shorter wavelength means </w:t>
+            </w:r>
+            <w:r>
+              <w:rPr>
+                <w:rFonts w:ascii="Trade Gothic Next" w:hAnsi="Trade Gothic Next"/>
+                <w:b w:val="0"/>
+                <w:color w:val="14161B"/>
+                <w:sz w:val="19"/>
+                <w:u w:val="none"/>
+              </w:rPr>
+              <w:t xml:space="preserve"> ______ </w:t>
+            </w:r>
+            <w:r>
+              <w:rPr>
+                <w:rFonts w:ascii="Trade Gothic Next" w:hAnsi="Trade Gothic Next"/>
+                <w:b w:val="0"/>
+                <w:color w:val="14161B"/>
+                <w:sz w:val="19"/>
+                <w:u w:val="none"/>
+              </w:rPr>
+              <w:t xml:space="preserve"> energy. Visible light is about </w:t>
+            </w:r>
+            <w:r>
+              <w:rPr>
+                <w:rFonts w:ascii="Trade Gothic Next" w:hAnsi="Trade Gothic Next"/>
+                <w:b w:val="0"/>
+                <w:color w:val="14161B"/>
+                <w:sz w:val="19"/>
+                <w:u w:val="none"/>
+              </w:rPr>
+              <w:t xml:space="preserve"> _________ </w:t>
+            </w:r>
+            <w:r>
+              <w:rPr>
+                <w:rFonts w:ascii="Trade Gothic Next" w:hAnsi="Trade Gothic Next"/>
+                <w:b w:val="0"/>
+                <w:color w:val="14161B"/>
+                <w:sz w:val="19"/>
+                <w:u w:val="none"/>
+              </w:rPr>
+              <w:t xml:space="preserve"> nm.</w:t>
+            </w:r>
           </w:p>
           <w:tbl>
             <w:tblPr>
@@ -11592,7 +12741,7 @@
             <w:tr>
               <w:trPr>
                 <w:cantSplit/>
-                <w:trHeight w:val="360" w:hRule="atLeast"/>
+                <w:trHeight w:val="316" w:hRule="atLeast"/>
               </w:trPr>
               <w:tc>
                 <w:tcPr>
@@ -11604,9 +12753,9 @@
                     <w:right w:val="single" w:sz="4" w:color="C8CDC2"/>
                   </w:tcBorders>
                   <w:tcMar>
-                    <w:top w:w="30" w:type="dxa"/>
+                    <w:top w:w="20" w:type="dxa"/>
                     <w:left w:w="70" w:type="dxa"/>
-                    <w:bottom w:w="30" w:type="dxa"/>
+                    <w:bottom w:w="20" w:type="dxa"/>
                     <w:right w:w="70" w:type="dxa"/>
                   </w:tcMar>
                   <w:vAlign w:val="center"/>
@@ -11638,9 +12787,9 @@
                     <w:right w:val="single" w:sz="4" w:color="C8CDC2"/>
                   </w:tcBorders>
                   <w:tcMar>
-                    <w:top w:w="30" w:type="dxa"/>
+                    <w:top w:w="20" w:type="dxa"/>
                     <w:left w:w="70" w:type="dxa"/>
-                    <w:bottom w:w="30" w:type="dxa"/>
+                    <w:bottom w:w="20" w:type="dxa"/>
                     <w:right w:w="70" w:type="dxa"/>
                   </w:tcMar>
                   <w:vAlign w:val="center"/>
@@ -11662,9 +12811,9 @@
                     <w:right w:val="single" w:sz="4" w:color="C8CDC2"/>
                   </w:tcBorders>
                   <w:tcMar>
-                    <w:top w:w="30" w:type="dxa"/>
+                    <w:top w:w="20" w:type="dxa"/>
                     <w:left w:w="70" w:type="dxa"/>
-                    <w:bottom w:w="30" w:type="dxa"/>
+                    <w:bottom w:w="20" w:type="dxa"/>
                     <w:right w:w="70" w:type="dxa"/>
                   </w:tcMar>
                   <w:vAlign w:val="center"/>
@@ -11680,7 +12829,7 @@
             <w:tr>
               <w:trPr>
                 <w:cantSplit/>
-                <w:trHeight w:val="360" w:hRule="atLeast"/>
+                <w:trHeight w:val="316" w:hRule="atLeast"/>
               </w:trPr>
               <w:tc>
                 <w:tcPr>
@@ -11692,9 +12841,9 @@
                     <w:right w:val="single" w:sz="4" w:color="C8CDC2"/>
                   </w:tcBorders>
                   <w:tcMar>
-                    <w:top w:w="30" w:type="dxa"/>
+                    <w:top w:w="20" w:type="dxa"/>
                     <w:left w:w="70" w:type="dxa"/>
-                    <w:bottom w:w="30" w:type="dxa"/>
+                    <w:bottom w:w="20" w:type="dxa"/>
                     <w:right w:w="70" w:type="dxa"/>
                   </w:tcMar>
                   <w:vAlign w:val="center"/>
@@ -11726,9 +12875,9 @@
                     <w:right w:val="single" w:sz="4" w:color="C8CDC2"/>
                   </w:tcBorders>
                   <w:tcMar>
-                    <w:top w:w="30" w:type="dxa"/>
+                    <w:top w:w="20" w:type="dxa"/>
                     <w:left w:w="70" w:type="dxa"/>
-                    <w:bottom w:w="30" w:type="dxa"/>
+                    <w:bottom w:w="20" w:type="dxa"/>
                     <w:right w:w="70" w:type="dxa"/>
                   </w:tcMar>
                   <w:vAlign w:val="center"/>
@@ -11750,9 +12899,9 @@
                     <w:right w:val="single" w:sz="4" w:color="C8CDC2"/>
                   </w:tcBorders>
                   <w:tcMar>
-                    <w:top w:w="30" w:type="dxa"/>
+                    <w:top w:w="20" w:type="dxa"/>
                     <w:left w:w="70" w:type="dxa"/>
-                    <w:bottom w:w="30" w:type="dxa"/>
+                    <w:bottom w:w="20" w:type="dxa"/>
                     <w:right w:w="70" w:type="dxa"/>
                   </w:tcMar>
                   <w:vAlign w:val="center"/>
@@ -11929,7 +13078,7 @@
             <w:tr>
               <w:trPr>
                 <w:cantSplit/>
-                <w:trHeight w:val="360" w:hRule="atLeast"/>
+                <w:trHeight w:val="316" w:hRule="atLeast"/>
               </w:trPr>
               <w:tc>
                 <w:tcPr>
@@ -11941,9 +13090,9 @@
                     <w:right w:val="single" w:sz="4" w:color="C8CDC2"/>
                   </w:tcBorders>
                   <w:tcMar>
-                    <w:top w:w="30" w:type="dxa"/>
+                    <w:top w:w="20" w:type="dxa"/>
                     <w:left w:w="70" w:type="dxa"/>
-                    <w:bottom w:w="30" w:type="dxa"/>
+                    <w:bottom w:w="20" w:type="dxa"/>
                     <w:right w:w="70" w:type="dxa"/>
                   </w:tcMar>
                   <w:vAlign w:val="center"/>
@@ -11975,9 +13124,9 @@
                     <w:right w:val="single" w:sz="4" w:color="C8CDC2"/>
                   </w:tcBorders>
                   <w:tcMar>
-                    <w:top w:w="30" w:type="dxa"/>
+                    <w:top w:w="20" w:type="dxa"/>
                     <w:left w:w="70" w:type="dxa"/>
-                    <w:bottom w:w="30" w:type="dxa"/>
+                    <w:bottom w:w="20" w:type="dxa"/>
                     <w:right w:w="70" w:type="dxa"/>
                   </w:tcMar>
                   <w:vAlign w:val="center"/>
@@ -11993,7 +13142,7 @@
             <w:tr>
               <w:trPr>
                 <w:cantSplit/>
-                <w:trHeight w:val="360" w:hRule="atLeast"/>
+                <w:trHeight w:val="316" w:hRule="atLeast"/>
               </w:trPr>
               <w:tc>
                 <w:tcPr>
@@ -12005,9 +13154,9 @@
                     <w:right w:val="single" w:sz="4" w:color="C8CDC2"/>
                   </w:tcBorders>
                   <w:tcMar>
-                    <w:top w:w="30" w:type="dxa"/>
+                    <w:top w:w="20" w:type="dxa"/>
                     <w:left w:w="70" w:type="dxa"/>
-                    <w:bottom w:w="30" w:type="dxa"/>
+                    <w:bottom w:w="20" w:type="dxa"/>
                     <w:right w:w="70" w:type="dxa"/>
                   </w:tcMar>
                   <w:vAlign w:val="center"/>
@@ -12039,9 +13188,9 @@
                     <w:right w:val="single" w:sz="4" w:color="C8CDC2"/>
                   </w:tcBorders>
                   <w:tcMar>
-                    <w:top w:w="30" w:type="dxa"/>
+                    <w:top w:w="20" w:type="dxa"/>
                     <w:left w:w="70" w:type="dxa"/>
-                    <w:bottom w:w="30" w:type="dxa"/>
+                    <w:bottom w:w="20" w:type="dxa"/>
                     <w:right w:w="70" w:type="dxa"/>
                   </w:tcMar>
                   <w:vAlign w:val="center"/>
@@ -12057,7 +13206,7 @@
             <w:tr>
               <w:trPr>
                 <w:cantSplit/>
-                <w:trHeight w:val="360" w:hRule="atLeast"/>
+                <w:trHeight w:val="316" w:hRule="atLeast"/>
               </w:trPr>
               <w:tc>
                 <w:tcPr>
@@ -12069,9 +13218,9 @@
                     <w:right w:val="single" w:sz="4" w:color="C8CDC2"/>
                   </w:tcBorders>
                   <w:tcMar>
-                    <w:top w:w="30" w:type="dxa"/>
+                    <w:top w:w="20" w:type="dxa"/>
                     <w:left w:w="70" w:type="dxa"/>
-                    <w:bottom w:w="30" w:type="dxa"/>
+                    <w:bottom w:w="20" w:type="dxa"/>
                     <w:right w:w="70" w:type="dxa"/>
                   </w:tcMar>
                   <w:vAlign w:val="center"/>
@@ -12103,9 +13252,9 @@
                     <w:right w:val="single" w:sz="4" w:color="C8CDC2"/>
                   </w:tcBorders>
                   <w:tcMar>
-                    <w:top w:w="30" w:type="dxa"/>
+                    <w:top w:w="20" w:type="dxa"/>
                     <w:left w:w="70" w:type="dxa"/>
-                    <w:bottom w:w="30" w:type="dxa"/>
+                    <w:bottom w:w="20" w:type="dxa"/>
                     <w:right w:w="70" w:type="dxa"/>
                   </w:tcMar>
                   <w:vAlign w:val="center"/>
@@ -12175,6 +13324,21 @@
               <w:t>IDENTIFYING AN ELEMENT</w:t>
             </w:r>
           </w:p>
+          <w:p>
+            <w:pPr>
+              <w:spacing w:after="40" w:before="0"/>
+            </w:pPr>
+            <w:r>
+              <w:rPr>
+                <w:rFonts w:ascii="Trade Gothic Next" w:hAnsi="Trade Gothic Next"/>
+                <w:b w:val="0"/>
+                <w:color w:val="14161B"/>
+                <w:sz w:val="17"/>
+                <w:u w:val="none"/>
+              </w:rPr>
+              <w:t>Steps — light from an atom</w:t>
+            </w:r>
+          </w:p>
         </w:tc>
         <w:tc>
           <w:tcPr>
@@ -12203,11 +13367,61 @@
           </w:p>
           <w:p>
             <w:pPr>
-              <w:spacing w:after="120"/>
               <w:pBdr>
-                <w:bottom w:val="single" w:sz="4" w:color="C8CDC2"/>
+                <w:left w:val="single" w:sz="18" w:space="6" w:color="A3E635"/>
               </w:pBdr>
+              <w:spacing w:after="40" w:before="0"/>
             </w:pPr>
+            <w:r>
+              <w:rPr>
+                <w:rFonts w:ascii="Trade Gothic Next" w:hAnsi="Trade Gothic Next"/>
+                <w:b/>
+                <w:color w:val="14161B"/>
+                <w:sz w:val="19"/>
+                <w:u w:val="none"/>
+              </w:rPr>
+              <w:t xml:space="preserve">Only certain energy </w:t>
+            </w:r>
+            <w:r>
+              <w:rPr>
+                <w:rFonts w:ascii="Trade Gothic Next" w:hAnsi="Trade Gothic Next"/>
+                <w:b w:val="0"/>
+                <w:color w:val="14161B"/>
+                <w:sz w:val="19"/>
+                <w:u w:val="none"/>
+              </w:rPr>
+              <w:t xml:space="preserve"> ______ </w:t>
+            </w:r>
+            <w:r>
+              <w:rPr>
+                <w:rFonts w:ascii="Trade Gothic Next" w:hAnsi="Trade Gothic Next"/>
+                <w:b/>
+                <w:color w:val="14161B"/>
+                <w:sz w:val="19"/>
+                <w:u w:val="none"/>
+              </w:rPr>
+              <w:t xml:space="preserve"> exist, so only certain </w:t>
+            </w:r>
+            <w:r>
+              <w:rPr>
+                <w:rFonts w:ascii="Trade Gothic Next" w:hAnsi="Trade Gothic Next"/>
+                <w:b w:val="0"/>
+                <w:color w:val="14161B"/>
+                <w:sz w:val="19"/>
+                <w:u w:val="none"/>
+              </w:rPr>
+              <w:t xml:space="preserve"> ________ </w:t>
+            </w:r>
+            <w:r>
+              <w:rPr>
+                <w:rFonts w:ascii="Trade Gothic Next" w:hAnsi="Trade Gothic Next"/>
+                <w:b/>
+                <w:color w:val="14161B"/>
+                <w:sz w:val="19"/>
+                <w:u w:val="none"/>
+              </w:rPr>
+              <w:t xml:space="preserve"> appear.</w:t>
+            </w:r>
           </w:p>
           <w:p>
             <w:pPr>
@@ -12297,11 +13511,38 @@
           </w:p>
           <w:p>
             <w:pPr>
-              <w:spacing w:after="120"/>
-              <w:pBdr>
-                <w:bottom w:val="single" w:sz="4" w:color="C8CDC2"/>
-              </w:pBdr>
+              <w:spacing w:after="40" w:before="0"/>
             </w:pPr>
+            <w:r>
+              <w:rPr>
+                <w:rFonts w:ascii="Trade Gothic Next" w:hAnsi="Trade Gothic Next"/>
+                <w:b w:val="0"/>
+                <w:color w:val="14161B"/>
+                <w:sz w:val="19"/>
+                <w:u w:val="none"/>
+              </w:rPr>
+              <w:t xml:space="preserve">All four drops end at n = </w:t>
+            </w:r>
+            <w:r>
+              <w:rPr>
+                <w:rFonts w:ascii="Trade Gothic Next" w:hAnsi="Trade Gothic Next"/>
+                <w:b w:val="0"/>
+                <w:color w:val="14161B"/>
+                <w:sz w:val="19"/>
+                <w:u w:val="none"/>
+              </w:rPr>
+              <w:t xml:space="preserve"> ______</w:t>
+            </w:r>
+            <w:r>
+              <w:rPr>
+                <w:rFonts w:ascii="Trade Gothic Next" w:hAnsi="Trade Gothic Next"/>
+                <w:b w:val="0"/>
+                <w:color w:val="14161B"/>
+                <w:sz w:val="19"/>
+                <w:u w:val="none"/>
+              </w:rPr>
+              <w:t>.</w:t>
+            </w:r>
           </w:p>
           <w:tbl>
             <w:tblPr>
@@ -12416,7 +13657,7 @@
             <w:tr>
               <w:trPr>
                 <w:cantSplit/>
-                <w:trHeight w:val="360" w:hRule="atLeast"/>
+                <w:trHeight w:val="316" w:hRule="atLeast"/>
               </w:trPr>
               <w:tc>
                 <w:tcPr>
@@ -12428,9 +13669,9 @@
                     <w:right w:val="single" w:sz="4" w:color="C8CDC2"/>
                   </w:tcBorders>
                   <w:tcMar>
-                    <w:top w:w="30" w:type="dxa"/>
+                    <w:top w:w="20" w:type="dxa"/>
                     <w:left w:w="70" w:type="dxa"/>
-                    <w:bottom w:w="30" w:type="dxa"/>
+                    <w:bottom w:w="20" w:type="dxa"/>
                     <w:right w:w="70" w:type="dxa"/>
                   </w:tcMar>
                   <w:vAlign w:val="center"/>
@@ -12462,9 +13703,9 @@
                     <w:right w:val="single" w:sz="4" w:color="C8CDC2"/>
                   </w:tcBorders>
                   <w:tcMar>
-                    <w:top w:w="30" w:type="dxa"/>
+                    <w:top w:w="20" w:type="dxa"/>
                     <w:left w:w="70" w:type="dxa"/>
-                    <w:bottom w:w="30" w:type="dxa"/>
+                    <w:bottom w:w="20" w:type="dxa"/>
                     <w:right w:w="70" w:type="dxa"/>
                   </w:tcMar>
                   <w:vAlign w:val="center"/>
@@ -12486,9 +13727,9 @@
                     <w:right w:val="single" w:sz="4" w:color="C8CDC2"/>
                   </w:tcBorders>
                   <w:tcMar>
-                    <w:top w:w="30" w:type="dxa"/>
+                    <w:top w:w="20" w:type="dxa"/>
                     <w:left w:w="70" w:type="dxa"/>
-                    <w:bottom w:w="30" w:type="dxa"/>
+                    <w:bottom w:w="20" w:type="dxa"/>
                     <w:right w:w="70" w:type="dxa"/>
                   </w:tcMar>
                   <w:vAlign w:val="center"/>
@@ -12504,7 +13745,7 @@
             <w:tr>
               <w:trPr>
                 <w:cantSplit/>
-                <w:trHeight w:val="360" w:hRule="atLeast"/>
+                <w:trHeight w:val="316" w:hRule="atLeast"/>
               </w:trPr>
               <w:tc>
                 <w:tcPr>
@@ -12516,9 +13757,9 @@
                     <w:right w:val="single" w:sz="4" w:color="C8CDC2"/>
                   </w:tcBorders>
                   <w:tcMar>
-                    <w:top w:w="30" w:type="dxa"/>
+                    <w:top w:w="20" w:type="dxa"/>
                     <w:left w:w="70" w:type="dxa"/>
-                    <w:bottom w:w="30" w:type="dxa"/>
+                    <w:bottom w:w="20" w:type="dxa"/>
                     <w:right w:w="70" w:type="dxa"/>
                   </w:tcMar>
                   <w:vAlign w:val="center"/>
@@ -12550,9 +13791,9 @@
                     <w:right w:val="single" w:sz="4" w:color="C8CDC2"/>
                   </w:tcBorders>
                   <w:tcMar>
-                    <w:top w:w="30" w:type="dxa"/>
+                    <w:top w:w="20" w:type="dxa"/>
                     <w:left w:w="70" w:type="dxa"/>
-                    <w:bottom w:w="30" w:type="dxa"/>
+                    <w:bottom w:w="20" w:type="dxa"/>
                     <w:right w:w="70" w:type="dxa"/>
                   </w:tcMar>
                   <w:vAlign w:val="center"/>
@@ -12574,9 +13815,9 @@
                     <w:right w:val="single" w:sz="4" w:color="C8CDC2"/>
                   </w:tcBorders>
                   <w:tcMar>
-                    <w:top w:w="30" w:type="dxa"/>
+                    <w:top w:w="20" w:type="dxa"/>
                     <w:left w:w="70" w:type="dxa"/>
-                    <w:bottom w:w="30" w:type="dxa"/>
+                    <w:bottom w:w="20" w:type="dxa"/>
                     <w:right w:w="70" w:type="dxa"/>
                   </w:tcMar>
                   <w:vAlign w:val="center"/>
@@ -12592,7 +13833,7 @@
             <w:tr>
               <w:trPr>
                 <w:cantSplit/>
-                <w:trHeight w:val="360" w:hRule="atLeast"/>
+                <w:trHeight w:val="316" w:hRule="atLeast"/>
               </w:trPr>
               <w:tc>
                 <w:tcPr>
@@ -12604,9 +13845,9 @@
                     <w:right w:val="single" w:sz="4" w:color="C8CDC2"/>
                   </w:tcBorders>
                   <w:tcMar>
-                    <w:top w:w="30" w:type="dxa"/>
+                    <w:top w:w="20" w:type="dxa"/>
                     <w:left w:w="70" w:type="dxa"/>
-                    <w:bottom w:w="30" w:type="dxa"/>
+                    <w:bottom w:w="20" w:type="dxa"/>
                     <w:right w:w="70" w:type="dxa"/>
                   </w:tcMar>
                   <w:vAlign w:val="center"/>
@@ -12638,9 +13879,9 @@
                     <w:right w:val="single" w:sz="4" w:color="C8CDC2"/>
                   </w:tcBorders>
                   <w:tcMar>
-                    <w:top w:w="30" w:type="dxa"/>
+                    <w:top w:w="20" w:type="dxa"/>
                     <w:left w:w="70" w:type="dxa"/>
-                    <w:bottom w:w="30" w:type="dxa"/>
+                    <w:bottom w:w="20" w:type="dxa"/>
                     <w:right w:w="70" w:type="dxa"/>
                   </w:tcMar>
                   <w:vAlign w:val="center"/>
@@ -12662,9 +13903,9 @@
                     <w:right w:val="single" w:sz="4" w:color="C8CDC2"/>
                   </w:tcBorders>
                   <w:tcMar>
-                    <w:top w:w="30" w:type="dxa"/>
+                    <w:top w:w="20" w:type="dxa"/>
                     <w:left w:w="70" w:type="dxa"/>
-                    <w:bottom w:w="30" w:type="dxa"/>
+                    <w:bottom w:w="20" w:type="dxa"/>
                     <w:right w:w="70" w:type="dxa"/>
                   </w:tcMar>
                   <w:vAlign w:val="center"/>
@@ -12680,7 +13921,7 @@
             <w:tr>
               <w:trPr>
                 <w:cantSplit/>
-                <w:trHeight w:val="360" w:hRule="atLeast"/>
+                <w:trHeight w:val="316" w:hRule="atLeast"/>
               </w:trPr>
               <w:tc>
                 <w:tcPr>
@@ -12692,9 +13933,9 @@
                     <w:right w:val="single" w:sz="4" w:color="C8CDC2"/>
                   </w:tcBorders>
                   <w:tcMar>
-                    <w:top w:w="30" w:type="dxa"/>
+                    <w:top w:w="20" w:type="dxa"/>
                     <w:left w:w="70" w:type="dxa"/>
-                    <w:bottom w:w="30" w:type="dxa"/>
+                    <w:bottom w:w="20" w:type="dxa"/>
                     <w:right w:w="70" w:type="dxa"/>
                   </w:tcMar>
                   <w:vAlign w:val="center"/>
@@ -12726,9 +13967,9 @@
                     <w:right w:val="single" w:sz="4" w:color="C8CDC2"/>
                   </w:tcBorders>
                   <w:tcMar>
-                    <w:top w:w="30" w:type="dxa"/>
+                    <w:top w:w="20" w:type="dxa"/>
                     <w:left w:w="70" w:type="dxa"/>
-                    <w:bottom w:w="30" w:type="dxa"/>
+                    <w:bottom w:w="20" w:type="dxa"/>
                     <w:right w:w="70" w:type="dxa"/>
                   </w:tcMar>
                   <w:vAlign w:val="center"/>
@@ -12750,9 +13991,9 @@
                     <w:right w:val="single" w:sz="4" w:color="C8CDC2"/>
                   </w:tcBorders>
                   <w:tcMar>
-                    <w:top w:w="30" w:type="dxa"/>
+                    <w:top w:w="20" w:type="dxa"/>
                     <w:left w:w="70" w:type="dxa"/>
-                    <w:bottom w:w="30" w:type="dxa"/>
+                    <w:bottom w:w="20" w:type="dxa"/>
                     <w:right w:w="70" w:type="dxa"/>
                   </w:tcMar>
                   <w:vAlign w:val="center"/>
@@ -12850,11 +14091,38 @@
           </w:p>
           <w:p>
             <w:pPr>
-              <w:spacing w:after="120"/>
-              <w:pBdr>
-                <w:bottom w:val="single" w:sz="4" w:color="C8CDC2"/>
-              </w:pBdr>
+              <w:spacing w:after="40" w:before="0"/>
             </w:pPr>
+            <w:r>
+              <w:rPr>
+                <w:rFonts w:ascii="Trade Gothic Next" w:hAnsi="Trade Gothic Next"/>
+                <w:b w:val="0"/>
+                <w:color w:val="14161B"/>
+                <w:sz w:val="19"/>
+                <w:u w:val="none"/>
+              </w:rPr>
+              <w:t xml:space="preserve">A flame color is a </w:t>
+            </w:r>
+            <w:r>
+              <w:rPr>
+                <w:rFonts w:ascii="Trade Gothic Next" w:hAnsi="Trade Gothic Next"/>
+                <w:b w:val="0"/>
+                <w:color w:val="14161B"/>
+                <w:sz w:val="19"/>
+                <w:u w:val="none"/>
+              </w:rPr>
+              <w:t xml:space="preserve"> ______</w:t>
+            </w:r>
+            <w:r>
+              <w:rPr>
+                <w:rFonts w:ascii="Trade Gothic Next" w:hAnsi="Trade Gothic Next"/>
+                <w:b w:val="0"/>
+                <w:color w:val="14161B"/>
+                <w:sz w:val="19"/>
+                <w:u w:val="none"/>
+              </w:rPr>
+              <w:t>, not proof.</w:t>
+            </w:r>
           </w:p>
           <w:tbl>
             <w:tblPr>
@@ -12937,7 +14205,7 @@
             <w:tr>
               <w:trPr>
                 <w:cantSplit/>
-                <w:trHeight w:val="360" w:hRule="atLeast"/>
+                <w:trHeight w:val="316" w:hRule="atLeast"/>
               </w:trPr>
               <w:tc>
                 <w:tcPr>
@@ -12949,9 +14217,9 @@
                     <w:right w:val="single" w:sz="4" w:color="C8CDC2"/>
                   </w:tcBorders>
                   <w:tcMar>
-                    <w:top w:w="30" w:type="dxa"/>
+                    <w:top w:w="20" w:type="dxa"/>
                     <w:left w:w="70" w:type="dxa"/>
-                    <w:bottom w:w="30" w:type="dxa"/>
+                    <w:bottom w:w="20" w:type="dxa"/>
                     <w:right w:w="70" w:type="dxa"/>
                   </w:tcMar>
                   <w:vAlign w:val="center"/>
@@ -12994,9 +14262,9 @@
                     <w:right w:val="single" w:sz="4" w:color="C8CDC2"/>
                   </w:tcBorders>
                   <w:tcMar>
-                    <w:top w:w="30" w:type="dxa"/>
+                    <w:top w:w="20" w:type="dxa"/>
                     <w:left w:w="70" w:type="dxa"/>
-                    <w:bottom w:w="30" w:type="dxa"/>
+                    <w:bottom w:w="20" w:type="dxa"/>
                     <w:right w:w="70" w:type="dxa"/>
                   </w:tcMar>
                   <w:vAlign w:val="center"/>
@@ -13012,7 +14280,7 @@
             <w:tr>
               <w:trPr>
                 <w:cantSplit/>
-                <w:trHeight w:val="360" w:hRule="atLeast"/>
+                <w:trHeight w:val="316" w:hRule="atLeast"/>
               </w:trPr>
               <w:tc>
                 <w:tcPr>
@@ -13024,9 +14292,9 @@
                     <w:right w:val="single" w:sz="4" w:color="C8CDC2"/>
                   </w:tcBorders>
                   <w:tcMar>
-                    <w:top w:w="30" w:type="dxa"/>
+                    <w:top w:w="20" w:type="dxa"/>
                     <w:left w:w="70" w:type="dxa"/>
-                    <w:bottom w:w="30" w:type="dxa"/>
+                    <w:bottom w:w="20" w:type="dxa"/>
                     <w:right w:w="70" w:type="dxa"/>
                   </w:tcMar>
                   <w:vAlign w:val="center"/>
@@ -13069,9 +14337,9 @@
                     <w:right w:val="single" w:sz="4" w:color="C8CDC2"/>
                   </w:tcBorders>
                   <w:tcMar>
-                    <w:top w:w="30" w:type="dxa"/>
+                    <w:top w:w="20" w:type="dxa"/>
                     <w:left w:w="70" w:type="dxa"/>
-                    <w:bottom w:w="30" w:type="dxa"/>
+                    <w:bottom w:w="20" w:type="dxa"/>
                     <w:right w:w="70" w:type="dxa"/>
                   </w:tcMar>
                   <w:vAlign w:val="center"/>
@@ -13087,7 +14355,7 @@
             <w:tr>
               <w:trPr>
                 <w:cantSplit/>
-                <w:trHeight w:val="360" w:hRule="atLeast"/>
+                <w:trHeight w:val="316" w:hRule="atLeast"/>
               </w:trPr>
               <w:tc>
                 <w:tcPr>
@@ -13099,9 +14367,9 @@
                     <w:right w:val="single" w:sz="4" w:color="C8CDC2"/>
                   </w:tcBorders>
                   <w:tcMar>
-                    <w:top w:w="30" w:type="dxa"/>
+                    <w:top w:w="20" w:type="dxa"/>
                     <w:left w:w="70" w:type="dxa"/>
-                    <w:bottom w:w="30" w:type="dxa"/>
+                    <w:bottom w:w="20" w:type="dxa"/>
                     <w:right w:w="70" w:type="dxa"/>
                   </w:tcMar>
                   <w:vAlign w:val="center"/>
@@ -13144,9 +14412,9 @@
                     <w:right w:val="single" w:sz="4" w:color="C8CDC2"/>
                   </w:tcBorders>
                   <w:tcMar>
-                    <w:top w:w="30" w:type="dxa"/>
+                    <w:top w:w="20" w:type="dxa"/>
                     <w:left w:w="70" w:type="dxa"/>
-                    <w:bottom w:w="30" w:type="dxa"/>
+                    <w:bottom w:w="20" w:type="dxa"/>
                     <w:right w:w="70" w:type="dxa"/>
                   </w:tcMar>
                   <w:vAlign w:val="center"/>
@@ -13162,7 +14430,7 @@
             <w:tr>
               <w:trPr>
                 <w:cantSplit/>
-                <w:trHeight w:val="360" w:hRule="atLeast"/>
+                <w:trHeight w:val="316" w:hRule="atLeast"/>
               </w:trPr>
               <w:tc>
                 <w:tcPr>
@@ -13174,9 +14442,9 @@
                     <w:right w:val="single" w:sz="4" w:color="C8CDC2"/>
                   </w:tcBorders>
                   <w:tcMar>
-                    <w:top w:w="30" w:type="dxa"/>
+                    <w:top w:w="20" w:type="dxa"/>
                     <w:left w:w="70" w:type="dxa"/>
-                    <w:bottom w:w="30" w:type="dxa"/>
+                    <w:bottom w:w="20" w:type="dxa"/>
                     <w:right w:w="70" w:type="dxa"/>
                   </w:tcMar>
                   <w:vAlign w:val="center"/>
@@ -13219,9 +14487,9 @@
                     <w:right w:val="single" w:sz="4" w:color="C8CDC2"/>
                   </w:tcBorders>
                   <w:tcMar>
-                    <w:top w:w="30" w:type="dxa"/>
+                    <w:top w:w="20" w:type="dxa"/>
                     <w:left w:w="70" w:type="dxa"/>
-                    <w:bottom w:w="30" w:type="dxa"/>
+                    <w:bottom w:w="20" w:type="dxa"/>
                     <w:right w:w="70" w:type="dxa"/>
                   </w:tcMar>
                   <w:vAlign w:val="center"/>
@@ -13237,7 +14505,7 @@
             <w:tr>
               <w:trPr>
                 <w:cantSplit/>
-                <w:trHeight w:val="360" w:hRule="atLeast"/>
+                <w:trHeight w:val="316" w:hRule="atLeast"/>
               </w:trPr>
               <w:tc>
                 <w:tcPr>
@@ -13249,9 +14517,9 @@
                     <w:right w:val="single" w:sz="4" w:color="C8CDC2"/>
                   </w:tcBorders>
                   <w:tcMar>
-                    <w:top w:w="30" w:type="dxa"/>
+                    <w:top w:w="20" w:type="dxa"/>
                     <w:left w:w="70" w:type="dxa"/>
-                    <w:bottom w:w="30" w:type="dxa"/>
+                    <w:bottom w:w="20" w:type="dxa"/>
                     <w:right w:w="70" w:type="dxa"/>
                   </w:tcMar>
                   <w:vAlign w:val="center"/>
@@ -13294,9 +14562,9 @@
                     <w:right w:val="single" w:sz="4" w:color="C8CDC2"/>
                   </w:tcBorders>
                   <w:tcMar>
-                    <w:top w:w="30" w:type="dxa"/>
+                    <w:top w:w="20" w:type="dxa"/>
                     <w:left w:w="70" w:type="dxa"/>
-                    <w:bottom w:w="30" w:type="dxa"/>
+                    <w:bottom w:w="20" w:type="dxa"/>
                     <w:right w:w="70" w:type="dxa"/>
                   </w:tcMar>
                   <w:vAlign w:val="center"/>
@@ -13312,7 +14580,7 @@
             <w:tr>
               <w:trPr>
                 <w:cantSplit/>
-                <w:trHeight w:val="360" w:hRule="atLeast"/>
+                <w:trHeight w:val="316" w:hRule="atLeast"/>
               </w:trPr>
               <w:tc>
                 <w:tcPr>
@@ -13324,9 +14592,9 @@
                     <w:right w:val="single" w:sz="4" w:color="C8CDC2"/>
                   </w:tcBorders>
                   <w:tcMar>
-                    <w:top w:w="30" w:type="dxa"/>
+                    <w:top w:w="20" w:type="dxa"/>
                     <w:left w:w="70" w:type="dxa"/>
-                    <w:bottom w:w="30" w:type="dxa"/>
+                    <w:bottom w:w="20" w:type="dxa"/>
                     <w:right w:w="70" w:type="dxa"/>
                   </w:tcMar>
                   <w:vAlign w:val="center"/>
@@ -13369,9 +14637,9 @@
                     <w:right w:val="single" w:sz="4" w:color="C8CDC2"/>
                   </w:tcBorders>
                   <w:tcMar>
-                    <w:top w:w="30" w:type="dxa"/>
+                    <w:top w:w="20" w:type="dxa"/>
                     <w:left w:w="70" w:type="dxa"/>
-                    <w:bottom w:w="30" w:type="dxa"/>
+                    <w:bottom w:w="20" w:type="dxa"/>
                     <w:right w:w="70" w:type="dxa"/>
                   </w:tcMar>
                   <w:vAlign w:val="center"/>
@@ -13387,7 +14655,7 @@
             <w:tr>
               <w:trPr>
                 <w:cantSplit/>
-                <w:trHeight w:val="360" w:hRule="atLeast"/>
+                <w:trHeight w:val="316" w:hRule="atLeast"/>
               </w:trPr>
               <w:tc>
                 <w:tcPr>
@@ -13399,9 +14667,9 @@
                     <w:right w:val="single" w:sz="4" w:color="C8CDC2"/>
                   </w:tcBorders>
                   <w:tcMar>
-                    <w:top w:w="30" w:type="dxa"/>
+                    <w:top w:w="20" w:type="dxa"/>
                     <w:left w:w="70" w:type="dxa"/>
-                    <w:bottom w:w="30" w:type="dxa"/>
+                    <w:bottom w:w="20" w:type="dxa"/>
                     <w:right w:w="70" w:type="dxa"/>
                   </w:tcMar>
                   <w:vAlign w:val="center"/>
@@ -13444,9 +14712,9 @@
                     <w:right w:val="single" w:sz="4" w:color="C8CDC2"/>
                   </w:tcBorders>
                   <w:tcMar>
-                    <w:top w:w="30" w:type="dxa"/>
+                    <w:top w:w="20" w:type="dxa"/>
                     <w:left w:w="70" w:type="dxa"/>
-                    <w:bottom w:w="30" w:type="dxa"/>
+                    <w:bottom w:w="20" w:type="dxa"/>
                     <w:right w:w="70" w:type="dxa"/>
                   </w:tcMar>
                   <w:vAlign w:val="center"/>
@@ -13514,6 +14782,21 @@
                 <w:sz w:val="14"/>
               </w:rPr>
               <w:t>UNIT 2 CLOSING CHECK</w:t>
+            </w:r>
+          </w:p>
+          <w:p>
+            <w:pPr>
+              <w:spacing w:after="40" w:before="0"/>
+            </w:pPr>
+            <w:r>
+              <w:rPr>
+                <w:rFonts w:ascii="Trade Gothic Next" w:hAnsi="Trade Gothic Next"/>
+                <w:b w:val="0"/>
+                <w:color w:val="14161B"/>
+                <w:sz w:val="17"/>
+                <w:u w:val="none"/>
+              </w:rPr>
+              <w:t>Answers from the board</w:t>
             </w:r>
           </w:p>
         </w:tc>

</xml_diff>